<commit_message>
refactored code and updated things for exps 2, 3 and 4
</commit_message>
<xml_diff>
--- a/docs/manuscript/manuscript.docx
+++ b/docs/manuscript/manuscript.docx
@@ -39,7 +39,7 @@
         <w:pStyle w:val="Date"/>
       </w:pPr>
       <w:r>
-        <w:t xml:space="preserve">2026-03-20</w:t>
+        <w:t xml:space="preserve">2026-03-21</w:t>
       </w:r>
     </w:p>
     <w:p>
@@ -1266,7 +1266,7 @@
         <w:t xml:space="preserve">(Heathcote et al. 2019; Parker and Ramsey 2024)</w:t>
       </w:r>
       <w:r>
-        <w:t xml:space="preserve">, this participant was excluded from the data analysis. In the end, the data of 30 participants ( men and women) was retained for the analysis and the LBA modeling. Ages ranged from 20 to 42 years old (</w:t>
+        <w:t xml:space="preserve">, this participant was excluded from the data analysis. In the end, the data of 30 participants (11 men and 19 women) was retained for the analysis and the LBA modeling. Ages ranged from 20 to 42 years old (</w:t>
       </w:r>
       <m:oMath>
         <m:sSub>
@@ -1909,19 +1909,19 @@
                     <w:jc w:val="center"/>
                   </w:pPr>
                   <w:r>
-                    <w:t xml:space="preserve">3</w:t>
-                  </w:r>
-                </w:p>
-              </w:tc>
-              <w:tc>
-                <w:tcPr/>
-                <w:p>
-                  <w:pPr>
-                    <w:pStyle w:val="Compact"/>
-                    <w:jc w:val="center"/>
-                  </w:pPr>
-                  <w:r>
-                    <w:t xml:space="preserve">7</w:t>
+                    <w:t xml:space="preserve">1</w:t>
+                  </w:r>
+                </w:p>
+              </w:tc>
+              <w:tc>
+                <w:tcPr/>
+                <w:p>
+                  <w:pPr>
+                    <w:pStyle w:val="Compact"/>
+                    <w:jc w:val="center"/>
+                  </w:pPr>
+                  <w:r>
+                    <w:t xml:space="preserve">9</w:t>
                   </w:r>
                 </w:p>
               </w:tc>
@@ -2055,31 +2055,31 @@
                     <w:jc w:val="center"/>
                   </w:pPr>
                   <w:r>
-                    <w:t xml:space="preserve">5</w:t>
-                  </w:r>
-                </w:p>
-              </w:tc>
-              <w:tc>
-                <w:tcPr/>
-                <w:p>
-                  <w:pPr>
-                    <w:pStyle w:val="Compact"/>
-                    <w:jc w:val="center"/>
-                  </w:pPr>
-                  <w:r>
-                    <w:t xml:space="preserve">9</w:t>
-                  </w:r>
-                </w:p>
-              </w:tc>
-              <w:tc>
-                <w:tcPr/>
-                <w:p>
-                  <w:pPr>
-                    <w:pStyle w:val="Compact"/>
-                    <w:jc w:val="center"/>
-                  </w:pPr>
-                  <w:r>
-                    <w:t xml:space="preserve">31</w:t>
+                    <w:t xml:space="preserve">3</w:t>
+                  </w:r>
+                </w:p>
+              </w:tc>
+              <w:tc>
+                <w:tcPr/>
+                <w:p>
+                  <w:pPr>
+                    <w:pStyle w:val="Compact"/>
+                    <w:jc w:val="center"/>
+                  </w:pPr>
+                  <w:r>
+                    <w:t xml:space="preserve">12</w:t>
+                  </w:r>
+                </w:p>
+              </w:tc>
+              <w:tc>
+                <w:tcPr/>
+                <w:p>
+                  <w:pPr>
+                    <w:pStyle w:val="Compact"/>
+                    <w:jc w:val="center"/>
+                  </w:pPr>
+                  <w:r>
+                    <w:t xml:space="preserve">30</w:t>
                   </w:r>
                 </w:p>
               </w:tc>
@@ -2103,19 +2103,19 @@
                     <w:jc w:val="center"/>
                   </w:pPr>
                   <w:r>
-                    <w:t xml:space="preserve">18</w:t>
-                  </w:r>
-                </w:p>
-              </w:tc>
-              <w:tc>
-                <w:tcPr/>
-                <w:p>
-                  <w:pPr>
-                    <w:pStyle w:val="Compact"/>
-                    <w:jc w:val="center"/>
-                  </w:pPr>
-                  <w:r>
-                    <w:t xml:space="preserve">39.6 (9.8)</w:t>
+                    <w:t xml:space="preserve">17</w:t>
+                  </w:r>
+                </w:p>
+              </w:tc>
+              <w:tc>
+                <w:tcPr/>
+                <w:p>
+                  <w:pPr>
+                    <w:pStyle w:val="Compact"/>
+                    <w:jc w:val="center"/>
+                  </w:pPr>
+                  <w:r>
+                    <w:t xml:space="preserve">40.1 (9.6)</w:t>
                   </w:r>
                 </w:p>
               </w:tc>
@@ -2493,7 +2493,7 @@
         </w:r>
       </w:hyperlink>
       <w:r>
-        <w:t xml:space="preserve">). Regarding the participants recruitment criteria established, participants had to be located in the United Kingdom or in the United States. Participants must be between 18-65 years old, with normal or corrected-to-normal vision. They must fluently speak English. Furthermore, Prolific offers the option to chose the approval rate of the participants willing to take part in the study. The approval rate is the percentage for which participants has been approved in previous experiment. A approval rate between 95% and 100% was established in our study to ensure data quality. 38 participants started the experiment. After reading the inform consent, 3 participants decided to not continue the experimental procedure and withdraw from the experiment. In the end, 35 participants completed the experiment and gave their informed consent. Following our preregistration exclusion criterion, 4 participants were excluded because their percentage of missed trials was higher lower than 25% and 1 was removed because the overall accuracy was lower than 55%. In the end, the data of 30 participants ( men and women) was retained for the analysis and the LBA modeling. Ages ranged from 25 to 61 (</w:t>
+        <w:t xml:space="preserve">). Regarding the participants recruitment criteria established, participants had to be located in the United Kingdom or in the United States. Participants must be between 18-65 years old, with normal or corrected-to-normal vision. They must fluently speak English. Furthermore, Prolific offers the option to chose the approval rate of the participants willing to take part in the study. The approval rate is the percentage for which participants has been approved in previous experiment. A approval rate between 95% and 100% was established in our study to ensure data quality. 38 participants started the experiment. After reading the inform consent, 3 participants decided to not continue the experimental procedure and withdraw from the experiment. In the end, 35 participants completed the experiment and gave their informed consent. Following our preregistration exclusion criterion, 4 participants were excluded because their percentage of missed trials was higher lower than 25% and 1 was removed because the overall accuracy was lower than 55%. In the end, the data of 30 participants (20 men and 10 women) was retained for the analysis and the LBA modeling. Ages ranged from 25 to 61 (</w:t>
       </w:r>
       <m:oMath>
         <m:sSub>
@@ -2664,7 +2664,7 @@
         </w:r>
       </w:hyperlink>
       <w:r>
-        <w:t xml:space="preserve">) or via a mailing list dedicated to students from the Department of Psychology of the University of Zurich. 40 healthy participants took part in Experiment 3. Based on our preregistration criterion, 3 participants were excluded from the data analysis: 1 of them had an overall recognition accuracy larger than 95% and 2 of them had a overall accuracy lower than 55% (chance at 50%). We deviated from our preregistration in one way. Since this experiment was conducted to investigate how highly familiar faces affect the computational processes of face recognition, we had to remove 7 more participants who did not show a level of familiarity high enough with the presented faces in the first part of the experiment. This scenario did not occur during the pilot experiments we conducted and thus was not part of our preregistration. In the end, the data of 30 participants ( men and women) was retained for the analysis and the LBA modeling. Ages ranged from 20 to 42 years old (</w:t>
+        <w:t xml:space="preserve">) or via a mailing list dedicated to students from the Department of Psychology of the University of Zurich. 40 healthy participants took part in Experiment 3. Based on our preregistration criterion, 3 participants were excluded from the data analysis: 1 of them had an overall recognition accuracy larger than 95% and 0 of them had a overall accuracy lower than 55% (chance at 50%). We deviated from our preregistration in one way. Since this experiment was conducted to investigate how highly familiar faces affect the computational processes of face recognition, we had to remove 9 more participants who did not show a level of familiarity high enough with the presented faces in the first part of the experiment. This scenario did not occur during the pilot experiments we conducted and thus was not part of our preregistration. In the end, the data of 30 participants (13 men and 17 women) was retained for the analysis and the LBA modeling. Ages ranged from 20 to 42 years old (</w:t>
       </w:r>
       <m:oMath>
         <m:sSub>
@@ -3321,7 +3321,7 @@
         </w:r>
       </w:hyperlink>
       <w:r>
-        <w:t xml:space="preserve">). Regarding the participants recruitment criteria established, participants had to be located in the United Kingdom or in the United States. Participants must be between 18-65 years old, with normal or corrected-to-normal vision. They must fluently speak English. An approval rate between 95% and 100% was established in our study to ensure data quality. 58 participants started the experiment. After reading the inform consent, 12 participants decided to not continue the experimental procedure and withdraw from the experiment. 46 participants completed the experiment. Following our preregistration exclusion criterion, 1 participant was excluded because the percentage of missed trials was higher than 25% and 5 were removed because the overall accuracy was lower than 55%. Furthermore, 9 did not show a level of familiarity high enough with the presented faces in the first part of the experiment. In the end, the data of 31 participants ( men and women) was retained for further analysis and the LBA modeling. Ages ranged from 25 to 61 (</w:t>
+        <w:t xml:space="preserve">). Regarding the participants recruitment criteria established, participants had to be located in the United Kingdom or in the United States. Participants must be between 18-65 years old, with normal or corrected-to-normal vision. They must fluently speak English. An approval rate between 95% and 100% was established in our study to ensure data quality. 58 participants started the experiment. After reading the inform consent, 12 participants decided to not continue the experimental procedure and withdraw from the experiment. 46 participants completed the experiment. Following our preregistration exclusion criterion, 1 participant was excluded because the percentage of missed trials was higher than 25% and 3 were removed because the overall accuracy was lower than 55%. Furthermore, 12 did not show a level of familiarity high enough with the presented faces in the first part of the experiment. In the end, the data of 30 participants (17 men and 13 women) was retained for further analysis and the LBA modeling. Ages ranged from 26 to 61 (</w:t>
       </w:r>
       <m:oMath>
         <m:sSub>
@@ -3353,7 +3353,7 @@
         <w:t xml:space="preserve"> </w:t>
       </w:r>
       <w:r>
-        <w:t xml:space="preserve">39.6,</w:t>
+        <w:t xml:space="preserve">40.1,</w:t>
       </w:r>
       <w:r>
         <w:t xml:space="preserve"> </w:t>
@@ -3391,7 +3391,7 @@
         <w:t xml:space="preserve"> </w:t>
       </w:r>
       <w:r>
-        <w:t xml:space="preserve">9.8). Following Prolific payment principles, each participant received 9£ for the completion of the study. This experiment was accepted by the ethics committee of the Federal Institute of Technology (ETH) Zurich.</w:t>
+        <w:t xml:space="preserve">9.6). Following Prolific payment principles, each participant received 9£ for the completion of the study. This experiment was accepted by the ethics committee of the Federal Institute of Technology (ETH) Zurich.</w:t>
       </w:r>
     </w:p>
     <w:bookmarkEnd w:id="66"/>

</xml_diff>

<commit_message>
re-fit all models in EMC2 3.4.1, added a readme, added new figures, removed older stuff.
</commit_message>
<xml_diff>
--- a/docs/manuscript/manuscript.docx
+++ b/docs/manuscript/manuscript.docx
@@ -39,7 +39,7 @@
         <w:pStyle w:val="Date"/>
       </w:pPr>
       <w:r>
-        <w:t xml:space="preserve">2026-03-21</w:t>
+        <w:t xml:space="preserve">2026-03-25</w:t>
       </w:r>
     </w:p>
     <w:p>
@@ -1105,7 +1105,7 @@
       </w:tr>
     </w:tbl>
     <w:bookmarkEnd w:id="26"/>
-    <w:bookmarkStart w:id="76" w:name="method-and-materials"/>
+    <w:bookmarkStart w:id="77" w:name="method-and-materials"/>
     <w:p>
       <w:pPr>
         <w:pStyle w:val="Heading1"/>
@@ -1593,7 +1593,7 @@
                     <w:jc w:val="center"/>
                   </w:pPr>
                   <w:r>
-                    <w:t xml:space="preserve">30</w:t>
+                    <w:t xml:space="preserve">31</w:t>
                   </w:r>
                 </w:p>
               </w:tc>
@@ -1727,7 +1727,7 @@
                     <w:jc w:val="center"/>
                   </w:pPr>
                   <w:r>
-                    <w:t xml:space="preserve">3</w:t>
+                    <w:t xml:space="preserve">0</w:t>
                   </w:r>
                 </w:p>
               </w:tc>
@@ -2115,7 +2115,7 @@
                     <w:jc w:val="center"/>
                   </w:pPr>
                   <w:r>
-                    <w:t xml:space="preserve">40.1 (9.6)</w:t>
+                    <w:t xml:space="preserve">39.5 (10)</w:t>
                   </w:r>
                 </w:p>
               </w:tc>
@@ -2493,7 +2493,7 @@
         </w:r>
       </w:hyperlink>
       <w:r>
-        <w:t xml:space="preserve">). Regarding the participants recruitment criteria established, participants had to be located in the United Kingdom or in the United States. Participants must be between 18-65 years old, with normal or corrected-to-normal vision. They must fluently speak English. Furthermore, Prolific offers the option to chose the approval rate of the participants willing to take part in the study. The approval rate is the percentage for which participants has been approved in previous experiment. A approval rate between 95% and 100% was established in our study to ensure data quality. 38 participants started the experiment. After reading the inform consent, 3 participants decided to not continue the experimental procedure and withdraw from the experiment. In the end, 35 participants completed the experiment and gave their informed consent. Following our preregistration exclusion criterion, 4 participants were excluded because their percentage of missed trials was higher lower than 25% and 1 was removed because the overall accuracy was lower than 55%. In the end, the data of 30 participants (20 men and 10 women) was retained for the analysis and the LBA modeling. Ages ranged from 25 to 61 (</w:t>
+        <w:t xml:space="preserve">). Regarding the participants recruitment criteria established, participants had to be located in the United Kingdom or in the United States. Participants must be between 18-65 years old, with normal or corrected-to-normal vision. They must fluently speak English. Furthermore, Prolific offers the option to chose the approval rate of the participants willing to take part in the study. The approval rate is the percentage for which participants has been approved in previous experiment. A approval rate between 95% and 100% was established in our study to ensure data quality. 38 participants started the experiment. After reading the inform consent, 0 participants decided to not continue the experimental procedure and withdraw from the experiment. In the end, 35 participants completed the experiment and gave their informed consent. Following our preregistration exclusion criterion, 4 participants were excluded because their percentage of missed trials was higher lower than 25% and 1 was removed because the overall accuracy was lower than 55%. In the end, the data of 30 participants (20 men and 10 women) was retained for the analysis and the LBA modeling. Ages ranged from 25 to 61 (</w:t>
       </w:r>
       <m:oMath>
         <m:sSub>
@@ -3321,7 +3321,7 @@
         </w:r>
       </w:hyperlink>
       <w:r>
-        <w:t xml:space="preserve">). Regarding the participants recruitment criteria established, participants had to be located in the United Kingdom or in the United States. Participants must be between 18-65 years old, with normal or corrected-to-normal vision. They must fluently speak English. An approval rate between 95% and 100% was established in our study to ensure data quality. 58 participants started the experiment. After reading the inform consent, 12 participants decided to not continue the experimental procedure and withdraw from the experiment. 46 participants completed the experiment. Following our preregistration exclusion criterion, 1 participant was excluded because the percentage of missed trials was higher than 25% and 3 were removed because the overall accuracy was lower than 55%. Furthermore, 12 did not show a level of familiarity high enough with the presented faces in the first part of the experiment. In the end, the data of 30 participants (17 men and 13 women) was retained for further analysis and the LBA modeling. Ages ranged from 26 to 61 (</w:t>
+        <w:t xml:space="preserve">). Regarding the participants recruitment criteria established, participants had to be located in the United Kingdom or in the United States. Participants must be between 18-65 years old, with normal or corrected-to-normal vision. They must fluently speak English. An approval rate between 95% and 100% was established in our study to ensure data quality. 58 participants started the experiment. After reading the inform consent, 12 participants decided to not continue the experimental procedure and withdraw from the experiment. 46 participants completed the experiment. Following our preregistration exclusion criterion, 1 participant was excluded because the percentage of missed trials was higher than 25% and 3 were removed because the overall accuracy was lower than 55%. Furthermore, 12 did not show a level of familiarity high enough with the presented faces in the first part of the experiment. In the end, the data of 30 participants (17 men and 13 women) was retained for further analysis and the LBA modeling. Ages ranged from 25 to 61 (</w:t>
       </w:r>
       <m:oMath>
         <m:sSub>
@@ -3353,7 +3353,7 @@
         <w:t xml:space="preserve"> </w:t>
       </w:r>
       <w:r>
-        <w:t xml:space="preserve">40.1,</w:t>
+        <w:t xml:space="preserve">39.5,</w:t>
       </w:r>
       <w:r>
         <w:t xml:space="preserve"> </w:t>
@@ -3391,7 +3391,7 @@
         <w:t xml:space="preserve"> </w:t>
       </w:r>
       <w:r>
-        <w:t xml:space="preserve">9.6). Following Prolific payment principles, each participant received 9£ for the completion of the study. This experiment was accepted by the ethics committee of the Federal Institute of Technology (ETH) Zurich.</w:t>
+        <w:t xml:space="preserve">10). Following Prolific payment principles, each participant received 9£ for the completion of the study. This experiment was accepted by the ethics committee of the Federal Institute of Technology (ETH) Zurich.</w:t>
       </w:r>
     </w:p>
     <w:bookmarkEnd w:id="66"/>
@@ -3568,7 +3568,7 @@
     </w:p>
     <w:bookmarkEnd w:id="70"/>
     <w:bookmarkEnd w:id="71"/>
-    <w:bookmarkStart w:id="75" w:name="evidence-accumulation-modeling"/>
+    <w:bookmarkStart w:id="76" w:name="evidence-accumulation-modeling"/>
     <w:p>
       <w:pPr>
         <w:pStyle w:val="Heading2"/>
@@ -3577,7 +3577,7 @@
         <w:t xml:space="preserve">Evidence accumulation modeling</w:t>
       </w:r>
     </w:p>
-    <w:bookmarkStart w:id="72" w:name="model-specification"/>
+    <w:bookmarkStart w:id="73" w:name="model-specification"/>
     <w:p>
       <w:pPr>
         <w:pStyle w:val="Heading3"/>
@@ -3591,7 +3591,18 @@
         <w:pStyle w:val="FirstParagraph"/>
       </w:pPr>
       <w:r>
-        <w:t xml:space="preserve">A LBA model was fit to each participant’s data for both face conditions: for</w:t>
+        <w:t xml:space="preserve">A hierarchical LBA model was fit to the data for each experiment separately with model specifications outlines in our preregistrations (</w:t>
+      </w:r>
+      <w:hyperlink w:anchor="tbl-model-formula">
+        <w:r>
+          <w:rPr>
+            <w:rStyle w:val="Hyperlink"/>
+          </w:rPr>
+          <w:t xml:space="preserve">Table 4</w:t>
+        </w:r>
+      </w:hyperlink>
+      <w:r>
+        <w:t xml:space="preserve">). LBA models have one accumulator for each response option, with potentially different parameter values. In our design, that meant that for Experiment 1 and 2, there was one accumulator for the</w:t>
       </w:r>
       <w:r>
         <w:t xml:space="preserve"> </w:t>
@@ -3603,7 +3614,10 @@
         <w:t xml:space="preserve"> </w:t>
       </w:r>
       <w:r>
-        <w:t xml:space="preserve">vs. </w:t>
+        <w:t xml:space="preserve">response and another for the</w:t>
+      </w:r>
+      <w:r>
+        <w:t xml:space="preserve"> </w:t>
       </w:r>
       <w:r>
         <w:t xml:space="preserve">“Novel”</w:t>
@@ -3612,7 +3626,7 @@
         <w:t xml:space="preserve"> </w:t>
       </w:r>
       <w:r>
-        <w:t xml:space="preserve">in Experiment 1 and 2, and for</w:t>
+        <w:t xml:space="preserve">response. For Experiment 3 and 4, there was one accumulator for the</w:t>
       </w:r>
       <w:r>
         <w:t xml:space="preserve"> </w:t>
@@ -3624,7 +3638,10 @@
         <w:t xml:space="preserve"> </w:t>
       </w:r>
       <w:r>
-        <w:t xml:space="preserve">vs. </w:t>
+        <w:t xml:space="preserve">response and another for the</w:t>
+      </w:r>
+      <w:r>
+        <w:t xml:space="preserve"> </w:t>
       </w:r>
       <w:r>
         <w:t xml:space="preserve">“Novel”</w:t>
@@ -3633,7 +3650,7 @@
         <w:t xml:space="preserve"> </w:t>
       </w:r>
       <w:r>
-        <w:t xml:space="preserve">for Experiment 3 and 4. LBA models have one accumulator for each response option, with potentially different parameter values. In our design, that meant that for Experiment 1 and 3, there was one accumulator for the</w:t>
+        <w:t xml:space="preserve">response. More specifically, for Experiment 1 and 2, threshold was allowed to vary by participants’ response (Learned/Novel) whereas mean drift rate was allowed to vary by the stimulus condition (Learned/Novel) and the match between the accumulator and the stimulus (TRUE/FALSE). If the stimulus was</w:t>
       </w:r>
       <w:r>
         <w:t xml:space="preserve"> </w:t>
@@ -3642,10 +3659,19 @@
         <w:t xml:space="preserve">“Learned”</w:t>
       </w:r>
       <w:r>
-        <w:t xml:space="preserve"> </w:t>
-      </w:r>
-      <w:r>
-        <w:t xml:space="preserve">response and another for the</w:t>
+        <w:t xml:space="preserve">, then the accumulator for the</w:t>
+      </w:r>
+      <w:r>
+        <w:t xml:space="preserve"> </w:t>
+      </w:r>
+      <w:r>
+        <w:t xml:space="preserve">“Learned”</w:t>
+      </w:r>
+      <w:r>
+        <w:t xml:space="preserve"> </w:t>
+      </w:r>
+      <w:r>
+        <w:t xml:space="preserve">response would be TRUE, whereas the accumulator for the</w:t>
       </w:r>
       <w:r>
         <w:t xml:space="preserve"> </w:t>
@@ -3657,64 +3683,7 @@
         <w:t xml:space="preserve"> </w:t>
       </w:r>
       <w:r>
-        <w:t xml:space="preserve">response. For Experiment 3 and 4, there was one accumulator for the</w:t>
-      </w:r>
-      <w:r>
-        <w:t xml:space="preserve"> </w:t>
-      </w:r>
-      <w:r>
-        <w:t xml:space="preserve">“Famous”</w:t>
-      </w:r>
-      <w:r>
-        <w:t xml:space="preserve"> </w:t>
-      </w:r>
-      <w:r>
-        <w:t xml:space="preserve">response and another for the</w:t>
-      </w:r>
-      <w:r>
-        <w:t xml:space="preserve"> </w:t>
-      </w:r>
-      <w:r>
-        <w:t xml:space="preserve">“Novel”</w:t>
-      </w:r>
-      <w:r>
-        <w:t xml:space="preserve"> </w:t>
-      </w:r>
-      <w:r>
-        <w:t xml:space="preserve">response. Separate models were fit for each experiment and model specifications were outline in our preregistrations. More specifically, for experiment 1 and 2, threshold were allowed to vary by participants’ response (Learned/Novel) whereas mean drift rate was allowed to vary by the stimulus condition (Learned/Novel) and the match between the accumulator and the stimulus. If the stimulus was</w:t>
-      </w:r>
-      <w:r>
-        <w:t xml:space="preserve"> </w:t>
-      </w:r>
-      <w:r>
-        <w:t xml:space="preserve">“Learned”</w:t>
-      </w:r>
-      <w:r>
-        <w:t xml:space="preserve">, then the accumulator for the</w:t>
-      </w:r>
-      <w:r>
-        <w:t xml:space="preserve"> </w:t>
-      </w:r>
-      <w:r>
-        <w:t xml:space="preserve">“Learned”</w:t>
-      </w:r>
-      <w:r>
-        <w:t xml:space="preserve"> </w:t>
-      </w:r>
-      <w:r>
-        <w:t xml:space="preserve">response would be TRUE, whereas the accumulator for the</w:t>
-      </w:r>
-      <w:r>
-        <w:t xml:space="preserve"> </w:t>
-      </w:r>
-      <w:r>
-        <w:t xml:space="preserve">“Novel”</w:t>
-      </w:r>
-      <w:r>
-        <w:t xml:space="preserve"> </w:t>
-      </w:r>
-      <w:r>
-        <w:t xml:space="preserve">response would be FALSE. The difference between the TRUE and FALSE accumulator represented both, the quantity and quality of the information processing about a decision</w:t>
+        <w:t xml:space="preserve">response would be FALSE. The difference between the TRUE and FALSE accumulator represents the quality of the information processing about a decision</w:t>
       </w:r>
       <w:r>
         <w:t xml:space="preserve"> </w:t>
@@ -3743,8 +3712,575 @@
         <w:t xml:space="preserve">. A single value for the start point (A) and non-decision time (t0) was estimated for our preregistered models but model estimations where these parameters were allowed to vary are described in supplementary materials.</w:t>
       </w:r>
     </w:p>
-    <w:bookmarkEnd w:id="72"/>
-    <w:bookmarkStart w:id="73" w:name="model-estimation"/>
+    <w:tbl>
+      <w:tblPr>
+        <w:tblStyle w:val="Table"/>
+        <w:tblW w:type="pct" w:w="5000"/>
+        <w:tblLayout w:type="fixed"/>
+        <w:tblLook w:firstRow="0" w:lastRow="0" w:firstColumn="0" w:lastColumn="0" w:noHBand="0" w:noVBand="0" w:val="0000"/>
+      </w:tblPr>
+      <w:tblGrid>
+        <w:gridCol w:w="7920"/>
+      </w:tblGrid>
+      <w:tr>
+        <w:tc>
+          <w:tcPr/>
+          <w:bookmarkStart w:id="72" w:name="tbl-model-formula"/>
+          <w:p>
+            <w:pPr>
+              <w:jc w:val="center"/>
+            </w:pPr>
+            <w:pPr>
+              <w:jc w:val="left"/>
+              <w:spacing w:before="200"/>
+              <w:pStyle w:val="ImageCaption"/>
+            </w:pPr>
+            <w:r>
+              <w:t xml:space="preserve">Table 4: Formula specification for the pre-registered linear ballistic accumulator model.</w:t>
+            </w:r>
+          </w:p>
+          <w:tbl>
+            <w:tblPr>
+              <w:tblStyle w:val="Table"/>
+              <w:tblW w:type="pct" w:w="4756"/>
+              <w:tblLayout w:type="fixed"/>
+              <w:tblLook w:firstRow="1" w:lastRow="1" w:firstColumn="0" w:lastColumn="0" w:noHBand="0" w:noVBand="0" w:val="0020"/>
+            </w:tblPr>
+            <w:tblGrid>
+              <w:gridCol w:w="2221"/>
+              <w:gridCol w:w="1255"/>
+              <w:gridCol w:w="1159"/>
+              <w:gridCol w:w="1062"/>
+              <w:gridCol w:w="1062"/>
+              <w:gridCol w:w="772"/>
+            </w:tblGrid>
+            <w:tr>
+              <w:trPr>
+                <w:tblHeader w:val="on"/>
+              </w:trPr>
+              <w:tc>
+                <w:tcPr/>
+                <w:p>
+                  <w:pPr>
+                    <w:pStyle w:val="Compact"/>
+                    <w:jc w:val="center"/>
+                  </w:pPr>
+                  <w:r>
+                    <w:t xml:space="preserve">Parameter</w:t>
+                  </w:r>
+                </w:p>
+              </w:tc>
+              <w:tc>
+                <w:tcPr/>
+                <w:p>
+                  <w:pPr>
+                    <w:pStyle w:val="Compact"/>
+                    <w:jc w:val="center"/>
+                  </w:pPr>
+                  <w:r>
+                    <w:t xml:space="preserve">Label</w:t>
+                  </w:r>
+                </w:p>
+              </w:tc>
+              <w:tc>
+                <w:tcPr/>
+                <w:p>
+                  <w:pPr>
+                    <w:pStyle w:val="Compact"/>
+                    <w:jc w:val="center"/>
+                  </w:pPr>
+                  <w:r>
+                    <w:t xml:space="preserve">Condition</w:t>
+                  </w:r>
+                </w:p>
+              </w:tc>
+              <w:tc>
+                <w:tcPr/>
+                <w:p>
+                  <w:pPr>
+                    <w:pStyle w:val="Compact"/>
+                    <w:jc w:val="center"/>
+                  </w:pPr>
+                  <w:r>
+                    <w:t xml:space="preserve">Response</w:t>
+                  </w:r>
+                </w:p>
+              </w:tc>
+              <w:tc>
+                <w:tcPr/>
+                <w:p>
+                  <w:pPr>
+                    <w:pStyle w:val="Compact"/>
+                    <w:jc w:val="center"/>
+                  </w:pPr>
+                  <w:r>
+                    <w:t xml:space="preserve">Accuracy</w:t>
+                  </w:r>
+                </w:p>
+              </w:tc>
+              <w:tc>
+                <w:tcPr/>
+                <w:p>
+                  <w:pPr>
+                    <w:pStyle w:val="Compact"/>
+                    <w:jc w:val="center"/>
+                  </w:pPr>
+                  <w:r>
+                    <w:t xml:space="preserve">Fixed</w:t>
+                  </w:r>
+                </w:p>
+              </w:tc>
+            </w:tr>
+            <w:tr>
+              <w:tc>
+                <w:tcPr/>
+                <w:p>
+                  <w:pPr>
+                    <w:pStyle w:val="Compact"/>
+                    <w:jc w:val="center"/>
+                  </w:pPr>
+                  <w:r>
+                    <w:t xml:space="preserve">Start point</w:t>
+                  </w:r>
+                </w:p>
+              </w:tc>
+              <w:tc>
+                <w:tcPr/>
+                <w:p>
+                  <w:pPr>
+                    <w:pStyle w:val="Compact"/>
+                    <w:jc w:val="center"/>
+                  </w:pPr>
+                  <w:r>
+                    <w:t xml:space="preserve">A</w:t>
+                  </w:r>
+                </w:p>
+              </w:tc>
+              <w:tc>
+                <w:tcPr/>
+                <w:p/>
+              </w:tc>
+              <w:tc>
+                <w:tcPr/>
+                <w:p/>
+              </w:tc>
+              <w:tc>
+                <w:tcPr/>
+                <w:p/>
+              </w:tc>
+              <w:tc>
+                <w:tcPr/>
+                <w:p>
+                  <w:pPr>
+                    <w:pStyle w:val="Compact"/>
+                    <w:jc w:val="center"/>
+                  </w:pPr>
+                  <w:r>
+                    <w:t xml:space="preserve">1</w:t>
+                  </w:r>
+                </w:p>
+              </w:tc>
+            </w:tr>
+            <w:tr>
+              <w:tc>
+                <w:tcPr/>
+                <w:p>
+                  <w:pPr>
+                    <w:pStyle w:val="Compact"/>
+                    <w:jc w:val="center"/>
+                  </w:pPr>
+                  <w:r>
+                    <w:t xml:space="preserve">Mean drift rate</w:t>
+                  </w:r>
+                </w:p>
+              </w:tc>
+              <w:tc>
+                <w:tcPr/>
+                <w:p>
+                  <w:pPr>
+                    <w:pStyle w:val="Compact"/>
+                    <w:jc w:val="center"/>
+                  </w:pPr>
+                  <w:r>
+                    <w:t xml:space="preserve">v</w:t>
+                  </w:r>
+                </w:p>
+              </w:tc>
+              <w:tc>
+                <w:tcPr/>
+                <w:p>
+                  <w:pPr>
+                    <w:pStyle w:val="Compact"/>
+                    <w:jc w:val="center"/>
+                  </w:pPr>
+                  <w:r>
+                    <w:t xml:space="preserve">yes</w:t>
+                  </w:r>
+                </w:p>
+              </w:tc>
+              <w:tc>
+                <w:tcPr/>
+                <w:p>
+                  <w:pPr>
+                    <w:pStyle w:val="Compact"/>
+                    <w:jc w:val="center"/>
+                  </w:pPr>
+                  <w:r>
+                    <w:t xml:space="preserve">no</w:t>
+                  </w:r>
+                </w:p>
+              </w:tc>
+              <w:tc>
+                <w:tcPr/>
+                <w:p>
+                  <w:pPr>
+                    <w:pStyle w:val="Compact"/>
+                    <w:jc w:val="center"/>
+                  </w:pPr>
+                  <w:r>
+                    <w:t xml:space="preserve">yes</w:t>
+                  </w:r>
+                </w:p>
+              </w:tc>
+              <w:tc>
+                <w:tcPr/>
+                <w:p/>
+              </w:tc>
+            </w:tr>
+            <w:tr>
+              <w:tc>
+                <w:tcPr/>
+                <w:p>
+                  <w:pPr>
+                    <w:pStyle w:val="Compact"/>
+                    <w:jc w:val="center"/>
+                  </w:pPr>
+                  <w:r>
+                    <w:t xml:space="preserve">SD drift rate</w:t>
+                  </w:r>
+                </w:p>
+              </w:tc>
+              <w:tc>
+                <w:tcPr/>
+                <w:p>
+                  <w:pPr>
+                    <w:pStyle w:val="Compact"/>
+                    <w:jc w:val="center"/>
+                  </w:pPr>
+                  <w:r>
+                    <w:t xml:space="preserve">sd_v</w:t>
+                  </w:r>
+                </w:p>
+              </w:tc>
+              <w:tc>
+                <w:tcPr/>
+                <w:p>
+                  <w:pPr>
+                    <w:pStyle w:val="Compact"/>
+                    <w:jc w:val="center"/>
+                  </w:pPr>
+                  <w:r>
+                    <w:t xml:space="preserve">no</w:t>
+                  </w:r>
+                </w:p>
+              </w:tc>
+              <w:tc>
+                <w:tcPr/>
+                <w:p>
+                  <w:pPr>
+                    <w:pStyle w:val="Compact"/>
+                    <w:jc w:val="center"/>
+                  </w:pPr>
+                  <w:r>
+                    <w:t xml:space="preserve">no</w:t>
+                  </w:r>
+                </w:p>
+              </w:tc>
+              <w:tc>
+                <w:tcPr/>
+                <w:p>
+                  <w:pPr>
+                    <w:pStyle w:val="Compact"/>
+                    <w:jc w:val="center"/>
+                  </w:pPr>
+                  <w:r>
+                    <w:t xml:space="preserve">yes</w:t>
+                  </w:r>
+                </w:p>
+              </w:tc>
+              <w:tc>
+                <w:tcPr/>
+                <w:p/>
+              </w:tc>
+            </w:tr>
+            <w:tr>
+              <w:tc>
+                <w:tcPr/>
+                <w:p>
+                  <w:pPr>
+                    <w:pStyle w:val="Compact"/>
+                    <w:jc w:val="center"/>
+                  </w:pPr>
+                  <w:r>
+                    <w:t xml:space="preserve">SD false drift rate</w:t>
+                  </w:r>
+                </w:p>
+              </w:tc>
+              <w:tc>
+                <w:tcPr/>
+                <w:p>
+                  <w:pPr>
+                    <w:pStyle w:val="Compact"/>
+                    <w:jc w:val="center"/>
+                  </w:pPr>
+                  <w:r>
+                    <w:t xml:space="preserve">false.sd_v</w:t>
+                  </w:r>
+                </w:p>
+              </w:tc>
+              <w:tc>
+                <w:tcPr/>
+                <w:p/>
+              </w:tc>
+              <w:tc>
+                <w:tcPr/>
+                <w:p/>
+              </w:tc>
+              <w:tc>
+                <w:tcPr/>
+                <w:p/>
+              </w:tc>
+              <w:tc>
+                <w:tcPr/>
+                <w:p>
+                  <w:pPr>
+                    <w:pStyle w:val="Compact"/>
+                    <w:jc w:val="center"/>
+                  </w:pPr>
+                  <w:r>
+                    <w:t xml:space="preserve">1</w:t>
+                  </w:r>
+                </w:p>
+              </w:tc>
+            </w:tr>
+            <w:tr>
+              <w:tc>
+                <w:tcPr/>
+                <w:p>
+                  <w:pPr>
+                    <w:pStyle w:val="Compact"/>
+                    <w:jc w:val="center"/>
+                  </w:pPr>
+                  <w:r>
+                    <w:t xml:space="preserve">Threshold</w:t>
+                  </w:r>
+                </w:p>
+              </w:tc>
+              <w:tc>
+                <w:tcPr/>
+                <w:p>
+                  <w:pPr>
+                    <w:pStyle w:val="Compact"/>
+                    <w:jc w:val="center"/>
+                  </w:pPr>
+                  <w:r>
+                    <w:t xml:space="preserve">b</w:t>
+                  </w:r>
+                </w:p>
+              </w:tc>
+              <w:tc>
+                <w:tcPr/>
+                <w:p>
+                  <w:pPr>
+                    <w:pStyle w:val="Compact"/>
+                    <w:jc w:val="center"/>
+                  </w:pPr>
+                  <w:r>
+                    <w:t xml:space="preserve">yes</w:t>
+                  </w:r>
+                </w:p>
+              </w:tc>
+              <w:tc>
+                <w:tcPr/>
+                <w:p>
+                  <w:pPr>
+                    <w:pStyle w:val="Compact"/>
+                    <w:jc w:val="center"/>
+                  </w:pPr>
+                  <w:r>
+                    <w:t xml:space="preserve">yes</w:t>
+                  </w:r>
+                </w:p>
+              </w:tc>
+              <w:tc>
+                <w:tcPr/>
+                <w:p>
+                  <w:pPr>
+                    <w:pStyle w:val="Compact"/>
+                    <w:jc w:val="center"/>
+                  </w:pPr>
+                  <w:r>
+                    <w:t xml:space="preserve">no</w:t>
+                  </w:r>
+                </w:p>
+              </w:tc>
+              <w:tc>
+                <w:tcPr/>
+                <w:p/>
+              </w:tc>
+            </w:tr>
+            <w:tr>
+              <w:tc>
+                <w:tcPr/>
+                <w:p>
+                  <w:pPr>
+                    <w:pStyle w:val="Compact"/>
+                    <w:jc w:val="center"/>
+                  </w:pPr>
+                  <w:r>
+                    <w:t xml:space="preserve">Non-decision time</w:t>
+                  </w:r>
+                </w:p>
+              </w:tc>
+              <w:tc>
+                <w:tcPr/>
+                <w:p>
+                  <w:pPr>
+                    <w:pStyle w:val="Compact"/>
+                    <w:jc w:val="center"/>
+                  </w:pPr>
+                  <w:r>
+                    <w:t xml:space="preserve">t0</w:t>
+                  </w:r>
+                </w:p>
+              </w:tc>
+              <w:tc>
+                <w:tcPr/>
+                <w:p>
+                  <w:pPr>
+                    <w:pStyle w:val="Compact"/>
+                    <w:jc w:val="center"/>
+                  </w:pPr>
+                  <w:r>
+                    <w:t xml:space="preserve">yes</w:t>
+                  </w:r>
+                </w:p>
+              </w:tc>
+              <w:tc>
+                <w:tcPr/>
+                <w:p>
+                  <w:pPr>
+                    <w:pStyle w:val="Compact"/>
+                    <w:jc w:val="center"/>
+                  </w:pPr>
+                  <w:r>
+                    <w:t xml:space="preserve">no</w:t>
+                  </w:r>
+                </w:p>
+              </w:tc>
+              <w:tc>
+                <w:tcPr/>
+                <w:p>
+                  <w:pPr>
+                    <w:pStyle w:val="Compact"/>
+                    <w:jc w:val="center"/>
+                  </w:pPr>
+                  <w:r>
+                    <w:t xml:space="preserve">no</w:t>
+                  </w:r>
+                </w:p>
+              </w:tc>
+              <w:tc>
+                <w:tcPr/>
+                <w:p/>
+              </w:tc>
+            </w:tr>
+            <w:tr>
+              <w:tc>
+                <w:tcPr/>
+                <w:p>
+                  <w:pPr>
+                    <w:pStyle w:val="Compact"/>
+                    <w:jc w:val="center"/>
+                  </w:pPr>
+                  <w:r>
+                    <w:t xml:space="preserve">SD Non-decision time</w:t>
+                  </w:r>
+                </w:p>
+              </w:tc>
+              <w:tc>
+                <w:tcPr/>
+                <w:p>
+                  <w:pPr>
+                    <w:pStyle w:val="Compact"/>
+                    <w:jc w:val="center"/>
+                  </w:pPr>
+                  <w:r>
+                    <w:t xml:space="preserve">st_0</w:t>
+                  </w:r>
+                </w:p>
+              </w:tc>
+              <w:tc>
+                <w:tcPr/>
+                <w:p/>
+              </w:tc>
+              <w:tc>
+                <w:tcPr/>
+                <w:p/>
+              </w:tc>
+              <w:tc>
+                <w:tcPr/>
+                <w:p/>
+              </w:tc>
+              <w:tc>
+                <w:tcPr/>
+                <w:p>
+                  <w:pPr>
+                    <w:pStyle w:val="Compact"/>
+                    <w:jc w:val="center"/>
+                  </w:pPr>
+                  <w:r>
+                    <w:t xml:space="preserve">0</w:t>
+                  </w:r>
+                </w:p>
+              </w:tc>
+            </w:tr>
+            <w:tr>
+              <w:tc>
+                <w:tcPr>
+                  <w:gridSpan w:val="6"/>
+                </w:tcPr>
+                <w:p>
+                  <w:pPr>
+                    <w:pStyle w:val="Compact"/>
+                    <w:jc w:val="center"/>
+                  </w:pPr>
+                  <w:r>
+                    <w:t xml:space="preserve">Condition = training condition (Learned vs. Novel or Famous vs. Novel);</w:t>
+                  </w:r>
+                  <w:r>
+                    <w:t xml:space="preserve"> </w:t>
+                  </w:r>
+                  <w:r>
+                    <w:t xml:space="preserve">Response = key-press response (same vs. different); Accuracy =</w:t>
+                  </w:r>
+                  <w:r>
+                    <w:t xml:space="preserve"> </w:t>
+                  </w:r>
+                  <w:r>
+                    <w:t xml:space="preserve">(true/correct vs false/incorrect); SD = standard deviation.</w:t>
+                  </w:r>
+                </w:p>
+              </w:tc>
+            </w:tr>
+          </w:tbl>
+          <w:bookmarkEnd w:id="72"/>
+          <w:p/>
+        </w:tc>
+      </w:tr>
+    </w:tbl>
+    <w:bookmarkEnd w:id="73"/>
+    <w:bookmarkStart w:id="74" w:name="model-estimation"/>
     <w:p>
       <w:pPr>
         <w:pStyle w:val="Heading3"/>
@@ -3761,8 +4297,8 @@
         <w:t xml:space="preserve">We carried out a Bayesian model estimation using the EMC2 R package. Details about the priors of each model are provided in supplementary materials and the code required to run the analyses is available on OSF. Priors were chosen to be weakly-informative meaning that they have little influence on the estimation. The parameter were estimated through two sampling steps. First, a separate estimation of the fixed effects for each participants was conducted. These estimations were used as the starting point for the full hierarchical model.</w:t>
       </w:r>
     </w:p>
-    <w:bookmarkEnd w:id="73"/>
-    <w:bookmarkStart w:id="74" w:name="data-analysis"/>
+    <w:bookmarkEnd w:id="74"/>
+    <w:bookmarkStart w:id="75" w:name="data-analysis"/>
     <w:p>
       <w:pPr>
         <w:pStyle w:val="Heading3"/>
@@ -3797,10 +4333,10 @@
         <w:t xml:space="preserve">. In order to make inference about the magnitude of familiarity effects, differences in parameter estimates across conditions were compared. To summarize the distribution of parameters of interest, we report the median of the posterior distribution together with 95% quantile interval of the posterior distribution in square brackets in the following section.</w:t>
       </w:r>
     </w:p>
-    <w:bookmarkEnd w:id="74"/>
     <w:bookmarkEnd w:id="75"/>
     <w:bookmarkEnd w:id="76"/>
-    <w:bookmarkStart w:id="115" w:name="results"/>
+    <w:bookmarkEnd w:id="77"/>
+    <w:bookmarkStart w:id="116" w:name="results"/>
     <w:p>
       <w:pPr>
         <w:pStyle w:val="Heading1"/>
@@ -3817,7 +4353,7 @@
         <w:t xml:space="preserve">First, we show raw data plots and descriptive statistics when reaction time and accuracy are analyses separately. Second, results from the LBA modeling will be presented.</w:t>
       </w:r>
     </w:p>
-    <w:bookmarkStart w:id="90" w:name="Xda3fa86d3e338028af1d354bb4a3c0db69b02ec"/>
+    <w:bookmarkStart w:id="91" w:name="Xda3fa86d3e338028af1d354bb4a3c0db69b02ec"/>
     <w:p>
       <w:pPr>
         <w:pStyle w:val="Heading2"/>
@@ -3826,7 +4362,7 @@
         <w:t xml:space="preserve">Raw data plots and descriptive statistics</w:t>
       </w:r>
     </w:p>
-    <w:bookmarkStart w:id="85" w:name="fig-acc-rt"/>
+    <w:bookmarkStart w:id="86" w:name="fig-acc-rt"/>
     <w:tbl>
       <w:tblPr>
         <w:tblStyle w:val="Table"/>
@@ -3853,7 +4389,7 @@
             <w:tr>
               <w:tc>
                 <w:tcPr/>
-                <w:bookmarkStart w:id="80" w:name="fig-acc-rt-1"/>
+                <w:bookmarkStart w:id="81" w:name="fig-acc-rt-1"/>
                 <w:p>
                   <w:pPr>
                     <w:pStyle w:val="Compact"/>
@@ -3865,18 +4401,18 @@
                       <wp:inline>
                         <wp:extent cx="5334000" cy="3048000"/>
                         <wp:effectExtent b="0" l="0" r="0" t="0"/>
-                        <wp:docPr descr="" title="" id="78" name="Picture"/>
+                        <wp:docPr descr="" title="" id="79" name="Picture"/>
                         <a:graphic>
                           <a:graphicData uri="http://schemas.openxmlformats.org/drawingml/2006/picture">
                             <pic:pic>
                               <pic:nvPicPr>
-                                <pic:cNvPr descr="manuscript_files/figure-docx/fig-acc-rt-1.png" id="79" name="Picture"/>
+                                <pic:cNvPr descr="manuscript_files/figure-docx/fig-acc-rt-1.png" id="80" name="Picture"/>
                                 <pic:cNvPicPr>
                                   <a:picLocks noChangeArrowheads="1" noChangeAspect="1"/>
                                 </pic:cNvPicPr>
                               </pic:nvPicPr>
                               <pic:blipFill>
-                                <a:blip r:embed="rId77"/>
+                                <a:blip r:embed="rId78"/>
                                 <a:stretch>
                                   <a:fillRect/>
                                 </a:stretch>
@@ -3917,7 +4453,7 @@
                     <w:t xml:space="preserve">(a) Proportion of correct responses [%]</w:t>
                   </w:r>
                 </w:p>
-                <w:bookmarkEnd w:id="80"/>
+                <w:bookmarkEnd w:id="81"/>
               </w:tc>
             </w:tr>
           </w:tbl>
@@ -3956,7 +4492,7 @@
             <w:tr>
               <w:tc>
                 <w:tcPr/>
-                <w:bookmarkStart w:id="84" w:name="fig-acc-rt-2"/>
+                <w:bookmarkStart w:id="85" w:name="fig-acc-rt-2"/>
                 <w:p>
                   <w:pPr>
                     <w:pStyle w:val="Compact"/>
@@ -3968,18 +4504,18 @@
                       <wp:inline>
                         <wp:extent cx="5334000" cy="3048000"/>
                         <wp:effectExtent b="0" l="0" r="0" t="0"/>
-                        <wp:docPr descr="" title="" id="82" name="Picture"/>
+                        <wp:docPr descr="" title="" id="83" name="Picture"/>
                         <a:graphic>
                           <a:graphicData uri="http://schemas.openxmlformats.org/drawingml/2006/picture">
                             <pic:pic>
                               <pic:nvPicPr>
-                                <pic:cNvPr descr="manuscript_files/figure-docx/fig-acc-rt-2.png" id="83" name="Picture"/>
+                                <pic:cNvPr descr="manuscript_files/figure-docx/fig-acc-rt-2.png" id="84" name="Picture"/>
                                 <pic:cNvPicPr>
                                   <a:picLocks noChangeArrowheads="1" noChangeAspect="1"/>
                                 </pic:cNvPicPr>
                               </pic:nvPicPr>
                               <pic:blipFill>
-                                <a:blip r:embed="rId81"/>
+                                <a:blip r:embed="rId82"/>
                                 <a:stretch>
                                   <a:fillRect/>
                                 </a:stretch>
@@ -4020,7 +4556,7 @@
                     <w:t xml:space="preserve">(b) Mean response times [s]</w:t>
                   </w:r>
                 </w:p>
-                <w:bookmarkEnd w:id="84"/>
+                <w:bookmarkEnd w:id="85"/>
               </w:tc>
             </w:tr>
           </w:tbl>
@@ -4040,7 +4576,7 @@
         <w:t xml:space="preserve">Figure 5: Proportion of correct responses [%] and mean response times [s] across conditions for the four experiments. Coloured points represent individual participant averages, black points denote the group mean and error bars represent 95% confidence intervals.</w:t>
       </w:r>
     </w:p>
-    <w:bookmarkEnd w:id="85"/>
+    <w:bookmarkEnd w:id="86"/>
     <w:tbl>
       <w:tblPr>
         <w:tblStyle w:val="Table"/>
@@ -4054,7 +4590,7 @@
       <w:tr>
         <w:tc>
           <w:tcPr/>
-          <w:bookmarkStart w:id="89" w:name="fig-rt-density"/>
+          <w:bookmarkStart w:id="90" w:name="fig-rt-density"/>
           <w:p>
             <w:pPr>
               <w:pStyle w:val="Compact"/>
@@ -4065,18 +4601,18 @@
                 <wp:inline>
                   <wp:extent cx="5334000" cy="3048000"/>
                   <wp:effectExtent b="0" l="0" r="0" t="0"/>
-                  <wp:docPr descr="" title="" id="87" name="Picture"/>
+                  <wp:docPr descr="" title="" id="88" name="Picture"/>
                   <a:graphic>
                     <a:graphicData uri="http://schemas.openxmlformats.org/drawingml/2006/picture">
                       <pic:pic>
                         <pic:nvPicPr>
-                          <pic:cNvPr descr="manuscript_files/figure-docx/fig-rt-density-1.png" id="88" name="Picture"/>
+                          <pic:cNvPr descr="manuscript_files/figure-docx/fig-rt-density-1.png" id="89" name="Picture"/>
                           <pic:cNvPicPr>
                             <a:picLocks noChangeArrowheads="1" noChangeAspect="1"/>
                           </pic:cNvPicPr>
                         </pic:nvPicPr>
                         <pic:blipFill>
-                          <a:blip r:embed="rId86"/>
+                          <a:blip r:embed="rId87"/>
                           <a:stretch>
                             <a:fillRect/>
                           </a:stretch>
@@ -4116,12 +4652,12 @@
               <w:t xml:space="preserve">Figure 6: Density of response times [s] across conditions for the four experiments. The density plot for Experiment 3 clearly shows the timing quantisation artefact discussed in the Methods, where keypress responses were recorded in ~80ms bins rather than continuously.</w:t>
             </w:r>
           </w:p>
-          <w:bookmarkEnd w:id="89"/>
+          <w:bookmarkEnd w:id="90"/>
         </w:tc>
       </w:tr>
     </w:tbl>
-    <w:bookmarkEnd w:id="90"/>
-    <w:bookmarkStart w:id="114" w:name="evidence-accumulation-modeling-results"/>
+    <w:bookmarkEnd w:id="91"/>
+    <w:bookmarkStart w:id="115" w:name="evidence-accumulation-modeling-results"/>
     <w:p>
       <w:pPr>
         <w:pStyle w:val="Heading2"/>
@@ -4179,14 +4715,14 @@
           <w:rPr>
             <w:rStyle w:val="Hyperlink"/>
           </w:rPr>
-          <w:t xml:space="preserve">Table 4</w:t>
+          <w:t xml:space="preserve">Table 5</w:t>
         </w:r>
       </w:hyperlink>
       <w:r>
         <w:t xml:space="preserve">.</w:t>
       </w:r>
     </w:p>
-    <w:bookmarkStart w:id="110" w:name="experiment-1-1"/>
+    <w:bookmarkStart w:id="111" w:name="experiment-1-1"/>
     <w:p>
       <w:pPr>
         <w:pStyle w:val="Heading3"/>
@@ -4213,7 +4749,7 @@
         <w:t xml:space="preserve">We estimated the threshold parameter for both response options (Novel and Learned). Inspection of the posterior distributions of the effect of face familiarity on the threshold parameter shows that while the threshold for Novel faces is greater that the one for Learned faces.</w:t>
       </w:r>
     </w:p>
-    <w:bookmarkStart w:id="99" w:name="fig-threshold-all"/>
+    <w:bookmarkStart w:id="100" w:name="fig-threshold-all"/>
     <w:tbl>
       <w:tblPr>
         <w:tblStyle w:val="Table"/>
@@ -4241,7 +4777,7 @@
             <w:tr>
               <w:tc>
                 <w:tcPr/>
-                <w:bookmarkStart w:id="94" w:name="fig-threshold-all-1"/>
+                <w:bookmarkStart w:id="95" w:name="fig-threshold-all-1"/>
                 <w:p>
                   <w:pPr>
                     <w:pStyle w:val="Compact"/>
@@ -4253,18 +4789,18 @@
                       <wp:inline>
                         <wp:extent cx="2971800" cy="4245428"/>
                         <wp:effectExtent b="0" l="0" r="0" t="0"/>
-                        <wp:docPr descr="" title="" id="92" name="Picture"/>
+                        <wp:docPr descr="" title="" id="93" name="Picture"/>
                         <a:graphic>
                           <a:graphicData uri="http://schemas.openxmlformats.org/drawingml/2006/picture">
                             <pic:pic>
                               <pic:nvPicPr>
-                                <pic:cNvPr descr="manuscript_files/figure-docx/fig-threshold-all-1.png" id="93" name="Picture"/>
+                                <pic:cNvPr descr="manuscript_files/figure-docx/fig-threshold-all-1.png" id="94" name="Picture"/>
                                 <pic:cNvPicPr>
                                   <a:picLocks noChangeArrowheads="1" noChangeAspect="1"/>
                                 </pic:cNvPicPr>
                               </pic:nvPicPr>
                               <pic:blipFill>
-                                <a:blip r:embed="rId91"/>
+                                <a:blip r:embed="rId92"/>
                                 <a:stretch>
                                   <a:fillRect/>
                                 </a:stretch>
@@ -4305,7 +4841,7 @@
                     <w:t xml:space="preserve">(a) Threshold by response</w:t>
                   </w:r>
                 </w:p>
-                <w:bookmarkEnd w:id="94"/>
+                <w:bookmarkEnd w:id="95"/>
               </w:tc>
             </w:tr>
           </w:tbl>
@@ -4326,7 +4862,7 @@
             <w:tr>
               <w:tc>
                 <w:tcPr/>
-                <w:bookmarkStart w:id="98" w:name="fig-threshold-all-2"/>
+                <w:bookmarkStart w:id="99" w:name="fig-threshold-all-2"/>
                 <w:p>
                   <w:pPr>
                     <w:pStyle w:val="Compact"/>
@@ -4338,18 +4874,18 @@
                       <wp:inline>
                         <wp:extent cx="2971800" cy="4245428"/>
                         <wp:effectExtent b="0" l="0" r="0" t="0"/>
-                        <wp:docPr descr="" title="" id="96" name="Picture"/>
+                        <wp:docPr descr="" title="" id="97" name="Picture"/>
                         <a:graphic>
                           <a:graphicData uri="http://schemas.openxmlformats.org/drawingml/2006/picture">
                             <pic:pic>
                               <pic:nvPicPr>
-                                <pic:cNvPr descr="manuscript_files/figure-docx/fig-threshold-all-2.png" id="97" name="Picture"/>
+                                <pic:cNvPr descr="manuscript_files/figure-docx/fig-threshold-all-2.png" id="98" name="Picture"/>
                                 <pic:cNvPicPr>
                                   <a:picLocks noChangeArrowheads="1" noChangeAspect="1"/>
                                 </pic:cNvPicPr>
                               </pic:nvPicPr>
                               <pic:blipFill>
-                                <a:blip r:embed="rId95"/>
+                                <a:blip r:embed="rId96"/>
                                 <a:stretch>
                                   <a:fillRect/>
                                 </a:stretch>
@@ -4390,7 +4926,7 @@
                     <w:t xml:space="preserve">(b) Threshold contrast</w:t>
                   </w:r>
                 </w:p>
-                <w:bookmarkEnd w:id="98"/>
+                <w:bookmarkEnd w:id="99"/>
               </w:tc>
             </w:tr>
           </w:tbl>
@@ -4410,7 +4946,7 @@
         <w:t xml:space="preserve">Figure 7: Threshold estimates across experiments</w:t>
       </w:r>
     </w:p>
-    <w:bookmarkEnd w:id="99"/>
+    <w:bookmarkEnd w:id="100"/>
     <w:p>
       <w:pPr>
         <w:pStyle w:val="BodyText"/>
@@ -4429,7 +4965,7 @@
         <w:t xml:space="preserve">To quantify the contribution of face familiarity on the drift rate, we computed the difference between the TRUE and FALSE drift rate for each familiarity condition as our main dependent measure. To estimate the familiarity effect, we then subtracted the drift rate difference on learned trials from novel trials. Inspection of the posterior distribution shows that there is a novelty effect in drift rate difference in Experiment 1. The quality of the evidence accumulation was greater for Novel faces compared to Learned faces.</w:t>
       </w:r>
     </w:p>
-    <w:bookmarkStart w:id="108" w:name="fig-drift-all"/>
+    <w:bookmarkStart w:id="109" w:name="fig-drift-all"/>
     <w:tbl>
       <w:tblPr>
         <w:tblStyle w:val="Table"/>
@@ -4457,7 +4993,7 @@
             <w:tr>
               <w:tc>
                 <w:tcPr/>
-                <w:bookmarkStart w:id="103" w:name="fig-drift-all-1"/>
+                <w:bookmarkStart w:id="104" w:name="fig-drift-all-1"/>
                 <w:p>
                   <w:pPr>
                     <w:pStyle w:val="Compact"/>
@@ -4469,18 +5005,18 @@
                       <wp:inline>
                         <wp:extent cx="2971800" cy="4245428"/>
                         <wp:effectExtent b="0" l="0" r="0" t="0"/>
-                        <wp:docPr descr="" title="" id="101" name="Picture"/>
+                        <wp:docPr descr="" title="" id="102" name="Picture"/>
                         <a:graphic>
                           <a:graphicData uri="http://schemas.openxmlformats.org/drawingml/2006/picture">
                             <pic:pic>
                               <pic:nvPicPr>
-                                <pic:cNvPr descr="manuscript_files/figure-docx/fig-drift-all-1.png" id="102" name="Picture"/>
+                                <pic:cNvPr descr="manuscript_files/figure-docx/fig-drift-all-1.png" id="103" name="Picture"/>
                                 <pic:cNvPicPr>
                                   <a:picLocks noChangeArrowheads="1" noChangeAspect="1"/>
                                 </pic:cNvPicPr>
                               </pic:nvPicPr>
                               <pic:blipFill>
-                                <a:blip r:embed="rId100"/>
+                                <a:blip r:embed="rId101"/>
                                 <a:stretch>
                                   <a:fillRect/>
                                 </a:stretch>
@@ -4521,7 +5057,7 @@
                     <w:t xml:space="preserve">(a) Drift rate (TRUE - FALSE) by condition</w:t>
                   </w:r>
                 </w:p>
-                <w:bookmarkEnd w:id="103"/>
+                <w:bookmarkEnd w:id="104"/>
               </w:tc>
             </w:tr>
           </w:tbl>
@@ -4542,7 +5078,7 @@
             <w:tr>
               <w:tc>
                 <w:tcPr/>
-                <w:bookmarkStart w:id="107" w:name="fig-drift-all-2"/>
+                <w:bookmarkStart w:id="108" w:name="fig-drift-all-2"/>
                 <w:p>
                   <w:pPr>
                     <w:pStyle w:val="Compact"/>
@@ -4554,18 +5090,18 @@
                       <wp:inline>
                         <wp:extent cx="2971800" cy="4245428"/>
                         <wp:effectExtent b="0" l="0" r="0" t="0"/>
-                        <wp:docPr descr="" title="" id="105" name="Picture"/>
+                        <wp:docPr descr="" title="" id="106" name="Picture"/>
                         <a:graphic>
                           <a:graphicData uri="http://schemas.openxmlformats.org/drawingml/2006/picture">
                             <pic:pic>
                               <pic:nvPicPr>
-                                <pic:cNvPr descr="manuscript_files/figure-docx/fig-drift-all-2.png" id="106" name="Picture"/>
+                                <pic:cNvPr descr="manuscript_files/figure-docx/fig-drift-all-2.png" id="107" name="Picture"/>
                                 <pic:cNvPicPr>
                                   <a:picLocks noChangeArrowheads="1" noChangeAspect="1"/>
                                 </pic:cNvPicPr>
                               </pic:nvPicPr>
                               <pic:blipFill>
-                                <a:blip r:embed="rId104"/>
+                                <a:blip r:embed="rId105"/>
                                 <a:stretch>
                                   <a:fillRect/>
                                 </a:stretch>
@@ -4606,7 +5142,7 @@
                     <w:t xml:space="preserve">(b) Drift rate contrast</w:t>
                   </w:r>
                 </w:p>
-                <w:bookmarkEnd w:id="107"/>
+                <w:bookmarkEnd w:id="108"/>
               </w:tc>
             </w:tr>
           </w:tbl>
@@ -4626,7 +5162,7 @@
         <w:t xml:space="preserve">Figure 8: Drift rate estimates across experiments</w:t>
       </w:r>
     </w:p>
-    <w:bookmarkEnd w:id="108"/>
+    <w:bookmarkEnd w:id="109"/>
     <w:p>
       <w:pPr>
         <w:pStyle w:val="BodyText"/>
@@ -4648,7 +5184,7 @@
       <w:tr>
         <w:tc>
           <w:tcPr/>
-          <w:bookmarkStart w:id="109" w:name="tbl-lba-params"/>
+          <w:bookmarkStart w:id="110" w:name="tbl-lba-params"/>
           <w:p>
             <w:pPr>
               <w:jc w:val="center"/>
@@ -4659,22 +5195,21 @@
               <w:pStyle w:val="ImageCaption"/>
             </w:pPr>
             <w:r>
-              <w:t xml:space="preserve">Table 4: Posterior median and 95% credible intervals for threshold and drift rate parameters across experiments. Positive contrast values indicate a novel face advantage.</w:t>
+              <w:t xml:space="preserve">Table 5: Posterior median and 95% quantile intervals for threshold and drift rate parameters across experiments.</w:t>
             </w:r>
           </w:p>
           <w:tbl>
             <w:tblPr>
               <w:tblStyle w:val="Table"/>
-              <w:tblW w:type="pct" w:w="4824"/>
+              <w:tblW w:type="pct" w:w="4653"/>
               <w:tblLayout w:type="fixed"/>
-              <w:tblLook w:firstRow="1" w:lastRow="0" w:firstColumn="0" w:lastColumn="0" w:noHBand="0" w:noVBand="0" w:val="0020"/>
+              <w:tblLook w:firstRow="1" w:lastRow="1" w:firstColumn="0" w:lastColumn="0" w:noHBand="0" w:noVBand="0" w:val="0020"/>
             </w:tblPr>
             <w:tblGrid>
-              <w:gridCol w:w="1397"/>
-              <w:gridCol w:w="2049"/>
-              <w:gridCol w:w="1677"/>
-              <w:gridCol w:w="838"/>
-              <w:gridCol w:w="1677"/>
+              <w:gridCol w:w="2420"/>
+              <w:gridCol w:w="1980"/>
+              <w:gridCol w:w="990"/>
+              <w:gridCol w:w="1980"/>
             </w:tblGrid>
             <w:tr>
               <w:trPr>
@@ -4688,18 +5223,6 @@
                     <w:jc w:val="center"/>
                   </w:pPr>
                   <w:r>
-                    <w:t xml:space="preserve">Experiment</w:t>
-                  </w:r>
-                </w:p>
-              </w:tc>
-              <w:tc>
-                <w:tcPr/>
-                <w:p>
-                  <w:pPr>
-                    <w:pStyle w:val="Compact"/>
-                    <w:jc w:val="center"/>
-                  </w:pPr>
-                  <w:r>
                     <w:t xml:space="preserve">Parameter</w:t>
                   </w:r>
                 </w:p>
@@ -4743,7 +5266,9 @@
             </w:tr>
             <w:tr>
               <w:tc>
-                <w:tcPr/>
+                <w:tcPr>
+                  <w:gridSpan w:val="4"/>
+                </w:tcPr>
                 <w:p>
                   <w:pPr>
                     <w:pStyle w:val="Compact"/>
@@ -4751,54 +5276,6 @@
                   </w:pPr>
                   <w:r>
                     <w:t xml:space="preserve">Experiment 1</w:t>
-                  </w:r>
-                </w:p>
-              </w:tc>
-              <w:tc>
-                <w:tcPr/>
-                <w:p>
-                  <w:pPr>
-                    <w:pStyle w:val="Compact"/>
-                    <w:jc w:val="center"/>
-                  </w:pPr>
-                  <w:r>
-                    <w:t xml:space="preserve">Threshold</w:t>
-                  </w:r>
-                </w:p>
-              </w:tc>
-              <w:tc>
-                <w:tcPr/>
-                <w:p>
-                  <w:pPr>
-                    <w:pStyle w:val="Compact"/>
-                    <w:jc w:val="center"/>
-                  </w:pPr>
-                  <w:r>
-                    <w:t xml:space="preserve">novel</w:t>
-                  </w:r>
-                </w:p>
-              </w:tc>
-              <w:tc>
-                <w:tcPr/>
-                <w:p>
-                  <w:pPr>
-                    <w:pStyle w:val="Compact"/>
-                    <w:jc w:val="center"/>
-                  </w:pPr>
-                  <w:r>
-                    <w:t xml:space="preserve">0.129</w:t>
-                  </w:r>
-                </w:p>
-              </w:tc>
-              <w:tc>
-                <w:tcPr/>
-                <w:p>
-                  <w:pPr>
-                    <w:pStyle w:val="Compact"/>
-                    <w:jc w:val="center"/>
-                  </w:pPr>
-                  <w:r>
-                    <w:t xml:space="preserve">[-0.009, 0.259]</w:t>
                   </w:r>
                 </w:p>
               </w:tc>
@@ -4812,18 +5289,6 @@
                     <w:jc w:val="center"/>
                   </w:pPr>
                   <w:r>
-                    <w:t xml:space="preserve">Experiment 1</w:t>
-                  </w:r>
-                </w:p>
-              </w:tc>
-              <w:tc>
-                <w:tcPr/>
-                <w:p>
-                  <w:pPr>
-                    <w:pStyle w:val="Compact"/>
-                    <w:jc w:val="center"/>
-                  </w:pPr>
-                  <w:r>
                     <w:t xml:space="preserve">Threshold</w:t>
                   </w:r>
                 </w:p>
@@ -4836,31 +5301,31 @@
                     <w:jc w:val="center"/>
                   </w:pPr>
                   <w:r>
-                    <w:t xml:space="preserve">learned</w:t>
-                  </w:r>
-                </w:p>
-              </w:tc>
-              <w:tc>
-                <w:tcPr/>
-                <w:p>
-                  <w:pPr>
-                    <w:pStyle w:val="Compact"/>
-                    <w:jc w:val="center"/>
-                  </w:pPr>
-                  <w:r>
-                    <w:t xml:space="preserve">0.046</w:t>
-                  </w:r>
-                </w:p>
-              </w:tc>
-              <w:tc>
-                <w:tcPr/>
-                <w:p>
-                  <w:pPr>
-                    <w:pStyle w:val="Compact"/>
-                    <w:jc w:val="center"/>
-                  </w:pPr>
-                  <w:r>
-                    <w:t xml:space="preserve">[-0.095, 0.181]</w:t>
+                    <w:t xml:space="preserve">novel</w:t>
+                  </w:r>
+                </w:p>
+              </w:tc>
+              <w:tc>
+                <w:tcPr/>
+                <w:p>
+                  <w:pPr>
+                    <w:pStyle w:val="Compact"/>
+                    <w:jc w:val="center"/>
+                  </w:pPr>
+                  <w:r>
+                    <w:t xml:space="preserve">0.2</w:t>
+                  </w:r>
+                </w:p>
+              </w:tc>
+              <w:tc>
+                <w:tcPr/>
+                <w:p>
+                  <w:pPr>
+                    <w:pStyle w:val="Compact"/>
+                    <w:jc w:val="center"/>
+                  </w:pPr>
+                  <w:r>
+                    <w:t xml:space="preserve">[0.061, 0.333]</w:t>
                   </w:r>
                 </w:p>
               </w:tc>
@@ -4874,55 +5339,43 @@
                     <w:jc w:val="center"/>
                   </w:pPr>
                   <w:r>
-                    <w:t xml:space="preserve">Experiment 1</w:t>
-                  </w:r>
-                </w:p>
-              </w:tc>
-              <w:tc>
-                <w:tcPr/>
-                <w:p>
-                  <w:pPr>
-                    <w:pStyle w:val="Compact"/>
-                    <w:jc w:val="center"/>
-                  </w:pPr>
-                  <w:r>
-                    <w:t xml:space="preserve">Threshold contrast</w:t>
-                  </w:r>
-                </w:p>
-              </w:tc>
-              <w:tc>
-                <w:tcPr/>
-                <w:p>
-                  <w:pPr>
-                    <w:pStyle w:val="Compact"/>
-                    <w:jc w:val="center"/>
-                  </w:pPr>
-                  <w:r>
-                    <w:t xml:space="preserve">novel - learned</w:t>
-                  </w:r>
-                </w:p>
-              </w:tc>
-              <w:tc>
-                <w:tcPr/>
-                <w:p>
-                  <w:pPr>
-                    <w:pStyle w:val="Compact"/>
-                    <w:jc w:val="center"/>
-                  </w:pPr>
-                  <w:r>
-                    <w:t xml:space="preserve">0.082</w:t>
-                  </w:r>
-                </w:p>
-              </w:tc>
-              <w:tc>
-                <w:tcPr/>
-                <w:p>
-                  <w:pPr>
-                    <w:pStyle w:val="Compact"/>
-                    <w:jc w:val="center"/>
-                  </w:pPr>
-                  <w:r>
-                    <w:t xml:space="preserve">[0.014, 0.15]</w:t>
+                    <w:t xml:space="preserve">Threshold</w:t>
+                  </w:r>
+                </w:p>
+              </w:tc>
+              <w:tc>
+                <w:tcPr/>
+                <w:p>
+                  <w:pPr>
+                    <w:pStyle w:val="Compact"/>
+                    <w:jc w:val="center"/>
+                  </w:pPr>
+                  <w:r>
+                    <w:t xml:space="preserve">learned</w:t>
+                  </w:r>
+                </w:p>
+              </w:tc>
+              <w:tc>
+                <w:tcPr/>
+                <w:p>
+                  <w:pPr>
+                    <w:pStyle w:val="Compact"/>
+                    <w:jc w:val="center"/>
+                  </w:pPr>
+                  <w:r>
+                    <w:t xml:space="preserve">0.12</w:t>
+                  </w:r>
+                </w:p>
+              </w:tc>
+              <w:tc>
+                <w:tcPr/>
+                <w:p>
+                  <w:pPr>
+                    <w:pStyle w:val="Compact"/>
+                    <w:jc w:val="center"/>
+                  </w:pPr>
+                  <w:r>
+                    <w:t xml:space="preserve">[-0.027, 0.256]</w:t>
                   </w:r>
                 </w:p>
               </w:tc>
@@ -4936,55 +5389,43 @@
                     <w:jc w:val="center"/>
                   </w:pPr>
                   <w:r>
-                    <w:t xml:space="preserve">Experiment 1</w:t>
-                  </w:r>
-                </w:p>
-              </w:tc>
-              <w:tc>
-                <w:tcPr/>
-                <w:p>
-                  <w:pPr>
-                    <w:pStyle w:val="Compact"/>
-                    <w:jc w:val="center"/>
-                  </w:pPr>
-                  <w:r>
-                    <w:t xml:space="preserve">Drift rate</w:t>
-                  </w:r>
-                </w:p>
-              </w:tc>
-              <w:tc>
-                <w:tcPr/>
-                <w:p>
-                  <w:pPr>
-                    <w:pStyle w:val="Compact"/>
-                    <w:jc w:val="center"/>
-                  </w:pPr>
-                  <w:r>
-                    <w:t xml:space="preserve">novel</w:t>
-                  </w:r>
-                </w:p>
-              </w:tc>
-              <w:tc>
-                <w:tcPr/>
-                <w:p>
-                  <w:pPr>
-                    <w:pStyle w:val="Compact"/>
-                    <w:jc w:val="center"/>
-                  </w:pPr>
-                  <w:r>
-                    <w:t xml:space="preserve">2.155</w:t>
-                  </w:r>
-                </w:p>
-              </w:tc>
-              <w:tc>
-                <w:tcPr/>
-                <w:p>
-                  <w:pPr>
-                    <w:pStyle w:val="Compact"/>
-                    <w:jc w:val="center"/>
-                  </w:pPr>
-                  <w:r>
-                    <w:t xml:space="preserve">[1.965, 2.358]</w:t>
+                    <w:t xml:space="preserve">Threshold contrast</w:t>
+                  </w:r>
+                </w:p>
+              </w:tc>
+              <w:tc>
+                <w:tcPr/>
+                <w:p>
+                  <w:pPr>
+                    <w:pStyle w:val="Compact"/>
+                    <w:jc w:val="center"/>
+                  </w:pPr>
+                  <w:r>
+                    <w:t xml:space="preserve">novel - learned</w:t>
+                  </w:r>
+                </w:p>
+              </w:tc>
+              <w:tc>
+                <w:tcPr/>
+                <w:p>
+                  <w:pPr>
+                    <w:pStyle w:val="Compact"/>
+                    <w:jc w:val="center"/>
+                  </w:pPr>
+                  <w:r>
+                    <w:t xml:space="preserve">0.08</w:t>
+                  </w:r>
+                </w:p>
+              </w:tc>
+              <w:tc>
+                <w:tcPr/>
+                <w:p>
+                  <w:pPr>
+                    <w:pStyle w:val="Compact"/>
+                    <w:jc w:val="center"/>
+                  </w:pPr>
+                  <w:r>
+                    <w:t xml:space="preserve">[0.017, 0.148]</w:t>
                   </w:r>
                 </w:p>
               </w:tc>
@@ -4998,18 +5439,6 @@
                     <w:jc w:val="center"/>
                   </w:pPr>
                   <w:r>
-                    <w:t xml:space="preserve">Experiment 1</w:t>
-                  </w:r>
-                </w:p>
-              </w:tc>
-              <w:tc>
-                <w:tcPr/>
-                <w:p>
-                  <w:pPr>
-                    <w:pStyle w:val="Compact"/>
-                    <w:jc w:val="center"/>
-                  </w:pPr>
-                  <w:r>
                     <w:t xml:space="preserve">Drift rate</w:t>
                   </w:r>
                 </w:p>
@@ -5022,31 +5451,31 @@
                     <w:jc w:val="center"/>
                   </w:pPr>
                   <w:r>
-                    <w:t xml:space="preserve">learned</w:t>
-                  </w:r>
-                </w:p>
-              </w:tc>
-              <w:tc>
-                <w:tcPr/>
-                <w:p>
-                  <w:pPr>
-                    <w:pStyle w:val="Compact"/>
-                    <w:jc w:val="center"/>
-                  </w:pPr>
-                  <w:r>
-                    <w:t xml:space="preserve">0.802</w:t>
-                  </w:r>
-                </w:p>
-              </w:tc>
-              <w:tc>
-                <w:tcPr/>
-                <w:p>
-                  <w:pPr>
-                    <w:pStyle w:val="Compact"/>
-                    <w:jc w:val="center"/>
-                  </w:pPr>
-                  <w:r>
-                    <w:t xml:space="preserve">[0.654, 0.948]</w:t>
+                    <w:t xml:space="preserve">novel</w:t>
+                  </w:r>
+                </w:p>
+              </w:tc>
+              <w:tc>
+                <w:tcPr/>
+                <w:p>
+                  <w:pPr>
+                    <w:pStyle w:val="Compact"/>
+                    <w:jc w:val="center"/>
+                  </w:pPr>
+                  <w:r>
+                    <w:t xml:space="preserve">2.11</w:t>
+                  </w:r>
+                </w:p>
+              </w:tc>
+              <w:tc>
+                <w:tcPr/>
+                <w:p>
+                  <w:pPr>
+                    <w:pStyle w:val="Compact"/>
+                    <w:jc w:val="center"/>
+                  </w:pPr>
+                  <w:r>
+                    <w:t xml:space="preserve">[1.922, 2.31]</w:t>
                   </w:r>
                 </w:p>
               </w:tc>
@@ -5060,55 +5489,43 @@
                     <w:jc w:val="center"/>
                   </w:pPr>
                   <w:r>
-                    <w:t xml:space="preserve">Experiment 1</w:t>
-                  </w:r>
-                </w:p>
-              </w:tc>
-              <w:tc>
-                <w:tcPr/>
-                <w:p>
-                  <w:pPr>
-                    <w:pStyle w:val="Compact"/>
-                    <w:jc w:val="center"/>
-                  </w:pPr>
-                  <w:r>
-                    <w:t xml:space="preserve">Drift rate contrast</w:t>
-                  </w:r>
-                </w:p>
-              </w:tc>
-              <w:tc>
-                <w:tcPr/>
-                <w:p>
-                  <w:pPr>
-                    <w:pStyle w:val="Compact"/>
-                    <w:jc w:val="center"/>
-                  </w:pPr>
-                  <w:r>
-                    <w:t xml:space="preserve">novel - learned</w:t>
-                  </w:r>
-                </w:p>
-              </w:tc>
-              <w:tc>
-                <w:tcPr/>
-                <w:p>
-                  <w:pPr>
-                    <w:pStyle w:val="Compact"/>
-                    <w:jc w:val="center"/>
-                  </w:pPr>
-                  <w:r>
-                    <w:t xml:space="preserve">1.355</w:t>
-                  </w:r>
-                </w:p>
-              </w:tc>
-              <w:tc>
-                <w:tcPr/>
-                <w:p>
-                  <w:pPr>
-                    <w:pStyle w:val="Compact"/>
-                    <w:jc w:val="center"/>
-                  </w:pPr>
-                  <w:r>
-                    <w:t xml:space="preserve">[1.086, 1.631]</w:t>
+                    <w:t xml:space="preserve">Drift rate</w:t>
+                  </w:r>
+                </w:p>
+              </w:tc>
+              <w:tc>
+                <w:tcPr/>
+                <w:p>
+                  <w:pPr>
+                    <w:pStyle w:val="Compact"/>
+                    <w:jc w:val="center"/>
+                  </w:pPr>
+                  <w:r>
+                    <w:t xml:space="preserve">learned</w:t>
+                  </w:r>
+                </w:p>
+              </w:tc>
+              <w:tc>
+                <w:tcPr/>
+                <w:p>
+                  <w:pPr>
+                    <w:pStyle w:val="Compact"/>
+                    <w:jc w:val="center"/>
+                  </w:pPr>
+                  <w:r>
+                    <w:t xml:space="preserve">0.77</w:t>
+                  </w:r>
+                </w:p>
+              </w:tc>
+              <w:tc>
+                <w:tcPr/>
+                <w:p>
+                  <w:pPr>
+                    <w:pStyle w:val="Compact"/>
+                    <w:jc w:val="center"/>
+                  </w:pPr>
+                  <w:r>
+                    <w:t xml:space="preserve">[0.626, 0.914]</w:t>
                   </w:r>
                 </w:p>
               </w:tc>
@@ -5122,62 +5539,52 @@
                     <w:jc w:val="center"/>
                   </w:pPr>
                   <w:r>
-                    <w:t xml:space="preserve">Experiment 2</w:t>
-                  </w:r>
-                </w:p>
-              </w:tc>
-              <w:tc>
-                <w:tcPr/>
-                <w:p>
-                  <w:pPr>
-                    <w:pStyle w:val="Compact"/>
-                    <w:jc w:val="center"/>
-                  </w:pPr>
-                  <w:r>
-                    <w:t xml:space="preserve">Threshold</w:t>
-                  </w:r>
-                </w:p>
-              </w:tc>
-              <w:tc>
-                <w:tcPr/>
-                <w:p>
-                  <w:pPr>
-                    <w:pStyle w:val="Compact"/>
-                    <w:jc w:val="center"/>
-                  </w:pPr>
-                  <w:r>
-                    <w:t xml:space="preserve">novel</w:t>
-                  </w:r>
-                </w:p>
-              </w:tc>
-              <w:tc>
-                <w:tcPr/>
-                <w:p>
-                  <w:pPr>
-                    <w:pStyle w:val="Compact"/>
-                    <w:jc w:val="center"/>
-                  </w:pPr>
-                  <w:r>
-                    <w:t xml:space="preserve">0.438</w:t>
-                  </w:r>
-                </w:p>
-              </w:tc>
-              <w:tc>
-                <w:tcPr/>
-                <w:p>
-                  <w:pPr>
-                    <w:pStyle w:val="Compact"/>
-                    <w:jc w:val="center"/>
-                  </w:pPr>
-                  <w:r>
-                    <w:t xml:space="preserve">[0.319, 0.551]</w:t>
+                    <w:t xml:space="preserve">Drift rate contrast</w:t>
+                  </w:r>
+                </w:p>
+              </w:tc>
+              <w:tc>
+                <w:tcPr/>
+                <w:p>
+                  <w:pPr>
+                    <w:pStyle w:val="Compact"/>
+                    <w:jc w:val="center"/>
+                  </w:pPr>
+                  <w:r>
+                    <w:t xml:space="preserve">novel - learned</w:t>
+                  </w:r>
+                </w:p>
+              </w:tc>
+              <w:tc>
+                <w:tcPr/>
+                <w:p>
+                  <w:pPr>
+                    <w:pStyle w:val="Compact"/>
+                    <w:jc w:val="center"/>
+                  </w:pPr>
+                  <w:r>
+                    <w:t xml:space="preserve">1.35</w:t>
+                  </w:r>
+                </w:p>
+              </w:tc>
+              <w:tc>
+                <w:tcPr/>
+                <w:p>
+                  <w:pPr>
+                    <w:pStyle w:val="Compact"/>
+                    <w:jc w:val="center"/>
+                  </w:pPr>
+                  <w:r>
+                    <w:t xml:space="preserve">[1.074, 1.618]</w:t>
                   </w:r>
                 </w:p>
               </w:tc>
             </w:tr>
             <w:tr>
               <w:tc>
-                <w:tcPr/>
+                <w:tcPr>
+                  <w:gridSpan w:val="4"/>
+                </w:tcPr>
                 <w:p>
                   <w:pPr>
                     <w:pStyle w:val="Compact"/>
@@ -5185,54 +5592,6 @@
                   </w:pPr>
                   <w:r>
                     <w:t xml:space="preserve">Experiment 2</w:t>
-                  </w:r>
-                </w:p>
-              </w:tc>
-              <w:tc>
-                <w:tcPr/>
-                <w:p>
-                  <w:pPr>
-                    <w:pStyle w:val="Compact"/>
-                    <w:jc w:val="center"/>
-                  </w:pPr>
-                  <w:r>
-                    <w:t xml:space="preserve">Threshold</w:t>
-                  </w:r>
-                </w:p>
-              </w:tc>
-              <w:tc>
-                <w:tcPr/>
-                <w:p>
-                  <w:pPr>
-                    <w:pStyle w:val="Compact"/>
-                    <w:jc w:val="center"/>
-                  </w:pPr>
-                  <w:r>
-                    <w:t xml:space="preserve">learned</w:t>
-                  </w:r>
-                </w:p>
-              </w:tc>
-              <w:tc>
-                <w:tcPr/>
-                <w:p>
-                  <w:pPr>
-                    <w:pStyle w:val="Compact"/>
-                    <w:jc w:val="center"/>
-                  </w:pPr>
-                  <w:r>
-                    <w:t xml:space="preserve">0.244</w:t>
-                  </w:r>
-                </w:p>
-              </w:tc>
-              <w:tc>
-                <w:tcPr/>
-                <w:p>
-                  <w:pPr>
-                    <w:pStyle w:val="Compact"/>
-                    <w:jc w:val="center"/>
-                  </w:pPr>
-                  <w:r>
-                    <w:t xml:space="preserve">[0.123, 0.363]</w:t>
                   </w:r>
                 </w:p>
               </w:tc>
@@ -5246,55 +5605,43 @@
                     <w:jc w:val="center"/>
                   </w:pPr>
                   <w:r>
-                    <w:t xml:space="preserve">Experiment 2</w:t>
-                  </w:r>
-                </w:p>
-              </w:tc>
-              <w:tc>
-                <w:tcPr/>
-                <w:p>
-                  <w:pPr>
-                    <w:pStyle w:val="Compact"/>
-                    <w:jc w:val="center"/>
-                  </w:pPr>
-                  <w:r>
-                    <w:t xml:space="preserve">Threshold contrast</w:t>
-                  </w:r>
-                </w:p>
-              </w:tc>
-              <w:tc>
-                <w:tcPr/>
-                <w:p>
-                  <w:pPr>
-                    <w:pStyle w:val="Compact"/>
-                    <w:jc w:val="center"/>
-                  </w:pPr>
-                  <w:r>
-                    <w:t xml:space="preserve">novel - learned</w:t>
-                  </w:r>
-                </w:p>
-              </w:tc>
-              <w:tc>
-                <w:tcPr/>
-                <w:p>
-                  <w:pPr>
-                    <w:pStyle w:val="Compact"/>
-                    <w:jc w:val="center"/>
-                  </w:pPr>
-                  <w:r>
-                    <w:t xml:space="preserve">0.194</w:t>
-                  </w:r>
-                </w:p>
-              </w:tc>
-              <w:tc>
-                <w:tcPr/>
-                <w:p>
-                  <w:pPr>
-                    <w:pStyle w:val="Compact"/>
-                    <w:jc w:val="center"/>
-                  </w:pPr>
-                  <w:r>
-                    <w:t xml:space="preserve">[0.134, 0.254]</w:t>
+                    <w:t xml:space="preserve">Threshold</w:t>
+                  </w:r>
+                </w:p>
+              </w:tc>
+              <w:tc>
+                <w:tcPr/>
+                <w:p>
+                  <w:pPr>
+                    <w:pStyle w:val="Compact"/>
+                    <w:jc w:val="center"/>
+                  </w:pPr>
+                  <w:r>
+                    <w:t xml:space="preserve">novel</w:t>
+                  </w:r>
+                </w:p>
+              </w:tc>
+              <w:tc>
+                <w:tcPr/>
+                <w:p>
+                  <w:pPr>
+                    <w:pStyle w:val="Compact"/>
+                    <w:jc w:val="center"/>
+                  </w:pPr>
+                  <w:r>
+                    <w:t xml:space="preserve">0.51</w:t>
+                  </w:r>
+                </w:p>
+              </w:tc>
+              <w:tc>
+                <w:tcPr/>
+                <w:p>
+                  <w:pPr>
+                    <w:pStyle w:val="Compact"/>
+                    <w:jc w:val="center"/>
+                  </w:pPr>
+                  <w:r>
+                    <w:t xml:space="preserve">[0.402, 0.613]</w:t>
                   </w:r>
                 </w:p>
               </w:tc>
@@ -5308,55 +5655,43 @@
                     <w:jc w:val="center"/>
                   </w:pPr>
                   <w:r>
-                    <w:t xml:space="preserve">Experiment 2</w:t>
-                  </w:r>
-                </w:p>
-              </w:tc>
-              <w:tc>
-                <w:tcPr/>
-                <w:p>
-                  <w:pPr>
-                    <w:pStyle w:val="Compact"/>
-                    <w:jc w:val="center"/>
-                  </w:pPr>
-                  <w:r>
-                    <w:t xml:space="preserve">Drift rate</w:t>
-                  </w:r>
-                </w:p>
-              </w:tc>
-              <w:tc>
-                <w:tcPr/>
-                <w:p>
-                  <w:pPr>
-                    <w:pStyle w:val="Compact"/>
-                    <w:jc w:val="center"/>
-                  </w:pPr>
-                  <w:r>
-                    <w:t xml:space="preserve">novel</w:t>
-                  </w:r>
-                </w:p>
-              </w:tc>
-              <w:tc>
-                <w:tcPr/>
-                <w:p>
-                  <w:pPr>
-                    <w:pStyle w:val="Compact"/>
-                    <w:jc w:val="center"/>
-                  </w:pPr>
-                  <w:r>
-                    <w:t xml:space="preserve">1.320</w:t>
-                  </w:r>
-                </w:p>
-              </w:tc>
-              <w:tc>
-                <w:tcPr/>
-                <w:p>
-                  <w:pPr>
-                    <w:pStyle w:val="Compact"/>
-                    <w:jc w:val="center"/>
-                  </w:pPr>
-                  <w:r>
-                    <w:t xml:space="preserve">[1.177, 1.468]</w:t>
+                    <w:t xml:space="preserve">Threshold</w:t>
+                  </w:r>
+                </w:p>
+              </w:tc>
+              <w:tc>
+                <w:tcPr/>
+                <w:p>
+                  <w:pPr>
+                    <w:pStyle w:val="Compact"/>
+                    <w:jc w:val="center"/>
+                  </w:pPr>
+                  <w:r>
+                    <w:t xml:space="preserve">learned</w:t>
+                  </w:r>
+                </w:p>
+              </w:tc>
+              <w:tc>
+                <w:tcPr/>
+                <w:p>
+                  <w:pPr>
+                    <w:pStyle w:val="Compact"/>
+                    <w:jc w:val="center"/>
+                  </w:pPr>
+                  <w:r>
+                    <w:t xml:space="preserve">0.35</w:t>
+                  </w:r>
+                </w:p>
+              </w:tc>
+              <w:tc>
+                <w:tcPr/>
+                <w:p>
+                  <w:pPr>
+                    <w:pStyle w:val="Compact"/>
+                    <w:jc w:val="center"/>
+                  </w:pPr>
+                  <w:r>
+                    <w:t xml:space="preserve">[0.242, 0.461]</w:t>
                   </w:r>
                 </w:p>
               </w:tc>
@@ -5370,55 +5705,43 @@
                     <w:jc w:val="center"/>
                   </w:pPr>
                   <w:r>
-                    <w:t xml:space="preserve">Experiment 2</w:t>
-                  </w:r>
-                </w:p>
-              </w:tc>
-              <w:tc>
-                <w:tcPr/>
-                <w:p>
-                  <w:pPr>
-                    <w:pStyle w:val="Compact"/>
-                    <w:jc w:val="center"/>
-                  </w:pPr>
-                  <w:r>
-                    <w:t xml:space="preserve">Drift rate</w:t>
-                  </w:r>
-                </w:p>
-              </w:tc>
-              <w:tc>
-                <w:tcPr/>
-                <w:p>
-                  <w:pPr>
-                    <w:pStyle w:val="Compact"/>
-                    <w:jc w:val="center"/>
-                  </w:pPr>
-                  <w:r>
-                    <w:t xml:space="preserve">learned</w:t>
-                  </w:r>
-                </w:p>
-              </w:tc>
-              <w:tc>
-                <w:tcPr/>
-                <w:p>
-                  <w:pPr>
-                    <w:pStyle w:val="Compact"/>
-                    <w:jc w:val="center"/>
-                  </w:pPr>
-                  <w:r>
-                    <w:t xml:space="preserve">0.222</w:t>
-                  </w:r>
-                </w:p>
-              </w:tc>
-              <w:tc>
-                <w:tcPr/>
-                <w:p>
-                  <w:pPr>
-                    <w:pStyle w:val="Compact"/>
-                    <w:jc w:val="center"/>
-                  </w:pPr>
-                  <w:r>
-                    <w:t xml:space="preserve">[0.084, 0.362]</w:t>
+                    <w:t xml:space="preserve">Threshold contrast</w:t>
+                  </w:r>
+                </w:p>
+              </w:tc>
+              <w:tc>
+                <w:tcPr/>
+                <w:p>
+                  <w:pPr>
+                    <w:pStyle w:val="Compact"/>
+                    <w:jc w:val="center"/>
+                  </w:pPr>
+                  <w:r>
+                    <w:t xml:space="preserve">novel - learned</w:t>
+                  </w:r>
+                </w:p>
+              </w:tc>
+              <w:tc>
+                <w:tcPr/>
+                <w:p>
+                  <w:pPr>
+                    <w:pStyle w:val="Compact"/>
+                    <w:jc w:val="center"/>
+                  </w:pPr>
+                  <w:r>
+                    <w:t xml:space="preserve">0.16</w:t>
+                  </w:r>
+                </w:p>
+              </w:tc>
+              <w:tc>
+                <w:tcPr/>
+                <w:p>
+                  <w:pPr>
+                    <w:pStyle w:val="Compact"/>
+                    <w:jc w:val="center"/>
+                  </w:pPr>
+                  <w:r>
+                    <w:t xml:space="preserve">[0.097, 0.215]</w:t>
                   </w:r>
                 </w:p>
               </w:tc>
@@ -5432,55 +5755,43 @@
                     <w:jc w:val="center"/>
                   </w:pPr>
                   <w:r>
-                    <w:t xml:space="preserve">Experiment 2</w:t>
-                  </w:r>
-                </w:p>
-              </w:tc>
-              <w:tc>
-                <w:tcPr/>
-                <w:p>
-                  <w:pPr>
-                    <w:pStyle w:val="Compact"/>
-                    <w:jc w:val="center"/>
-                  </w:pPr>
-                  <w:r>
-                    <w:t xml:space="preserve">Drift rate contrast</w:t>
-                  </w:r>
-                </w:p>
-              </w:tc>
-              <w:tc>
-                <w:tcPr/>
-                <w:p>
-                  <w:pPr>
-                    <w:pStyle w:val="Compact"/>
-                    <w:jc w:val="center"/>
-                  </w:pPr>
-                  <w:r>
-                    <w:t xml:space="preserve">novel - learned</w:t>
-                  </w:r>
-                </w:p>
-              </w:tc>
-              <w:tc>
-                <w:tcPr/>
-                <w:p>
-                  <w:pPr>
-                    <w:pStyle w:val="Compact"/>
-                    <w:jc w:val="center"/>
-                  </w:pPr>
-                  <w:r>
-                    <w:t xml:space="preserve">1.099</w:t>
-                  </w:r>
-                </w:p>
-              </w:tc>
-              <w:tc>
-                <w:tcPr/>
-                <w:p>
-                  <w:pPr>
-                    <w:pStyle w:val="Compact"/>
-                    <w:jc w:val="center"/>
-                  </w:pPr>
-                  <w:r>
-                    <w:t xml:space="preserve">[0.849, 1.349]</w:t>
+                    <w:t xml:space="preserve">Drift rate</w:t>
+                  </w:r>
+                </w:p>
+              </w:tc>
+              <w:tc>
+                <w:tcPr/>
+                <w:p>
+                  <w:pPr>
+                    <w:pStyle w:val="Compact"/>
+                    <w:jc w:val="center"/>
+                  </w:pPr>
+                  <w:r>
+                    <w:t xml:space="preserve">novel</w:t>
+                  </w:r>
+                </w:p>
+              </w:tc>
+              <w:tc>
+                <w:tcPr/>
+                <w:p>
+                  <w:pPr>
+                    <w:pStyle w:val="Compact"/>
+                    <w:jc w:val="center"/>
+                  </w:pPr>
+                  <w:r>
+                    <w:t xml:space="preserve">1.3</w:t>
+                  </w:r>
+                </w:p>
+              </w:tc>
+              <w:tc>
+                <w:tcPr/>
+                <w:p>
+                  <w:pPr>
+                    <w:pStyle w:val="Compact"/>
+                    <w:jc w:val="center"/>
+                  </w:pPr>
+                  <w:r>
+                    <w:t xml:space="preserve">[1.156, 1.449]</w:t>
                   </w:r>
                 </w:p>
               </w:tc>
@@ -5494,55 +5805,43 @@
                     <w:jc w:val="center"/>
                   </w:pPr>
                   <w:r>
-                    <w:t xml:space="preserve">Experiment 4</w:t>
-                  </w:r>
-                </w:p>
-              </w:tc>
-              <w:tc>
-                <w:tcPr/>
-                <w:p>
-                  <w:pPr>
-                    <w:pStyle w:val="Compact"/>
-                    <w:jc w:val="center"/>
-                  </w:pPr>
-                  <w:r>
-                    <w:t xml:space="preserve">Threshold</w:t>
-                  </w:r>
-                </w:p>
-              </w:tc>
-              <w:tc>
-                <w:tcPr/>
-                <w:p>
-                  <w:pPr>
-                    <w:pStyle w:val="Compact"/>
-                    <w:jc w:val="center"/>
-                  </w:pPr>
-                  <w:r>
-                    <w:t xml:space="preserve">novel</w:t>
-                  </w:r>
-                </w:p>
-              </w:tc>
-              <w:tc>
-                <w:tcPr/>
-                <w:p>
-                  <w:pPr>
-                    <w:pStyle w:val="Compact"/>
-                    <w:jc w:val="center"/>
-                  </w:pPr>
-                  <w:r>
-                    <w:t xml:space="preserve">0.793</w:t>
-                  </w:r>
-                </w:p>
-              </w:tc>
-              <w:tc>
-                <w:tcPr/>
-                <w:p>
-                  <w:pPr>
-                    <w:pStyle w:val="Compact"/>
-                    <w:jc w:val="center"/>
-                  </w:pPr>
-                  <w:r>
-                    <w:t xml:space="preserve">[0.717, 0.865]</w:t>
+                    <w:t xml:space="preserve">Drift rate</w:t>
+                  </w:r>
+                </w:p>
+              </w:tc>
+              <w:tc>
+                <w:tcPr/>
+                <w:p>
+                  <w:pPr>
+                    <w:pStyle w:val="Compact"/>
+                    <w:jc w:val="center"/>
+                  </w:pPr>
+                  <w:r>
+                    <w:t xml:space="preserve">learned</w:t>
+                  </w:r>
+                </w:p>
+              </w:tc>
+              <w:tc>
+                <w:tcPr/>
+                <w:p>
+                  <w:pPr>
+                    <w:pStyle w:val="Compact"/>
+                    <w:jc w:val="center"/>
+                  </w:pPr>
+                  <w:r>
+                    <w:t xml:space="preserve">0.24</w:t>
+                  </w:r>
+                </w:p>
+              </w:tc>
+              <w:tc>
+                <w:tcPr/>
+                <w:p>
+                  <w:pPr>
+                    <w:pStyle w:val="Compact"/>
+                    <w:jc w:val="center"/>
+                  </w:pPr>
+                  <w:r>
+                    <w:t xml:space="preserve">[0.094, 0.381]</w:t>
                   </w:r>
                 </w:p>
               </w:tc>
@@ -5556,62 +5855,52 @@
                     <w:jc w:val="center"/>
                   </w:pPr>
                   <w:r>
-                    <w:t xml:space="preserve">Experiment 4</w:t>
-                  </w:r>
-                </w:p>
-              </w:tc>
-              <w:tc>
-                <w:tcPr/>
-                <w:p>
-                  <w:pPr>
-                    <w:pStyle w:val="Compact"/>
-                    <w:jc w:val="center"/>
-                  </w:pPr>
-                  <w:r>
-                    <w:t xml:space="preserve">Threshold</w:t>
-                  </w:r>
-                </w:p>
-              </w:tc>
-              <w:tc>
-                <w:tcPr/>
-                <w:p>
-                  <w:pPr>
-                    <w:pStyle w:val="Compact"/>
-                    <w:jc w:val="center"/>
-                  </w:pPr>
-                  <w:r>
-                    <w:t xml:space="preserve">famous</w:t>
-                  </w:r>
-                </w:p>
-              </w:tc>
-              <w:tc>
-                <w:tcPr/>
-                <w:p>
-                  <w:pPr>
-                    <w:pStyle w:val="Compact"/>
-                    <w:jc w:val="center"/>
-                  </w:pPr>
-                  <w:r>
-                    <w:t xml:space="preserve">0.482</w:t>
-                  </w:r>
-                </w:p>
-              </w:tc>
-              <w:tc>
-                <w:tcPr/>
-                <w:p>
-                  <w:pPr>
-                    <w:pStyle w:val="Compact"/>
-                    <w:jc w:val="center"/>
-                  </w:pPr>
-                  <w:r>
-                    <w:t xml:space="preserve">[0.403, 0.556]</w:t>
+                    <w:t xml:space="preserve">Drift rate contrast</w:t>
+                  </w:r>
+                </w:p>
+              </w:tc>
+              <w:tc>
+                <w:tcPr/>
+                <w:p>
+                  <w:pPr>
+                    <w:pStyle w:val="Compact"/>
+                    <w:jc w:val="center"/>
+                  </w:pPr>
+                  <w:r>
+                    <w:t xml:space="preserve">novel - learned</w:t>
+                  </w:r>
+                </w:p>
+              </w:tc>
+              <w:tc>
+                <w:tcPr/>
+                <w:p>
+                  <w:pPr>
+                    <w:pStyle w:val="Compact"/>
+                    <w:jc w:val="center"/>
+                  </w:pPr>
+                  <w:r>
+                    <w:t xml:space="preserve">1.06</w:t>
+                  </w:r>
+                </w:p>
+              </w:tc>
+              <w:tc>
+                <w:tcPr/>
+                <w:p>
+                  <w:pPr>
+                    <w:pStyle w:val="Compact"/>
+                    <w:jc w:val="center"/>
+                  </w:pPr>
+                  <w:r>
+                    <w:t xml:space="preserve">[0.806, 1.323]</w:t>
                   </w:r>
                 </w:p>
               </w:tc>
             </w:tr>
             <w:tr>
               <w:tc>
-                <w:tcPr/>
+                <w:tcPr>
+                  <w:gridSpan w:val="4"/>
+                </w:tcPr>
                 <w:p>
                   <w:pPr>
                     <w:pStyle w:val="Compact"/>
@@ -5619,54 +5908,6 @@
                   </w:pPr>
                   <w:r>
                     <w:t xml:space="preserve">Experiment 4</w:t>
-                  </w:r>
-                </w:p>
-              </w:tc>
-              <w:tc>
-                <w:tcPr/>
-                <w:p>
-                  <w:pPr>
-                    <w:pStyle w:val="Compact"/>
-                    <w:jc w:val="center"/>
-                  </w:pPr>
-                  <w:r>
-                    <w:t xml:space="preserve">Threshold contrast</w:t>
-                  </w:r>
-                </w:p>
-              </w:tc>
-              <w:tc>
-                <w:tcPr/>
-                <w:p>
-                  <w:pPr>
-                    <w:pStyle w:val="Compact"/>
-                    <w:jc w:val="center"/>
-                  </w:pPr>
-                  <w:r>
-                    <w:t xml:space="preserve">novel - famous</w:t>
-                  </w:r>
-                </w:p>
-              </w:tc>
-              <w:tc>
-                <w:tcPr/>
-                <w:p>
-                  <w:pPr>
-                    <w:pStyle w:val="Compact"/>
-                    <w:jc w:val="center"/>
-                  </w:pPr>
-                  <w:r>
-                    <w:t xml:space="preserve">0.311</w:t>
-                  </w:r>
-                </w:p>
-              </w:tc>
-              <w:tc>
-                <w:tcPr/>
-                <w:p>
-                  <w:pPr>
-                    <w:pStyle w:val="Compact"/>
-                    <w:jc w:val="center"/>
-                  </w:pPr>
-                  <w:r>
-                    <w:t xml:space="preserve">[0.261, 0.363]</w:t>
                   </w:r>
                 </w:p>
               </w:tc>
@@ -5680,19 +5921,7 @@
                     <w:jc w:val="center"/>
                   </w:pPr>
                   <w:r>
-                    <w:t xml:space="preserve">Experiment 4</w:t>
-                  </w:r>
-                </w:p>
-              </w:tc>
-              <w:tc>
-                <w:tcPr/>
-                <w:p>
-                  <w:pPr>
-                    <w:pStyle w:val="Compact"/>
-                    <w:jc w:val="center"/>
-                  </w:pPr>
-                  <w:r>
-                    <w:t xml:space="preserve">Drift rate</w:t>
+                    <w:t xml:space="preserve">Threshold</w:t>
                   </w:r>
                 </w:p>
               </w:tc>
@@ -5716,19 +5945,19 @@
                     <w:jc w:val="center"/>
                   </w:pPr>
                   <w:r>
-                    <w:t xml:space="preserve">2.750</w:t>
-                  </w:r>
-                </w:p>
-              </w:tc>
-              <w:tc>
-                <w:tcPr/>
-                <w:p>
-                  <w:pPr>
-                    <w:pStyle w:val="Compact"/>
-                    <w:jc w:val="center"/>
-                  </w:pPr>
-                  <w:r>
-                    <w:t xml:space="preserve">[2.532, 2.976]</w:t>
+                    <w:t xml:space="preserve">0.8</w:t>
+                  </w:r>
+                </w:p>
+              </w:tc>
+              <w:tc>
+                <w:tcPr/>
+                <w:p>
+                  <w:pPr>
+                    <w:pStyle w:val="Compact"/>
+                    <w:jc w:val="center"/>
+                  </w:pPr>
+                  <w:r>
+                    <w:t xml:space="preserve">[0.713, 0.872]</w:t>
                   </w:r>
                 </w:p>
               </w:tc>
@@ -5742,19 +5971,7 @@
                     <w:jc w:val="center"/>
                   </w:pPr>
                   <w:r>
-                    <w:t xml:space="preserve">Experiment 4</w:t>
-                  </w:r>
-                </w:p>
-              </w:tc>
-              <w:tc>
-                <w:tcPr/>
-                <w:p>
-                  <w:pPr>
-                    <w:pStyle w:val="Compact"/>
-                    <w:jc w:val="center"/>
-                  </w:pPr>
-                  <w:r>
-                    <w:t xml:space="preserve">Drift rate</w:t>
+                    <w:t xml:space="preserve">Threshold</w:t>
                   </w:r>
                 </w:p>
               </w:tc>
@@ -5778,19 +5995,19 @@
                     <w:jc w:val="center"/>
                   </w:pPr>
                   <w:r>
-                    <w:t xml:space="preserve">-0.187</w:t>
-                  </w:r>
-                </w:p>
-              </w:tc>
-              <w:tc>
-                <w:tcPr/>
-                <w:p>
-                  <w:pPr>
-                    <w:pStyle w:val="Compact"/>
-                    <w:jc w:val="center"/>
-                  </w:pPr>
-                  <w:r>
-                    <w:t xml:space="preserve">[-0.39, 0.013]</w:t>
+                    <w:t xml:space="preserve">0.5</w:t>
+                  </w:r>
+                </w:p>
+              </w:tc>
+              <w:tc>
+                <w:tcPr/>
+                <w:p>
+                  <w:pPr>
+                    <w:pStyle w:val="Compact"/>
+                    <w:jc w:val="center"/>
+                  </w:pPr>
+                  <w:r>
+                    <w:t xml:space="preserve">[0.412, 0.573]</w:t>
                   </w:r>
                 </w:p>
               </w:tc>
@@ -5804,10 +6021,148 @@
                     <w:jc w:val="center"/>
                   </w:pPr>
                   <w:r>
-                    <w:t xml:space="preserve">Experiment 4</w:t>
-                  </w:r>
-                </w:p>
-              </w:tc>
+                    <w:t xml:space="preserve">Threshold contrast</w:t>
+                  </w:r>
+                </w:p>
+              </w:tc>
+              <w:tc>
+                <w:tcPr/>
+                <w:p>
+                  <w:pPr>
+                    <w:pStyle w:val="Compact"/>
+                    <w:jc w:val="center"/>
+                  </w:pPr>
+                  <w:r>
+                    <w:t xml:space="preserve">novel - famous</w:t>
+                  </w:r>
+                </w:p>
+              </w:tc>
+              <w:tc>
+                <w:tcPr/>
+                <w:p>
+                  <w:pPr>
+                    <w:pStyle w:val="Compact"/>
+                    <w:jc w:val="center"/>
+                  </w:pPr>
+                  <w:r>
+                    <w:t xml:space="preserve">0.3</w:t>
+                  </w:r>
+                </w:p>
+              </w:tc>
+              <w:tc>
+                <w:tcPr/>
+                <w:p>
+                  <w:pPr>
+                    <w:pStyle w:val="Compact"/>
+                    <w:jc w:val="center"/>
+                  </w:pPr>
+                  <w:r>
+                    <w:t xml:space="preserve">[0.248, 0.349]</w:t>
+                  </w:r>
+                </w:p>
+              </w:tc>
+            </w:tr>
+            <w:tr>
+              <w:tc>
+                <w:tcPr/>
+                <w:p>
+                  <w:pPr>
+                    <w:pStyle w:val="Compact"/>
+                    <w:jc w:val="center"/>
+                  </w:pPr>
+                  <w:r>
+                    <w:t xml:space="preserve">Drift rate</w:t>
+                  </w:r>
+                </w:p>
+              </w:tc>
+              <w:tc>
+                <w:tcPr/>
+                <w:p>
+                  <w:pPr>
+                    <w:pStyle w:val="Compact"/>
+                    <w:jc w:val="center"/>
+                  </w:pPr>
+                  <w:r>
+                    <w:t xml:space="preserve">novel</w:t>
+                  </w:r>
+                </w:p>
+              </w:tc>
+              <w:tc>
+                <w:tcPr/>
+                <w:p>
+                  <w:pPr>
+                    <w:pStyle w:val="Compact"/>
+                    <w:jc w:val="center"/>
+                  </w:pPr>
+                  <w:r>
+                    <w:t xml:space="preserve">2.76</w:t>
+                  </w:r>
+                </w:p>
+              </w:tc>
+              <w:tc>
+                <w:tcPr/>
+                <w:p>
+                  <w:pPr>
+                    <w:pStyle w:val="Compact"/>
+                    <w:jc w:val="center"/>
+                  </w:pPr>
+                  <w:r>
+                    <w:t xml:space="preserve">[2.532, 2.977]</w:t>
+                  </w:r>
+                </w:p>
+              </w:tc>
+            </w:tr>
+            <w:tr>
+              <w:tc>
+                <w:tcPr/>
+                <w:p>
+                  <w:pPr>
+                    <w:pStyle w:val="Compact"/>
+                    <w:jc w:val="center"/>
+                  </w:pPr>
+                  <w:r>
+                    <w:t xml:space="preserve">Drift rate</w:t>
+                  </w:r>
+                </w:p>
+              </w:tc>
+              <w:tc>
+                <w:tcPr/>
+                <w:p>
+                  <w:pPr>
+                    <w:pStyle w:val="Compact"/>
+                    <w:jc w:val="center"/>
+                  </w:pPr>
+                  <w:r>
+                    <w:t xml:space="preserve">famous</w:t>
+                  </w:r>
+                </w:p>
+              </w:tc>
+              <w:tc>
+                <w:tcPr/>
+                <w:p>
+                  <w:pPr>
+                    <w:pStyle w:val="Compact"/>
+                    <w:jc w:val="center"/>
+                  </w:pPr>
+                  <w:r>
+                    <w:t xml:space="preserve">-0.17</w:t>
+                  </w:r>
+                </w:p>
+              </w:tc>
+              <w:tc>
+                <w:tcPr/>
+                <w:p>
+                  <w:pPr>
+                    <w:pStyle w:val="Compact"/>
+                    <w:jc w:val="center"/>
+                  </w:pPr>
+                  <w:r>
+                    <w:t xml:space="preserve">[-0.371, 0.033]</w:t>
+                  </w:r>
+                </w:p>
+              </w:tc>
+            </w:tr>
+            <w:tr>
               <w:tc>
                 <w:tcPr/>
                 <w:p>
@@ -5840,31 +6195,47 @@
                     <w:jc w:val="center"/>
                   </w:pPr>
                   <w:r>
-                    <w:t xml:space="preserve">2.938</w:t>
-                  </w:r>
-                </w:p>
-              </w:tc>
-              <w:tc>
-                <w:tcPr/>
-                <w:p>
-                  <w:pPr>
-                    <w:pStyle w:val="Compact"/>
-                    <w:jc w:val="center"/>
-                  </w:pPr>
-                  <w:r>
-                    <w:t xml:space="preserve">[2.547, 3.335]</w:t>
+                    <w:t xml:space="preserve">2.92</w:t>
+                  </w:r>
+                </w:p>
+              </w:tc>
+              <w:tc>
+                <w:tcPr/>
+                <w:p>
+                  <w:pPr>
+                    <w:pStyle w:val="Compact"/>
+                    <w:jc w:val="center"/>
+                  </w:pPr>
+                  <w:r>
+                    <w:t xml:space="preserve">[2.528, 3.328]</w:t>
+                  </w:r>
+                </w:p>
+              </w:tc>
+            </w:tr>
+            <w:tr>
+              <w:tc>
+                <w:tcPr>
+                  <w:gridSpan w:val="4"/>
+                </w:tcPr>
+                <w:p>
+                  <w:pPr>
+                    <w:pStyle w:val="Compact"/>
+                    <w:jc w:val="center"/>
+                  </w:pPr>
+                  <w:r>
+                    <w:t xml:space="preserve">QI = quantile interval.</w:t>
                   </w:r>
                 </w:p>
               </w:tc>
             </w:tr>
           </w:tbl>
-          <w:bookmarkEnd w:id="109"/>
+          <w:bookmarkEnd w:id="110"/>
           <w:p/>
         </w:tc>
       </w:tr>
     </w:tbl>
-    <w:bookmarkEnd w:id="110"/>
-    <w:bookmarkStart w:id="111" w:name="experiment-2-1"/>
+    <w:bookmarkEnd w:id="111"/>
+    <w:bookmarkStart w:id="112" w:name="experiment-2-1"/>
     <w:p>
       <w:pPr>
         <w:pStyle w:val="Heading3"/>
@@ -5909,8 +6280,8 @@
         <w:t xml:space="preserve">Inspection of the posterior distribution shows that there is a similar familiarity effect in drift rate difference as in Experiment 1. The quality of the evidence accumulation was greater for Novel faces compared to Learned faces.</w:t>
       </w:r>
     </w:p>
-    <w:bookmarkEnd w:id="111"/>
-    <w:bookmarkStart w:id="112" w:name="experiment-3-1"/>
+    <w:bookmarkEnd w:id="112"/>
+    <w:bookmarkStart w:id="113" w:name="experiment-3-1"/>
     <w:p>
       <w:pPr>
         <w:pStyle w:val="Heading3"/>
@@ -5927,8 +6298,8 @@
         <w:t xml:space="preserve">As explained in the Methods, due to a timing artefact in data collection (responses recorded in discrete 80ms bins), the RT distributions from Experiment 3 do not meet the continuity assumptions of the LBA and we do not report model parameter estimates for this experiment.</w:t>
       </w:r>
     </w:p>
-    <w:bookmarkEnd w:id="112"/>
-    <w:bookmarkStart w:id="113" w:name="experiment-4-1"/>
+    <w:bookmarkEnd w:id="113"/>
+    <w:bookmarkStart w:id="114" w:name="experiment-4-1"/>
     <w:p>
       <w:pPr>
         <w:pStyle w:val="Heading3"/>
@@ -5973,10 +6344,10 @@
         <w:t xml:space="preserve">Inspection of the posterior distribution shows that there is a familiarity effect in drift rate difference, which mirrors the results from Experiment 1 and Experiment 2. The quality of the evidence accumulation was greater for Novel faces compared to Learned faces.</w:t>
       </w:r>
     </w:p>
-    <w:bookmarkEnd w:id="113"/>
     <w:bookmarkEnd w:id="114"/>
     <w:bookmarkEnd w:id="115"/>
-    <w:bookmarkStart w:id="120" w:name="general-discussion"/>
+    <w:bookmarkEnd w:id="116"/>
+    <w:bookmarkStart w:id="121" w:name="general-discussion"/>
     <w:p>
       <w:pPr>
         <w:pStyle w:val="Heading1"/>
@@ -6034,7 +6405,7 @@
         <w:t xml:space="preserve">.</w:t>
       </w:r>
     </w:p>
-    <w:bookmarkStart w:id="116" w:name="the-impact-of-visual-familiarity"/>
+    <w:bookmarkStart w:id="117" w:name="the-impact-of-visual-familiarity"/>
     <w:p>
       <w:pPr>
         <w:pStyle w:val="Heading2"/>
@@ -6048,7 +6419,7 @@
         <w:pStyle w:val="FirstParagraph"/>
       </w:pPr>
       <w:r>
-        <w:t xml:space="preserve">The most theoretically important finding is the combination of drift rate and threshold effects. Across Experiments 1 and 2, the novelty advantage in drift rate was substantially larger than the novelty advantage in threshold. This dissociation matters because the two parameters reflect qualitatively different aspects of the decision process. Drift rate indexes the quality of evidence accumulation — how cleanly and rapidly perceptual and cogntive systems extract decision-relevant information from a face. Threshold indexes how much accumulated evidence is required before a decision is triggered. The dominance of the drift rate effect localises familiarity’s influence to the quality of signal from the image more so than as a function of response bias between novel and familiar key presses.</w:t>
+        <w:t xml:space="preserve">The most theoretically important finding is the combination of drift rate and threshold effects. Across Experiments 1 and 2, the novelty advantage in drift rate was substantially larger than the novelty advantage in threshold. This dissociation matters because the two parameters reflect qualitatively different aspects of the decision process. Drift rate indexes the quality of evidence accumulation — how cleanly and rapidly perceptual and cognitive systems extract decision-relevant information from a face. Threshold indexes how much accumulated evidence is required before a decision is triggered. The dominance of the drift rate effect localises familiarity’s influence to the quality of signal from the image more so than as a function of response bias between novel and familiar key presses.</w:t>
       </w:r>
     </w:p>
     <w:p>
@@ -6139,8 +6510,8 @@
         <w:t xml:space="preserve">responses, and the higher threshold for the novel response is consistent with a well-documented conservative rejection bias in recognition memory [ CITE glanzerMirrorEffectRecognition1985; stretchWixtedWhyPositive1998]: participants are more willing to endorse familiarity than to endorse novelty, requiring more evidence before committing to a rejection. Because the drift rate advantage is substantially larger, the net behavioural outcome remains a novel face advantage in speed and accuracy — the signal quality benefit outweighs the response caution cost.</w:t>
       </w:r>
     </w:p>
-    <w:bookmarkEnd w:id="116"/>
-    <w:bookmarkStart w:id="117" w:name="the-impact-of-person-knowledge"/>
+    <w:bookmarkEnd w:id="117"/>
+    <w:bookmarkStart w:id="118" w:name="the-impact-of-person-knowledge"/>
     <w:p>
       <w:pPr>
         <w:pStyle w:val="Heading2"/>
@@ -6186,8 +6557,8 @@
         <w:t xml:space="preserve">At this stage, however, we remain cautious in our conclusion here and suggest that person knowledge effects on drift rate and threshold remain a largely open empirical question, which requires careful further investigation using improved and/or different stimuli, such as personally familiar people (e.g., family, friends or partners). More generally, our findings underscore that although the study of true familiarity - where person knowledge is available - is more akin to our real-world experiences of interacting with familiar people, it is inherently more difficult to study with tight experimental control (REF Burton, 2024 Encyclopedia chapter).</w:t>
       </w:r>
     </w:p>
-    <w:bookmarkEnd w:id="117"/>
-    <w:bookmarkStart w:id="118" w:name="limitations"/>
+    <w:bookmarkEnd w:id="118"/>
+    <w:bookmarkStart w:id="119" w:name="limitations"/>
     <w:p>
       <w:pPr>
         <w:pStyle w:val="Heading2"/>
@@ -6257,8 +6628,8 @@
         <w:t xml:space="preserve">, as well as a parameter recovery study that showed 90 trials per condition was sufficient to recover simulated parameters. Practical considerations were also incorporated, including the challenge of finding face stimuli with standardized low-level visual features that includes a large number of identities. Nonetheless, adding more trials per condition (e.g., 200 per condition; REF Boag et al 2025) would have increased the robustness of our parameter estimates.</w:t>
       </w:r>
     </w:p>
-    <w:bookmarkEnd w:id="118"/>
-    <w:bookmarkStart w:id="119" w:name="future-directions"/>
+    <w:bookmarkEnd w:id="119"/>
+    <w:bookmarkStart w:id="120" w:name="future-directions"/>
     <w:p>
       <w:pPr>
         <w:pStyle w:val="Heading2"/>
@@ -6298,19 +6669,173 @@
         <w:br w:type="page"/>
       </w:r>
     </w:p>
-    <w:bookmarkEnd w:id="119"/>
     <w:bookmarkEnd w:id="120"/>
-    <w:bookmarkStart w:id="246" w:name="references"/>
+    <w:bookmarkEnd w:id="121"/>
+    <w:bookmarkStart w:id="126" w:name="disclosures"/>
     <w:p>
       <w:pPr>
         <w:pStyle w:val="Heading1"/>
       </w:pPr>
       <w:r>
+        <w:t xml:space="preserve">Disclosures</w:t>
+      </w:r>
+    </w:p>
+    <w:bookmarkStart w:id="122" w:name="data-and-code-availability"/>
+    <w:p>
+      <w:pPr>
+        <w:pStyle w:val="Heading2"/>
+      </w:pPr>
+      <w:r>
+        <w:t xml:space="preserve">Data and code availability</w:t>
+      </w:r>
+    </w:p>
+    <w:p>
+      <w:pPr>
+        <w:pStyle w:val="FirstParagraph"/>
+      </w:pPr>
+      <w:r>
+        <w:t xml:space="preserve">All materials are available on GitHub (link) and the OSF (link).</w:t>
+      </w:r>
+    </w:p>
+    <w:bookmarkEnd w:id="122"/>
+    <w:bookmarkStart w:id="124" w:name="author-contributions"/>
+    <w:p>
+      <w:pPr>
+        <w:pStyle w:val="Heading2"/>
+      </w:pPr>
+      <w:r>
+        <w:t xml:space="preserve">Author contributions</w:t>
+      </w:r>
+    </w:p>
+    <w:p>
+      <w:pPr>
+        <w:pStyle w:val="FirstParagraph"/>
+      </w:pPr>
+      <w:hyperlink r:id="rId123">
+        <w:r>
+          <w:rPr>
+            <w:rStyle w:val="Hyperlink"/>
+          </w:rPr>
+          <w:t xml:space="preserve">CRediT</w:t>
+        </w:r>
+      </w:hyperlink>
+      <w:r>
+        <w:t xml:space="preserve"> </w:t>
+      </w:r>
+      <w:r>
+        <w:t xml:space="preserve">author statement:</w:t>
+      </w:r>
+    </w:p>
+    <w:p>
+      <w:pPr>
+        <w:pStyle w:val="BodyText"/>
+      </w:pPr>
+      <w:r>
+        <w:t xml:space="preserve">Conceptualization: RF, PD, RR</w:t>
+      </w:r>
+      <w:r>
+        <w:br/>
+      </w:r>
+      <w:r>
+        <w:t xml:space="preserve">Methodology: RF, RR</w:t>
+      </w:r>
+      <w:r>
+        <w:br/>
+      </w:r>
+      <w:r>
+        <w:t xml:space="preserve">Software: RF, RR</w:t>
+      </w:r>
+      <w:r>
+        <w:br/>
+      </w:r>
+      <w:r>
+        <w:t xml:space="preserve">Validation: RF, RR</w:t>
+      </w:r>
+      <w:r>
+        <w:br/>
+      </w:r>
+      <w:r>
+        <w:t xml:space="preserve">Formal analysis: RF, RR</w:t>
+      </w:r>
+      <w:r>
+        <w:br/>
+      </w:r>
+      <w:r>
+        <w:t xml:space="preserve">Investigation: RF</w:t>
+      </w:r>
+      <w:r>
+        <w:br/>
+      </w:r>
+      <w:r>
+        <w:t xml:space="preserve">Data Curation: RF, RR</w:t>
+      </w:r>
+      <w:r>
+        <w:br/>
+      </w:r>
+      <w:r>
+        <w:t xml:space="preserve">Writing - Original Draft: RF</w:t>
+      </w:r>
+      <w:r>
+        <w:br/>
+      </w:r>
+      <w:r>
+        <w:t xml:space="preserve">Writing - Review &amp; Editing: RF, PD, RR</w:t>
+      </w:r>
+      <w:r>
+        <w:br/>
+      </w:r>
+      <w:r>
+        <w:t xml:space="preserve">Visualisation: RF, RR</w:t>
+      </w:r>
+      <w:r>
+        <w:br/>
+      </w:r>
+      <w:r>
+        <w:t xml:space="preserve">Supervision: RR</w:t>
+      </w:r>
+      <w:r>
+        <w:br/>
+      </w:r>
+      <w:r>
+        <w:t xml:space="preserve">Project Administration: RF, RR</w:t>
+      </w:r>
+    </w:p>
+    <w:bookmarkEnd w:id="124"/>
+    <w:bookmarkStart w:id="125" w:name="competing-interests"/>
+    <w:p>
+      <w:pPr>
+        <w:pStyle w:val="Heading2"/>
+      </w:pPr>
+      <w:r>
+        <w:t xml:space="preserve">Competing interests</w:t>
+      </w:r>
+    </w:p>
+    <w:p>
+      <w:pPr>
+        <w:pStyle w:val="FirstParagraph"/>
+      </w:pPr>
+      <w:r>
+        <w:t xml:space="preserve">The authors declare no competing interests.</w:t>
+      </w:r>
+    </w:p>
+    <w:p>
+      <w:r>
+        <w:br w:type="page"/>
+      </w:r>
+    </w:p>
+    <w:bookmarkEnd w:id="125"/>
+    <w:bookmarkEnd w:id="126"/>
+    <w:bookmarkStart w:id="252" w:name="references"/>
+    <w:p>
+      <w:pPr>
+        <w:pStyle w:val="Heading1"/>
+      </w:pPr>
+      <w:r>
         <w:t xml:space="preserve">References</w:t>
       </w:r>
     </w:p>
-    <w:bookmarkStart w:id="245" w:name="refs"/>
-    <w:bookmarkStart w:id="122" w:name="ref-akanHaventSeenYou2023"/>
+    <w:bookmarkStart w:id="251" w:name="refs"/>
+    <w:bookmarkStart w:id="128" w:name="ref-akanHaventSeenYou2023"/>
     <w:p>
       <w:pPr>
         <w:pStyle w:val="Bibliography"/>
@@ -6343,7 +6868,7 @@
       <w:r>
         <w:t xml:space="preserve"> </w:t>
       </w:r>
-      <w:hyperlink r:id="rId121">
+      <w:hyperlink r:id="rId127">
         <w:r>
           <w:rPr>
             <w:rStyle w:val="Hyperlink"/>
@@ -6355,8 +6880,8 @@
         <w:t xml:space="preserve">.</w:t>
       </w:r>
     </w:p>
-    <w:bookmarkEnd w:id="122"/>
-    <w:bookmarkStart w:id="124" w:name="X85896da987693e22ebec463e62bb7d48d4e914f"/>
+    <w:bookmarkEnd w:id="128"/>
+    <w:bookmarkStart w:id="130" w:name="X85896da987693e22ebec463e62bb7d48d4e914f"/>
     <w:p>
       <w:pPr>
         <w:pStyle w:val="Bibliography"/>
@@ -6389,7 +6914,7 @@
       <w:r>
         <w:t xml:space="preserve"> </w:t>
       </w:r>
-      <w:hyperlink r:id="rId123">
+      <w:hyperlink r:id="rId129">
         <w:r>
           <w:rPr>
             <w:rStyle w:val="Hyperlink"/>
@@ -6401,8 +6926,8 @@
         <w:t xml:space="preserve">.</w:t>
       </w:r>
     </w:p>
-    <w:bookmarkEnd w:id="124"/>
-    <w:bookmarkStart w:id="126" w:name="X903f2de1db21121d516235683c0127697a14bc3"/>
+    <w:bookmarkEnd w:id="130"/>
+    <w:bookmarkStart w:id="132" w:name="X903f2de1db21121d516235683c0127697a14bc3"/>
     <w:p>
       <w:pPr>
         <w:pStyle w:val="Bibliography"/>
@@ -6435,7 +6960,7 @@
       <w:r>
         <w:t xml:space="preserve"> </w:t>
       </w:r>
-      <w:hyperlink r:id="rId125">
+      <w:hyperlink r:id="rId131">
         <w:r>
           <w:rPr>
             <w:rStyle w:val="Hyperlink"/>
@@ -6447,8 +6972,8 @@
         <w:t xml:space="preserve">.</w:t>
       </w:r>
     </w:p>
-    <w:bookmarkEnd w:id="126"/>
-    <w:bookmarkStart w:id="128" w:name="ref-bindemannPerceivedAbilityActual2014"/>
+    <w:bookmarkEnd w:id="132"/>
+    <w:bookmarkStart w:id="134" w:name="ref-bindemannPerceivedAbilityActual2014"/>
     <w:p>
       <w:pPr>
         <w:pStyle w:val="Bibliography"/>
@@ -6487,7 +7012,7 @@
       <w:r>
         <w:t xml:space="preserve"> </w:t>
       </w:r>
-      <w:hyperlink r:id="rId127">
+      <w:hyperlink r:id="rId133">
         <w:r>
           <w:rPr>
             <w:rStyle w:val="Hyperlink"/>
@@ -6499,8 +7024,8 @@
         <w:t xml:space="preserve">.</w:t>
       </w:r>
     </w:p>
-    <w:bookmarkEnd w:id="128"/>
-    <w:bookmarkStart w:id="130" w:name="X3769983facdfecf2c0b0ebfe44d7246b82b628c"/>
+    <w:bookmarkEnd w:id="134"/>
+    <w:bookmarkStart w:id="136" w:name="X3769983facdfecf2c0b0ebfe44d7246b82b628c"/>
     <w:p>
       <w:pPr>
         <w:pStyle w:val="Bibliography"/>
@@ -6533,7 +7058,7 @@
       <w:r>
         <w:t xml:space="preserve"> </w:t>
       </w:r>
-      <w:hyperlink r:id="rId129">
+      <w:hyperlink r:id="rId135">
         <w:r>
           <w:rPr>
             <w:rStyle w:val="Hyperlink"/>
@@ -6545,8 +7070,8 @@
         <w:t xml:space="preserve">.</w:t>
       </w:r>
     </w:p>
-    <w:bookmarkEnd w:id="130"/>
-    <w:bookmarkStart w:id="132" w:name="ref-brownSimplestCompleteModel2008"/>
+    <w:bookmarkEnd w:id="136"/>
+    <w:bookmarkStart w:id="138" w:name="ref-brownSimplestCompleteModel2008"/>
     <w:p>
       <w:pPr>
         <w:pStyle w:val="Bibliography"/>
@@ -6579,7 +7104,7 @@
       <w:r>
         <w:t xml:space="preserve"> </w:t>
       </w:r>
-      <w:hyperlink r:id="rId131">
+      <w:hyperlink r:id="rId137">
         <w:r>
           <w:rPr>
             <w:rStyle w:val="Hyperlink"/>
@@ -6591,8 +7116,8 @@
         <w:t xml:space="preserve">.</w:t>
       </w:r>
     </w:p>
-    <w:bookmarkEnd w:id="132"/>
-    <w:bookmarkStart w:id="134" w:name="Xad7bc845786705da78d095681c6c92ab13a31b0"/>
+    <w:bookmarkEnd w:id="138"/>
+    <w:bookmarkStart w:id="140" w:name="Xad7bc845786705da78d095681c6c92ab13a31b0"/>
     <w:p>
       <w:pPr>
         <w:pStyle w:val="Bibliography"/>
@@ -6625,7 +7150,7 @@
       <w:r>
         <w:t xml:space="preserve"> </w:t>
       </w:r>
-      <w:hyperlink r:id="rId133">
+      <w:hyperlink r:id="rId139">
         <w:r>
           <w:rPr>
             <w:rStyle w:val="Hyperlink"/>
@@ -6637,8 +7162,8 @@
         <w:t xml:space="preserve">.</w:t>
       </w:r>
     </w:p>
-    <w:bookmarkEnd w:id="134"/>
-    <w:bookmarkStart w:id="136" w:name="ref-brms"/>
+    <w:bookmarkEnd w:id="140"/>
+    <w:bookmarkStart w:id="142" w:name="ref-brms"/>
     <w:p>
       <w:pPr>
         <w:pStyle w:val="Bibliography"/>
@@ -6700,7 +7225,7 @@
       <w:r>
         <w:t xml:space="preserve"> </w:t>
       </w:r>
-      <w:hyperlink r:id="rId135">
+      <w:hyperlink r:id="rId141">
         <w:r>
           <w:rPr>
             <w:rStyle w:val="Hyperlink"/>
@@ -6712,8 +7237,8 @@
         <w:t xml:space="preserve">.</w:t>
       </w:r>
     </w:p>
-    <w:bookmarkEnd w:id="136"/>
-    <w:bookmarkStart w:id="138" w:name="X5d5236b79a13db78dc3046cef9bcbf8ee58462f"/>
+    <w:bookmarkEnd w:id="142"/>
+    <w:bookmarkStart w:id="144" w:name="X5d5236b79a13db78dc3046cef9bcbf8ee58462f"/>
     <w:p>
       <w:pPr>
         <w:pStyle w:val="Bibliography"/>
@@ -6746,7 +7271,7 @@
       <w:r>
         <w:t xml:space="preserve"> </w:t>
       </w:r>
-      <w:hyperlink r:id="rId137">
+      <w:hyperlink r:id="rId143">
         <w:r>
           <w:rPr>
             <w:rStyle w:val="Hyperlink"/>
@@ -6758,8 +7283,8 @@
         <w:t xml:space="preserve">.</w:t>
       </w:r>
     </w:p>
-    <w:bookmarkEnd w:id="138"/>
-    <w:bookmarkStart w:id="140" w:name="ref-donkinGettingMoreAccuracy2009"/>
+    <w:bookmarkEnd w:id="144"/>
+    <w:bookmarkStart w:id="146" w:name="ref-donkinGettingMoreAccuracy2009"/>
     <w:p>
       <w:pPr>
         <w:pStyle w:val="Bibliography"/>
@@ -6792,7 +7317,7 @@
       <w:r>
         <w:t xml:space="preserve"> </w:t>
       </w:r>
-      <w:hyperlink r:id="rId139">
+      <w:hyperlink r:id="rId145">
         <w:r>
           <w:rPr>
             <w:rStyle w:val="Hyperlink"/>
@@ -6804,8 +7329,8 @@
         <w:t xml:space="preserve">.</w:t>
       </w:r>
     </w:p>
-    <w:bookmarkEnd w:id="140"/>
-    <w:bookmarkStart w:id="142" w:name="ref-duchaineRevisedNeuralFramework2015"/>
+    <w:bookmarkEnd w:id="146"/>
+    <w:bookmarkStart w:id="148" w:name="ref-duchaineRevisedNeuralFramework2015"/>
     <w:p>
       <w:pPr>
         <w:pStyle w:val="Bibliography"/>
@@ -6838,7 +7363,7 @@
       <w:r>
         <w:t xml:space="preserve"> </w:t>
       </w:r>
-      <w:hyperlink r:id="rId141">
+      <w:hyperlink r:id="rId147">
         <w:r>
           <w:rPr>
             <w:rStyle w:val="Hyperlink"/>
@@ -6850,8 +7375,8 @@
         <w:t xml:space="preserve">.</w:t>
       </w:r>
     </w:p>
-    <w:bookmarkEnd w:id="142"/>
-    <w:bookmarkStart w:id="144" w:name="X3b31e59ab487851a9e5cc8241cb5e19f2391a24"/>
+    <w:bookmarkEnd w:id="148"/>
+    <w:bookmarkStart w:id="150" w:name="X3b31e59ab487851a9e5cc8241cb5e19f2391a24"/>
     <w:p>
       <w:pPr>
         <w:pStyle w:val="Bibliography"/>
@@ -6875,7 +7400,7 @@
       <w:r>
         <w:t xml:space="preserve"> </w:t>
       </w:r>
-      <w:hyperlink r:id="rId143">
+      <w:hyperlink r:id="rId149">
         <w:r>
           <w:rPr>
             <w:rStyle w:val="Hyperlink"/>
@@ -6887,8 +7412,8 @@
         <w:t xml:space="preserve">.</w:t>
       </w:r>
     </w:p>
-    <w:bookmarkEnd w:id="144"/>
-    <w:bookmarkStart w:id="146" w:name="ref-glanzerMirrorEffectRecognition1985"/>
+    <w:bookmarkEnd w:id="150"/>
+    <w:bookmarkStart w:id="152" w:name="ref-glanzerMirrorEffectRecognition1985"/>
     <w:p>
       <w:pPr>
         <w:pStyle w:val="Bibliography"/>
@@ -6921,7 +7446,7 @@
       <w:r>
         <w:t xml:space="preserve"> </w:t>
       </w:r>
-      <w:hyperlink r:id="rId145">
+      <w:hyperlink r:id="rId151">
         <w:r>
           <w:rPr>
             <w:rStyle w:val="Hyperlink"/>
@@ -6933,8 +7458,8 @@
         <w:t xml:space="preserve">.</w:t>
       </w:r>
     </w:p>
-    <w:bookmarkEnd w:id="146"/>
-    <w:bookmarkStart w:id="148" w:name="ref-gobbiniNeuralResponseVisual2006"/>
+    <w:bookmarkEnd w:id="152"/>
+    <w:bookmarkStart w:id="154" w:name="ref-gobbiniNeuralResponseVisual2006"/>
     <w:p>
       <w:pPr>
         <w:pStyle w:val="Bibliography"/>
@@ -6967,7 +7492,7 @@
       <w:r>
         <w:t xml:space="preserve"> </w:t>
       </w:r>
-      <w:hyperlink r:id="rId147">
+      <w:hyperlink r:id="rId153">
         <w:r>
           <w:rPr>
             <w:rStyle w:val="Hyperlink"/>
@@ -6979,8 +7504,8 @@
         <w:t xml:space="preserve">.</w:t>
       </w:r>
     </w:p>
-    <w:bookmarkEnd w:id="148"/>
-    <w:bookmarkStart w:id="150" w:name="ref-gobbiniNeuralSystemsRecognition2007"/>
+    <w:bookmarkEnd w:id="154"/>
+    <w:bookmarkStart w:id="156" w:name="ref-gobbiniNeuralSystemsRecognition2007"/>
     <w:p>
       <w:pPr>
         <w:pStyle w:val="Bibliography"/>
@@ -7013,7 +7538,7 @@
       <w:r>
         <w:t xml:space="preserve"> </w:t>
       </w:r>
-      <w:hyperlink r:id="rId149">
+      <w:hyperlink r:id="rId155">
         <w:r>
           <w:rPr>
             <w:rStyle w:val="Hyperlink"/>
@@ -7025,8 +7550,8 @@
         <w:t xml:space="preserve">.</w:t>
       </w:r>
     </w:p>
-    <w:bookmarkEnd w:id="150"/>
-    <w:bookmarkStart w:id="152" w:name="X3f170a77adcf62bec6f99bf8aeb046adf3094d6"/>
+    <w:bookmarkEnd w:id="156"/>
+    <w:bookmarkStart w:id="158" w:name="X3f170a77adcf62bec6f99bf8aeb046adf3094d6"/>
     <w:p>
       <w:pPr>
         <w:pStyle w:val="Bibliography"/>
@@ -7056,7 +7581,7 @@
       <w:r>
         <w:t xml:space="preserve"> </w:t>
       </w:r>
-      <w:hyperlink r:id="rId151">
+      <w:hyperlink r:id="rId157">
         <w:r>
           <w:rPr>
             <w:rStyle w:val="Hyperlink"/>
@@ -7068,8 +7593,8 @@
         <w:t xml:space="preserve">.</w:t>
       </w:r>
     </w:p>
-    <w:bookmarkEnd w:id="152"/>
-    <w:bookmarkStart w:id="154" w:name="X69e29b07ce704c831aa1edd3cf8b3888c71aa4c"/>
+    <w:bookmarkEnd w:id="158"/>
+    <w:bookmarkStart w:id="160" w:name="X69e29b07ce704c831aa1edd3cf8b3888c71aa4c"/>
     <w:p>
       <w:pPr>
         <w:pStyle w:val="Bibliography"/>
@@ -7102,7 +7627,7 @@
       <w:r>
         <w:t xml:space="preserve"> </w:t>
       </w:r>
-      <w:hyperlink r:id="rId153">
+      <w:hyperlink r:id="rId159">
         <w:r>
           <w:rPr>
             <w:rStyle w:val="Hyperlink"/>
@@ -7114,8 +7639,8 @@
         <w:t xml:space="preserve">.</w:t>
       </w:r>
     </w:p>
-    <w:bookmarkEnd w:id="154"/>
-    <w:bookmarkStart w:id="156" w:name="ref-haxbyDistributedHumanNeural2000"/>
+    <w:bookmarkEnd w:id="160"/>
+    <w:bookmarkStart w:id="162" w:name="ref-haxbyDistributedHumanNeural2000"/>
     <w:p>
       <w:pPr>
         <w:pStyle w:val="Bibliography"/>
@@ -7148,7 +7673,7 @@
       <w:r>
         <w:t xml:space="preserve"> </w:t>
       </w:r>
-      <w:hyperlink r:id="rId155">
+      <w:hyperlink r:id="rId161">
         <w:r>
           <w:rPr>
             <w:rStyle w:val="Hyperlink"/>
@@ -7160,8 +7685,8 @@
         <w:t xml:space="preserve">.</w:t>
       </w:r>
     </w:p>
-    <w:bookmarkEnd w:id="156"/>
-    <w:bookmarkStart w:id="158" w:name="ref-heathcoteDynamicModelsChoice2019"/>
+    <w:bookmarkEnd w:id="162"/>
+    <w:bookmarkStart w:id="164" w:name="ref-heathcoteDynamicModelsChoice2019"/>
     <w:p>
       <w:pPr>
         <w:pStyle w:val="Bibliography"/>
@@ -7194,7 +7719,7 @@
       <w:r>
         <w:t xml:space="preserve"> </w:t>
       </w:r>
-      <w:hyperlink r:id="rId157">
+      <w:hyperlink r:id="rId163">
         <w:r>
           <w:rPr>
             <w:rStyle w:val="Hyperlink"/>
@@ -7206,8 +7731,8 @@
         <w:t xml:space="preserve">.</w:t>
       </w:r>
     </w:p>
-    <w:bookmarkEnd w:id="158"/>
-    <w:bookmarkStart w:id="160" w:name="Xfa52b3ddb822705b7e657498a882a925f97b168"/>
+    <w:bookmarkEnd w:id="164"/>
+    <w:bookmarkStart w:id="166" w:name="Xfa52b3ddb822705b7e657498a882a925f97b168"/>
     <w:p>
       <w:pPr>
         <w:pStyle w:val="Bibliography"/>
@@ -7240,7 +7765,7 @@
       <w:r>
         <w:t xml:space="preserve"> </w:t>
       </w:r>
-      <w:hyperlink r:id="rId159">
+      <w:hyperlink r:id="rId165">
         <w:r>
           <w:rPr>
             <w:rStyle w:val="Hyperlink"/>
@@ -7252,8 +7777,8 @@
         <w:t xml:space="preserve">.</w:t>
       </w:r>
     </w:p>
-    <w:bookmarkEnd w:id="160"/>
-    <w:bookmarkStart w:id="162" w:name="ref-ishaiLetsFaceIt2008"/>
+    <w:bookmarkEnd w:id="166"/>
+    <w:bookmarkStart w:id="168" w:name="ref-ishaiLetsFaceIt2008"/>
     <w:p>
       <w:pPr>
         <w:pStyle w:val="Bibliography"/>
@@ -7286,7 +7811,7 @@
       <w:r>
         <w:t xml:space="preserve"> </w:t>
       </w:r>
-      <w:hyperlink r:id="rId161">
+      <w:hyperlink r:id="rId167">
         <w:r>
           <w:rPr>
             <w:rStyle w:val="Hyperlink"/>
@@ -7298,8 +7823,8 @@
         <w:t xml:space="preserve">.</w:t>
       </w:r>
     </w:p>
-    <w:bookmarkEnd w:id="162"/>
-    <w:bookmarkStart w:id="164" w:name="ref-jenkins2011"/>
+    <w:bookmarkEnd w:id="168"/>
+    <w:bookmarkStart w:id="170" w:name="ref-jenkins2011"/>
     <w:p>
       <w:pPr>
         <w:pStyle w:val="Bibliography"/>
@@ -7332,7 +7857,7 @@
       <w:r>
         <w:t xml:space="preserve"> </w:t>
       </w:r>
-      <w:hyperlink r:id="rId163">
+      <w:hyperlink r:id="rId169">
         <w:r>
           <w:rPr>
             <w:rStyle w:val="Hyperlink"/>
@@ -7344,8 +7869,8 @@
         <w:t xml:space="preserve">.</w:t>
       </w:r>
     </w:p>
-    <w:bookmarkEnd w:id="164"/>
-    <w:bookmarkStart w:id="166" w:name="ref-johnstonFamiliarUnfamiliarFace2009"/>
+    <w:bookmarkEnd w:id="170"/>
+    <w:bookmarkStart w:id="172" w:name="ref-johnstonFamiliarUnfamiliarFace2009"/>
     <w:p>
       <w:pPr>
         <w:pStyle w:val="Bibliography"/>
@@ -7378,7 +7903,7 @@
       <w:r>
         <w:t xml:space="preserve"> </w:t>
       </w:r>
-      <w:hyperlink r:id="rId165">
+      <w:hyperlink r:id="rId171">
         <w:r>
           <w:rPr>
             <w:rStyle w:val="Hyperlink"/>
@@ -7390,8 +7915,8 @@
         <w:t xml:space="preserve">.</w:t>
       </w:r>
     </w:p>
-    <w:bookmarkEnd w:id="166"/>
-    <w:bookmarkStart w:id="168" w:name="ref-johnstonAttentionCaptureNovel1990"/>
+    <w:bookmarkEnd w:id="172"/>
+    <w:bookmarkStart w:id="174" w:name="ref-johnstonAttentionCaptureNovel1990"/>
     <w:p>
       <w:pPr>
         <w:pStyle w:val="Bibliography"/>
@@ -7424,7 +7949,7 @@
       <w:r>
         <w:t xml:space="preserve"> </w:t>
       </w:r>
-      <w:hyperlink r:id="rId167">
+      <w:hyperlink r:id="rId173">
         <w:r>
           <w:rPr>
             <w:rStyle w:val="Hyperlink"/>
@@ -7436,8 +7961,8 @@
         <w:t xml:space="preserve">.</w:t>
       </w:r>
     </w:p>
-    <w:bookmarkEnd w:id="168"/>
-    <w:bookmarkStart w:id="170" w:name="X4b04494fe2515e18845820011bae7cceada381e"/>
+    <w:bookmarkEnd w:id="174"/>
+    <w:bookmarkStart w:id="176" w:name="X4b04494fe2515e18845820011bae7cceada381e"/>
     <w:p>
       <w:pPr>
         <w:pStyle w:val="Bibliography"/>
@@ -7473,7 +7998,7 @@
       <w:r>
         <w:t xml:space="preserve"> </w:t>
       </w:r>
-      <w:hyperlink r:id="rId169">
+      <w:hyperlink r:id="rId175">
         <w:r>
           <w:rPr>
             <w:rStyle w:val="Hyperlink"/>
@@ -7485,8 +8010,8 @@
         <w:t xml:space="preserve">.</w:t>
       </w:r>
     </w:p>
-    <w:bookmarkEnd w:id="170"/>
-    <w:bookmarkStart w:id="172" w:name="X70b7e0c20febb60c6d08875d72be93198b7d64a"/>
+    <w:bookmarkEnd w:id="176"/>
+    <w:bookmarkStart w:id="178" w:name="X70b7e0c20febb60c6d08875d72be93198b7d64a"/>
     <w:p>
       <w:pPr>
         <w:pStyle w:val="Bibliography"/>
@@ -7519,7 +8044,7 @@
       <w:r>
         <w:t xml:space="preserve"> </w:t>
       </w:r>
-      <w:hyperlink r:id="rId171">
+      <w:hyperlink r:id="rId177">
         <w:r>
           <w:rPr>
             <w:rStyle w:val="Hyperlink"/>
@@ -7531,8 +8056,8 @@
         <w:t xml:space="preserve">.</w:t>
       </w:r>
     </w:p>
-    <w:bookmarkEnd w:id="172"/>
-    <w:bookmarkStart w:id="174" w:name="ref-kormi-nouriNoveltyEffectSupport2005"/>
+    <w:bookmarkEnd w:id="178"/>
+    <w:bookmarkStart w:id="180" w:name="ref-kormi-nouriNoveltyEffectSupport2005"/>
     <w:p>
       <w:pPr>
         <w:pStyle w:val="Bibliography"/>
@@ -7565,7 +8090,7 @@
       <w:r>
         <w:t xml:space="preserve"> </w:t>
       </w:r>
-      <w:hyperlink r:id="rId173">
+      <w:hyperlink r:id="rId179">
         <w:r>
           <w:rPr>
             <w:rStyle w:val="Hyperlink"/>
@@ -7577,8 +8102,8 @@
         <w:t xml:space="preserve">.</w:t>
       </w:r>
     </w:p>
-    <w:bookmarkEnd w:id="174"/>
-    <w:bookmarkStart w:id="176" w:name="ref-landiFastLinkFace2021"/>
+    <w:bookmarkEnd w:id="180"/>
+    <w:bookmarkStart w:id="182" w:name="ref-landiFastLinkFace2021"/>
     <w:p>
       <w:pPr>
         <w:pStyle w:val="Bibliography"/>
@@ -7611,7 +8136,7 @@
       <w:r>
         <w:t xml:space="preserve"> </w:t>
       </w:r>
-      <w:hyperlink r:id="rId175">
+      <w:hyperlink r:id="rId181">
         <w:r>
           <w:rPr>
             <w:rStyle w:val="Hyperlink"/>
@@ -7623,8 +8148,8 @@
         <w:t xml:space="preserve">.</w:t>
       </w:r>
     </w:p>
-    <w:bookmarkEnd w:id="176"/>
-    <w:bookmarkStart w:id="178" w:name="X2d40e1fbd58e72e9f31b44eaf301e5307d132a8"/>
+    <w:bookmarkEnd w:id="182"/>
+    <w:bookmarkStart w:id="184" w:name="X2d40e1fbd58e72e9f31b44eaf301e5307d132a8"/>
     <w:p>
       <w:pPr>
         <w:pStyle w:val="Bibliography"/>
@@ -7657,7 +8182,7 @@
       <w:r>
         <w:t xml:space="preserve"> </w:t>
       </w:r>
-      <w:hyperlink r:id="rId177">
+      <w:hyperlink r:id="rId183">
         <w:r>
           <w:rPr>
             <w:rStyle w:val="Hyperlink"/>
@@ -7669,8 +8194,8 @@
         <w:t xml:space="preserve">.</w:t>
       </w:r>
     </w:p>
-    <w:bookmarkEnd w:id="178"/>
-    <w:bookmarkStart w:id="180" w:name="ref-lercheHowManyTrials2017"/>
+    <w:bookmarkEnd w:id="184"/>
+    <w:bookmarkStart w:id="186" w:name="ref-lercheHowManyTrials2017"/>
     <w:p>
       <w:pPr>
         <w:pStyle w:val="Bibliography"/>
@@ -7703,7 +8228,7 @@
       <w:r>
         <w:t xml:space="preserve"> </w:t>
       </w:r>
-      <w:hyperlink r:id="rId179">
+      <w:hyperlink r:id="rId185">
         <w:r>
           <w:rPr>
             <w:rStyle w:val="Hyperlink"/>
@@ -7715,8 +8240,8 @@
         <w:t xml:space="preserve">.</w:t>
       </w:r>
     </w:p>
-    <w:bookmarkEnd w:id="180"/>
-    <w:bookmarkStart w:id="182" w:name="ref-lev-ariEcologicalViewSelective2022"/>
+    <w:bookmarkEnd w:id="186"/>
+    <w:bookmarkStart w:id="188" w:name="ref-lev-ariEcologicalViewSelective2022"/>
     <w:p>
       <w:pPr>
         <w:pStyle w:val="Bibliography"/>
@@ -7749,7 +8274,7 @@
       <w:r>
         <w:t xml:space="preserve"> </w:t>
       </w:r>
-      <w:hyperlink r:id="rId181">
+      <w:hyperlink r:id="rId187">
         <w:r>
           <w:rPr>
             <w:rStyle w:val="Hyperlink"/>
@@ -7761,8 +8286,8 @@
         <w:t xml:space="preserve">.</w:t>
       </w:r>
     </w:p>
-    <w:bookmarkEnd w:id="182"/>
-    <w:bookmarkStart w:id="184" w:name="X12c33f143e416783d128dfd0c531a85b18ff1d9"/>
+    <w:bookmarkEnd w:id="188"/>
+    <w:bookmarkStart w:id="190" w:name="X12c33f143e416783d128dfd0c531a85b18ff1d9"/>
     <w:p>
       <w:pPr>
         <w:pStyle w:val="Bibliography"/>
@@ -7798,7 +8323,7 @@
       <w:r>
         <w:t xml:space="preserve"> </w:t>
       </w:r>
-      <w:hyperlink r:id="rId183">
+      <w:hyperlink r:id="rId189">
         <w:r>
           <w:rPr>
             <w:rStyle w:val="Hyperlink"/>
@@ -7810,8 +8335,8 @@
         <w:t xml:space="preserve">.</w:t>
       </w:r>
     </w:p>
-    <w:bookmarkEnd w:id="184"/>
-    <w:bookmarkStart w:id="186" w:name="X15ee1cdeb559b21c03a6dd839fbc1e8397a9b4c"/>
+    <w:bookmarkEnd w:id="190"/>
+    <w:bookmarkStart w:id="192" w:name="X15ee1cdeb559b21c03a6dd839fbc1e8397a9b4c"/>
     <w:p>
       <w:pPr>
         <w:pStyle w:val="Bibliography"/>
@@ -7847,7 +8372,7 @@
       <w:r>
         <w:t xml:space="preserve"> </w:t>
       </w:r>
-      <w:hyperlink r:id="rId185">
+      <w:hyperlink r:id="rId191">
         <w:r>
           <w:rPr>
             <w:rStyle w:val="Hyperlink"/>
@@ -7859,8 +8384,8 @@
         <w:t xml:space="preserve">.</w:t>
       </w:r>
     </w:p>
-    <w:bookmarkEnd w:id="186"/>
-    <w:bookmarkStart w:id="188" w:name="ref-lubowVisualSearchFunction1997"/>
+    <w:bookmarkEnd w:id="192"/>
+    <w:bookmarkStart w:id="194" w:name="ref-lubowVisualSearchFunction1997"/>
     <w:p>
       <w:pPr>
         <w:pStyle w:val="Bibliography"/>
@@ -7893,7 +8418,7 @@
       <w:r>
         <w:t xml:space="preserve"> </w:t>
       </w:r>
-      <w:hyperlink r:id="rId187">
+      <w:hyperlink r:id="rId193">
         <w:r>
           <w:rPr>
             <w:rStyle w:val="Hyperlink"/>
@@ -7905,8 +8430,8 @@
         <w:t xml:space="preserve">.</w:t>
       </w:r>
     </w:p>
-    <w:bookmarkEnd w:id="188"/>
-    <w:bookmarkStart w:id="190" w:name="Xfecf777840125aebc84cf7d8100782c92e2aaf8"/>
+    <w:bookmarkEnd w:id="194"/>
+    <w:bookmarkStart w:id="196" w:name="Xfecf777840125aebc84cf7d8100782c92e2aaf8"/>
     <w:p>
       <w:pPr>
         <w:pStyle w:val="Bibliography"/>
@@ -7939,7 +8464,7 @@
       <w:r>
         <w:t xml:space="preserve"> </w:t>
       </w:r>
-      <w:hyperlink r:id="rId189">
+      <w:hyperlink r:id="rId195">
         <w:r>
           <w:rPr>
             <w:rStyle w:val="Hyperlink"/>
@@ -7951,8 +8476,8 @@
         <w:t xml:space="preserve">.</w:t>
       </w:r>
     </w:p>
-    <w:bookmarkEnd w:id="190"/>
-    <w:bookmarkStart w:id="192" w:name="ref-muthukrishnaProblemTheory2019"/>
+    <w:bookmarkEnd w:id="196"/>
+    <w:bookmarkStart w:id="198" w:name="ref-muthukrishnaProblemTheory2019"/>
     <w:p>
       <w:pPr>
         <w:pStyle w:val="Bibliography"/>
@@ -7985,7 +8510,7 @@
       <w:r>
         <w:t xml:space="preserve"> </w:t>
       </w:r>
-      <w:hyperlink r:id="rId191">
+      <w:hyperlink r:id="rId197">
         <w:r>
           <w:rPr>
             <w:rStyle w:val="Hyperlink"/>
@@ -7997,8 +8522,8 @@
         <w:t xml:space="preserve">.</w:t>
       </w:r>
     </w:p>
-    <w:bookmarkEnd w:id="192"/>
-    <w:bookmarkStart w:id="194" w:name="ref-myersPracticalIntroductionUsing2022"/>
+    <w:bookmarkEnd w:id="198"/>
+    <w:bookmarkStart w:id="200" w:name="ref-myersPracticalIntroductionUsing2022"/>
     <w:p>
       <w:pPr>
         <w:pStyle w:val="Bibliography"/>
@@ -8031,7 +8556,7 @@
       <w:r>
         <w:t xml:space="preserve"> </w:t>
       </w:r>
-      <w:hyperlink r:id="rId193">
+      <w:hyperlink r:id="rId199">
         <w:r>
           <w:rPr>
             <w:rStyle w:val="Hyperlink"/>
@@ -8043,8 +8568,8 @@
         <w:t xml:space="preserve">.</w:t>
       </w:r>
     </w:p>
-    <w:bookmarkEnd w:id="194"/>
-    <w:bookmarkStart w:id="196" w:name="ref-natuNeuralProcessingFamiliar2011"/>
+    <w:bookmarkEnd w:id="200"/>
+    <w:bookmarkStart w:id="202" w:name="ref-natuNeuralProcessingFamiliar2011"/>
     <w:p>
       <w:pPr>
         <w:pStyle w:val="Bibliography"/>
@@ -8077,7 +8602,7 @@
       <w:r>
         <w:t xml:space="preserve"> </w:t>
       </w:r>
-      <w:hyperlink r:id="rId195">
+      <w:hyperlink r:id="rId201">
         <w:r>
           <w:rPr>
             <w:rStyle w:val="Hyperlink"/>
@@ -8089,8 +8614,8 @@
         <w:t xml:space="preserve">.</w:t>
       </w:r>
     </w:p>
-    <w:bookmarkEnd w:id="196"/>
-    <w:bookmarkStart w:id="198" w:name="ref-oberauerAddressingTheoryCrisis2019"/>
+    <w:bookmarkEnd w:id="202"/>
+    <w:bookmarkStart w:id="204" w:name="ref-oberauerAddressingTheoryCrisis2019"/>
     <w:p>
       <w:pPr>
         <w:pStyle w:val="Bibliography"/>
@@ -8123,7 +8648,7 @@
       <w:r>
         <w:t xml:space="preserve"> </w:t>
       </w:r>
-      <w:hyperlink r:id="rId197">
+      <w:hyperlink r:id="rId203">
         <w:r>
           <w:rPr>
             <w:rStyle w:val="Hyperlink"/>
@@ -8135,8 +8660,8 @@
         <w:t xml:space="preserve">.</w:t>
       </w:r>
     </w:p>
-    <w:bookmarkEnd w:id="198"/>
-    <w:bookmarkStart w:id="200" w:name="ref-palestroTutorialJointModels2018"/>
+    <w:bookmarkEnd w:id="204"/>
+    <w:bookmarkStart w:id="206" w:name="ref-palestroTutorialJointModels2018"/>
     <w:p>
       <w:pPr>
         <w:pStyle w:val="Bibliography"/>
@@ -8169,7 +8694,7 @@
       <w:r>
         <w:t xml:space="preserve"> </w:t>
       </w:r>
-      <w:hyperlink r:id="rId199">
+      <w:hyperlink r:id="rId205">
         <w:r>
           <w:rPr>
             <w:rStyle w:val="Hyperlink"/>
@@ -8181,8 +8706,8 @@
         <w:t xml:space="preserve">.</w:t>
       </w:r>
     </w:p>
-    <w:bookmarkEnd w:id="200"/>
-    <w:bookmarkStart w:id="202" w:name="ref-parker2024"/>
+    <w:bookmarkEnd w:id="206"/>
+    <w:bookmarkStart w:id="208" w:name="ref-parker2024"/>
     <w:p>
       <w:pPr>
         <w:pStyle w:val="Bibliography"/>
@@ -8215,7 +8740,7 @@
       <w:r>
         <w:t xml:space="preserve"> </w:t>
       </w:r>
-      <w:hyperlink r:id="rId201">
+      <w:hyperlink r:id="rId207">
         <w:r>
           <w:rPr>
             <w:rStyle w:val="Hyperlink"/>
@@ -8227,8 +8752,8 @@
         <w:t xml:space="preserve">.</w:t>
       </w:r>
     </w:p>
-    <w:bookmarkEnd w:id="202"/>
-    <w:bookmarkStart w:id="204" w:name="Xbbc100c68483f96c48b8662a8ebad22a1578ea2"/>
+    <w:bookmarkEnd w:id="208"/>
+    <w:bookmarkStart w:id="210" w:name="Xbbc100c68483f96c48b8662a8ebad22a1578ea2"/>
     <w:p>
       <w:pPr>
         <w:pStyle w:val="Bibliography"/>
@@ -8261,7 +8786,7 @@
       <w:r>
         <w:t xml:space="preserve"> </w:t>
       </w:r>
-      <w:hyperlink r:id="rId203">
+      <w:hyperlink r:id="rId209">
         <w:r>
           <w:rPr>
             <w:rStyle w:val="Hyperlink"/>
@@ -8273,8 +8798,8 @@
         <w:t xml:space="preserve">.</w:t>
       </w:r>
     </w:p>
-    <w:bookmarkEnd w:id="204"/>
-    <w:bookmarkStart w:id="206" w:name="ref-phillipsStateModellingFace2025"/>
+    <w:bookmarkEnd w:id="210"/>
+    <w:bookmarkStart w:id="212" w:name="ref-phillipsStateModellingFace2025"/>
     <w:p>
       <w:pPr>
         <w:pStyle w:val="Bibliography"/>
@@ -8304,7 +8829,7 @@
       <w:r>
         <w:t xml:space="preserve"> </w:t>
       </w:r>
-      <w:hyperlink r:id="rId205">
+      <w:hyperlink r:id="rId211">
         <w:r>
           <w:rPr>
             <w:rStyle w:val="Hyperlink"/>
@@ -8316,8 +8841,8 @@
         <w:t xml:space="preserve">.</w:t>
       </w:r>
     </w:p>
-    <w:bookmarkEnd w:id="206"/>
-    <w:bookmarkStart w:id="208" w:name="ref-proulxStatisticalRitualTheory2021"/>
+    <w:bookmarkEnd w:id="212"/>
+    <w:bookmarkStart w:id="214" w:name="ref-proulxStatisticalRitualTheory2021"/>
     <w:p>
       <w:pPr>
         <w:pStyle w:val="Bibliography"/>
@@ -8350,7 +8875,7 @@
       <w:r>
         <w:t xml:space="preserve"> </w:t>
       </w:r>
-      <w:hyperlink r:id="rId207">
+      <w:hyperlink r:id="rId213">
         <w:r>
           <w:rPr>
             <w:rStyle w:val="Hyperlink"/>
@@ -8362,8 +8887,8 @@
         <w:t xml:space="preserve">.</w:t>
       </w:r>
     </w:p>
-    <w:bookmarkEnd w:id="208"/>
-    <w:bookmarkStart w:id="210" w:name="ref-ramonFamiliarityMattersReview2018"/>
+    <w:bookmarkEnd w:id="214"/>
+    <w:bookmarkStart w:id="216" w:name="ref-ramonFamiliarityMattersReview2018"/>
     <w:p>
       <w:pPr>
         <w:pStyle w:val="Bibliography"/>
@@ -8396,7 +8921,7 @@
       <w:r>
         <w:t xml:space="preserve"> </w:t>
       </w:r>
-      <w:hyperlink r:id="rId209">
+      <w:hyperlink r:id="rId215">
         <w:r>
           <w:rPr>
             <w:rStyle w:val="Hyperlink"/>
@@ -8408,8 +8933,8 @@
         <w:t xml:space="preserve">.</w:t>
       </w:r>
     </w:p>
-    <w:bookmarkEnd w:id="210"/>
-    <w:bookmarkStart w:id="212" w:name="ref-rapcsakFaceRecognition2019"/>
+    <w:bookmarkEnd w:id="216"/>
+    <w:bookmarkStart w:id="218" w:name="ref-rapcsakFaceRecognition2019"/>
     <w:p>
       <w:pPr>
         <w:pStyle w:val="Bibliography"/>
@@ -8442,7 +8967,7 @@
       <w:r>
         <w:t xml:space="preserve"> </w:t>
       </w:r>
-      <w:hyperlink r:id="rId211">
+      <w:hyperlink r:id="rId217">
         <w:r>
           <w:rPr>
             <w:rStyle w:val="Hyperlink"/>
@@ -8454,8 +8979,8 @@
         <w:t xml:space="preserve">.</w:t>
       </w:r>
     </w:p>
-    <w:bookmarkEnd w:id="212"/>
-    <w:bookmarkStart w:id="214" w:name="ref-ratcliffModelingResponseTimes1998"/>
+    <w:bookmarkEnd w:id="218"/>
+    <w:bookmarkStart w:id="220" w:name="ref-ratcliffModelingResponseTimes1998"/>
     <w:p>
       <w:pPr>
         <w:pStyle w:val="Bibliography"/>
@@ -8488,7 +9013,7 @@
       <w:r>
         <w:t xml:space="preserve"> </w:t>
       </w:r>
-      <w:hyperlink r:id="rId213">
+      <w:hyperlink r:id="rId219">
         <w:r>
           <w:rPr>
             <w:rStyle w:val="Hyperlink"/>
@@ -8500,8 +9025,8 @@
         <w:t xml:space="preserve">.</w:t>
       </w:r>
     </w:p>
-    <w:bookmarkEnd w:id="214"/>
-    <w:bookmarkStart w:id="216" w:name="ref-ratcliffDiffusionDecisionModel2016"/>
+    <w:bookmarkEnd w:id="220"/>
+    <w:bookmarkStart w:id="222" w:name="ref-ratcliffDiffusionDecisionModel2016"/>
     <w:p>
       <w:pPr>
         <w:pStyle w:val="Bibliography"/>
@@ -8534,7 +9059,7 @@
       <w:r>
         <w:t xml:space="preserve"> </w:t>
       </w:r>
-      <w:hyperlink r:id="rId215">
+      <w:hyperlink r:id="rId221">
         <w:r>
           <w:rPr>
             <w:rStyle w:val="Hyperlink"/>
@@ -8546,8 +9071,8 @@
         <w:t xml:space="preserve">.</w:t>
       </w:r>
     </w:p>
-    <w:bookmarkEnd w:id="216"/>
-    <w:bookmarkStart w:id="218" w:name="ref-ratcliffEffectsAgingReaction2001"/>
+    <w:bookmarkEnd w:id="222"/>
+    <w:bookmarkStart w:id="224" w:name="ref-ratcliffEffectsAgingReaction2001"/>
     <w:p>
       <w:pPr>
         <w:pStyle w:val="Bibliography"/>
@@ -8580,7 +9105,7 @@
       <w:r>
         <w:t xml:space="preserve"> </w:t>
       </w:r>
-      <w:hyperlink r:id="rId217">
+      <w:hyperlink r:id="rId223">
         <w:r>
           <w:rPr>
             <w:rStyle w:val="Hyperlink"/>
@@ -8592,8 +9117,8 @@
         <w:t xml:space="preserve">.</w:t>
       </w:r>
     </w:p>
-    <w:bookmarkEnd w:id="218"/>
-    <w:bookmarkStart w:id="220" w:name="ref-readChangingPhotosFaces1990"/>
+    <w:bookmarkEnd w:id="224"/>
+    <w:bookmarkStart w:id="226" w:name="ref-readChangingPhotosFaces1990"/>
     <w:p>
       <w:pPr>
         <w:pStyle w:val="Bibliography"/>
@@ -8629,7 +9154,7 @@
       <w:r>
         <w:t xml:space="preserve"> </w:t>
       </w:r>
-      <w:hyperlink r:id="rId219">
+      <w:hyperlink r:id="rId225">
         <w:r>
           <w:rPr>
             <w:rStyle w:val="Hyperlink"/>
@@ -8641,8 +9166,8 @@
         <w:t xml:space="preserve">.</w:t>
       </w:r>
     </w:p>
-    <w:bookmarkEnd w:id="220"/>
-    <w:bookmarkStart w:id="222" w:name="ref-schomakerNoveltyEnhancesVisual2012"/>
+    <w:bookmarkEnd w:id="226"/>
+    <w:bookmarkStart w:id="228" w:name="ref-schomakerNoveltyEnhancesVisual2012"/>
     <w:p>
       <w:pPr>
         <w:pStyle w:val="Bibliography"/>
@@ -8675,7 +9200,7 @@
       <w:r>
         <w:t xml:space="preserve"> </w:t>
       </w:r>
-      <w:hyperlink r:id="rId221">
+      <w:hyperlink r:id="rId227">
         <w:r>
           <w:rPr>
             <w:rStyle w:val="Hyperlink"/>
@@ -8687,8 +9212,8 @@
         <w:t xml:space="preserve">.</w:t>
       </w:r>
     </w:p>
-    <w:bookmarkEnd w:id="222"/>
-    <w:bookmarkStart w:id="224" w:name="Xe75dc92e832917d7b0a8bd8823c927a72b52b4e"/>
+    <w:bookmarkEnd w:id="228"/>
+    <w:bookmarkStart w:id="230" w:name="Xe75dc92e832917d7b0a8bd8823c927a72b52b4e"/>
     <w:p>
       <w:pPr>
         <w:pStyle w:val="Bibliography"/>
@@ -8724,7 +9249,7 @@
       <w:r>
         <w:t xml:space="preserve"> </w:t>
       </w:r>
-      <w:hyperlink r:id="rId223">
+      <w:hyperlink r:id="rId229">
         <w:r>
           <w:rPr>
             <w:rStyle w:val="Hyperlink"/>
@@ -8736,8 +9261,8 @@
         <w:t xml:space="preserve">.</w:t>
       </w:r>
     </w:p>
-    <w:bookmarkEnd w:id="224"/>
-    <w:bookmarkStart w:id="226" w:name="X8169f5a5c52f9b2ab1fb6721aa82db700e1697d"/>
+    <w:bookmarkEnd w:id="230"/>
+    <w:bookmarkStart w:id="232" w:name="X8169f5a5c52f9b2ab1fb6721aa82db700e1697d"/>
     <w:p>
       <w:pPr>
         <w:pStyle w:val="Bibliography"/>
@@ -8770,7 +9295,7 @@
       <w:r>
         <w:t xml:space="preserve"> </w:t>
       </w:r>
-      <w:hyperlink r:id="rId225">
+      <w:hyperlink r:id="rId231">
         <w:r>
           <w:rPr>
             <w:rStyle w:val="Hyperlink"/>
@@ -8782,8 +9307,8 @@
         <w:t xml:space="preserve">.</w:t>
       </w:r>
     </w:p>
-    <w:bookmarkEnd w:id="226"/>
-    <w:bookmarkStart w:id="228" w:name="X0d6618003d28a1539898287bbc575a0d4356d23"/>
+    <w:bookmarkEnd w:id="232"/>
+    <w:bookmarkStart w:id="234" w:name="X0d6618003d28a1539898287bbc575a0d4356d23"/>
     <w:p>
       <w:pPr>
         <w:pStyle w:val="Bibliography"/>
@@ -8816,7 +9341,7 @@
       <w:r>
         <w:t xml:space="preserve"> </w:t>
       </w:r>
-      <w:hyperlink r:id="rId227">
+      <w:hyperlink r:id="rId233">
         <w:r>
           <w:rPr>
             <w:rStyle w:val="Hyperlink"/>
@@ -8828,8 +9353,8 @@
         <w:t xml:space="preserve">.</w:t>
       </w:r>
     </w:p>
-    <w:bookmarkEnd w:id="228"/>
-    <w:bookmarkStart w:id="230" w:name="ref-simonsConstraintsGeneralityCOG2017"/>
+    <w:bookmarkEnd w:id="234"/>
+    <w:bookmarkStart w:id="236" w:name="ref-simonsConstraintsGeneralityCOG2017"/>
     <w:p>
       <w:pPr>
         <w:pStyle w:val="Bibliography"/>
@@ -8862,7 +9387,7 @@
       <w:r>
         <w:t xml:space="preserve"> </w:t>
       </w:r>
-      <w:hyperlink r:id="rId229">
+      <w:hyperlink r:id="rId235">
         <w:r>
           <w:rPr>
             <w:rStyle w:val="Hyperlink"/>
@@ -8874,8 +9399,8 @@
         <w:t xml:space="preserve">.</w:t>
       </w:r>
     </w:p>
-    <w:bookmarkEnd w:id="230"/>
-    <w:bookmarkStart w:id="232" w:name="ref-EMC2"/>
+    <w:bookmarkEnd w:id="236"/>
+    <w:bookmarkStart w:id="238" w:name="ref-EMC2"/>
     <w:p>
       <w:pPr>
         <w:pStyle w:val="Bibliography"/>
@@ -8892,7 +9417,7 @@
       <w:r>
         <w:t xml:space="preserve"> </w:t>
       </w:r>
-      <w:hyperlink r:id="rId231">
+      <w:hyperlink r:id="rId237">
         <w:r>
           <w:rPr>
             <w:rStyle w:val="Hyperlink"/>
@@ -8904,8 +9429,8 @@
         <w:t xml:space="preserve">.</w:t>
       </w:r>
     </w:p>
-    <w:bookmarkEnd w:id="232"/>
-    <w:bookmarkStart w:id="234" w:name="ref-GIMP"/>
+    <w:bookmarkEnd w:id="238"/>
+    <w:bookmarkStart w:id="240" w:name="ref-GIMP"/>
     <w:p>
       <w:pPr>
         <w:pStyle w:val="Bibliography"/>
@@ -8922,7 +9447,7 @@
       <w:r>
         <w:t xml:space="preserve"> </w:t>
       </w:r>
-      <w:hyperlink r:id="rId233">
+      <w:hyperlink r:id="rId239">
         <w:r>
           <w:rPr>
             <w:rStyle w:val="Hyperlink"/>
@@ -8934,8 +9459,8 @@
         <w:t xml:space="preserve">.</w:t>
       </w:r>
     </w:p>
-    <w:bookmarkEnd w:id="234"/>
-    <w:bookmarkStart w:id="236" w:name="ref-tulvingNoveltyAssessmentBrain1995"/>
+    <w:bookmarkEnd w:id="240"/>
+    <w:bookmarkStart w:id="242" w:name="ref-tulvingNoveltyAssessmentBrain1995"/>
     <w:p>
       <w:pPr>
         <w:pStyle w:val="Bibliography"/>
@@ -8968,7 +9493,7 @@
       <w:r>
         <w:t xml:space="preserve"> </w:t>
       </w:r>
-      <w:hyperlink r:id="rId235">
+      <w:hyperlink r:id="rId241">
         <w:r>
           <w:rPr>
             <w:rStyle w:val="Hyperlink"/>
@@ -8980,8 +9505,8 @@
         <w:t xml:space="preserve">.</w:t>
       </w:r>
     </w:p>
-    <w:bookmarkEnd w:id="236"/>
-    <w:bookmarkStart w:id="238" w:name="ref-voDeepLatentVariable2024"/>
+    <w:bookmarkEnd w:id="242"/>
+    <w:bookmarkStart w:id="244" w:name="ref-voDeepLatentVariable2024"/>
     <w:p>
       <w:pPr>
         <w:pStyle w:val="Bibliography"/>
@@ -9011,7 +9536,7 @@
       <w:r>
         <w:t xml:space="preserve"> </w:t>
       </w:r>
-      <w:hyperlink r:id="rId237">
+      <w:hyperlink r:id="rId243">
         <w:r>
           <w:rPr>
             <w:rStyle w:val="Hyperlink"/>
@@ -9023,8 +9548,8 @@
         <w:t xml:space="preserve">.</w:t>
       </w:r>
     </w:p>
-    <w:bookmarkEnd w:id="238"/>
-    <w:bookmarkStart w:id="240" w:name="X8ee45e5be2bbd8590a48be764294600478f647e"/>
+    <w:bookmarkEnd w:id="244"/>
+    <w:bookmarkStart w:id="246" w:name="X8ee45e5be2bbd8590a48be764294600478f647e"/>
     <w:p>
       <w:pPr>
         <w:pStyle w:val="Bibliography"/>
@@ -9057,7 +9582,7 @@
       <w:r>
         <w:t xml:space="preserve"> </w:t>
       </w:r>
-      <w:hyperlink r:id="rId239">
+      <w:hyperlink r:id="rId245">
         <w:r>
           <w:rPr>
             <w:rStyle w:val="Hyperlink"/>
@@ -9069,8 +9594,8 @@
         <w:t xml:space="preserve">.</w:t>
       </w:r>
     </w:p>
-    <w:bookmarkEnd w:id="240"/>
-    <w:bookmarkStart w:id="242" w:name="ref-yarkoniGeneralizabilityCrisis2022"/>
+    <w:bookmarkEnd w:id="246"/>
+    <w:bookmarkStart w:id="248" w:name="ref-yarkoniGeneralizabilityCrisis2022"/>
     <w:p>
       <w:pPr>
         <w:pStyle w:val="Bibliography"/>
@@ -9103,7 +9628,7 @@
       <w:r>
         <w:t xml:space="preserve"> </w:t>
       </w:r>
-      <w:hyperlink r:id="rId241">
+      <w:hyperlink r:id="rId247">
         <w:r>
           <w:rPr>
             <w:rStyle w:val="Hyperlink"/>
@@ -9115,8 +9640,8 @@
         <w:t xml:space="preserve">.</w:t>
       </w:r>
     </w:p>
-    <w:bookmarkEnd w:id="242"/>
-    <w:bookmarkStart w:id="244" w:name="ref-youngAreWeFace2018"/>
+    <w:bookmarkEnd w:id="248"/>
+    <w:bookmarkStart w:id="250" w:name="ref-youngAreWeFace2018"/>
     <w:p>
       <w:pPr>
         <w:pStyle w:val="Bibliography"/>
@@ -9149,7 +9674,7 @@
       <w:r>
         <w:t xml:space="preserve"> </w:t>
       </w:r>
-      <w:hyperlink r:id="rId243">
+      <w:hyperlink r:id="rId249">
         <w:r>
           <w:rPr>
             <w:rStyle w:val="Hyperlink"/>
@@ -9161,9 +9686,9 @@
         <w:t xml:space="preserve">.</w:t>
       </w:r>
     </w:p>
-    <w:bookmarkEnd w:id="244"/>
-    <w:bookmarkEnd w:id="245"/>
-    <w:bookmarkEnd w:id="246"/>
+    <w:bookmarkEnd w:id="250"/>
+    <w:bookmarkEnd w:id="251"/>
+    <w:bookmarkEnd w:id="252"/>
     <w:sectPr>
       <w:footnotePr>
         <w:numRestart w:val="eachSect"/>
@@ -9274,8 +9799,150 @@
       </w:pPr>
     </w:lvl>
   </w:abstractNum>
+  <w:abstractNum w:abstractNumId="991">
+    <w:nsid w:val="0000A991"/>
+    <w:multiLevelType w:val="multilevel"/>
+    <w:lvl w:ilvl="0">
+      <w:numFmt w:val="bullet"/>
+      <w:lvlText w:val=""/>
+      <w:lvlJc w:val="left"/>
+      <w:pPr>
+        <w:ind w:left="720" w:hanging="360"/>
+      </w:pPr>
+      <w:rPr>
+        <w:rFonts w:ascii="Symbol" w:hAnsi="Symbol" w:cs="Symbol" w:hint="default"/>
+      </w:rPr>
+    </w:lvl>
+    <w:lvl w:ilvl="1">
+      <w:numFmt w:val="bullet"/>
+      <w:lvlText w:val="o"/>
+      <w:lvlJc w:val="left"/>
+      <w:pPr>
+        <w:ind w:left="1440" w:hanging="360"/>
+      </w:pPr>
+      <w:rPr>
+        <w:rFonts w:ascii="Courier New" w:hAnsi="Courier New" w:cs="Courier New" w:hint="default"/>
+      </w:rPr>
+    </w:lvl>
+    <w:lvl w:ilvl="2">
+      <w:numFmt w:val="bullet"/>
+      <w:lvlText w:val=""/>
+      <w:lvlJc w:val="left"/>
+      <w:pPr>
+        <w:ind w:left="2160" w:hanging="360"/>
+      </w:pPr>
+      <w:rPr>
+        <w:rFonts w:ascii="Wingdings" w:hAnsi="Wingdings" w:cs="Wingdings" w:hint="default"/>
+      </w:rPr>
+    </w:lvl>
+    <w:lvl w:ilvl="3">
+      <w:numFmt w:val="bullet"/>
+      <w:lvlText w:val=""/>
+      <w:lvlJc w:val="left"/>
+      <w:pPr>
+        <w:ind w:left="2880" w:hanging="360"/>
+      </w:pPr>
+      <w:rPr>
+        <w:rFonts w:ascii="Symbol" w:hAnsi="Symbol" w:cs="Symbol" w:hint="default"/>
+      </w:rPr>
+    </w:lvl>
+    <w:lvl w:ilvl="4">
+      <w:numFmt w:val="bullet"/>
+      <w:lvlText w:val="o"/>
+      <w:lvlJc w:val="left"/>
+      <w:pPr>
+        <w:ind w:left="3600" w:hanging="360"/>
+      </w:pPr>
+      <w:rPr>
+        <w:rFonts w:ascii="Courier New" w:hAnsi="Courier New" w:cs="Courier New" w:hint="default"/>
+      </w:rPr>
+    </w:lvl>
+    <w:lvl w:ilvl="5">
+      <w:numFmt w:val="bullet"/>
+      <w:lvlText w:val=""/>
+      <w:lvlJc w:val="left"/>
+      <w:pPr>
+        <w:ind w:left="4320" w:hanging="360"/>
+      </w:pPr>
+      <w:rPr>
+        <w:rFonts w:ascii="Wingdings" w:hAnsi="Wingdings" w:cs="Wingdings" w:hint="default"/>
+      </w:rPr>
+    </w:lvl>
+    <w:lvl w:ilvl="6">
+      <w:numFmt w:val="bullet"/>
+      <w:lvlText w:val=""/>
+      <w:lvlJc w:val="left"/>
+      <w:pPr>
+        <w:ind w:left="5040" w:hanging="360"/>
+      </w:pPr>
+      <w:rPr>
+        <w:rFonts w:ascii="Symbol" w:hAnsi="Symbol" w:cs="Symbol" w:hint="default"/>
+      </w:rPr>
+    </w:lvl>
+    <w:lvl w:ilvl="7">
+      <w:numFmt w:val="bullet"/>
+      <w:lvlText w:val="o"/>
+      <w:lvlJc w:val="left"/>
+      <w:pPr>
+        <w:ind w:left="5760" w:hanging="360"/>
+      </w:pPr>
+      <w:rPr>
+        <w:rFonts w:ascii="Courier New" w:hAnsi="Courier New" w:cs="Courier New" w:hint="default"/>
+      </w:rPr>
+    </w:lvl>
+    <w:lvl w:ilvl="8">
+      <w:numFmt w:val="bullet"/>
+      <w:lvlText w:val=""/>
+      <w:lvlJc w:val="left"/>
+      <w:pPr>
+        <w:ind w:left="6480" w:hanging="360"/>
+      </w:pPr>
+      <w:rPr>
+        <w:rFonts w:ascii="Wingdings" w:hAnsi="Wingdings" w:cs="Wingdings" w:hint="default"/>
+      </w:rPr>
+    </w:lvl>
+  </w:abstractNum>
   <w:num w:numId="1000">
     <w:abstractNumId w:val="990"/>
+  </w:num>
+  <w:num w:numId="1001">
+    <w:abstractNumId w:val="991"/>
+  </w:num>
+  <w:num w:numId="1002">
+    <w:abstractNumId w:val="991"/>
+  </w:num>
+  <w:num w:numId="1003">
+    <w:abstractNumId w:val="991"/>
+  </w:num>
+  <w:num w:numId="1004">
+    <w:abstractNumId w:val="991"/>
+  </w:num>
+  <w:num w:numId="1005">
+    <w:abstractNumId w:val="991"/>
+  </w:num>
+  <w:num w:numId="1006">
+    <w:abstractNumId w:val="991"/>
+  </w:num>
+  <w:num w:numId="1007">
+    <w:abstractNumId w:val="991"/>
+  </w:num>
+  <w:num w:numId="1008">
+    <w:abstractNumId w:val="991"/>
+  </w:num>
+  <w:num w:numId="1009">
+    <w:abstractNumId w:val="991"/>
+  </w:num>
+  <w:num w:numId="1010">
+    <w:abstractNumId w:val="991"/>
+  </w:num>
+  <w:num w:numId="1011">
+    <w:abstractNumId w:val="991"/>
+  </w:num>
+  <w:num w:numId="1012">
+    <w:abstractNumId w:val="991"/>
+  </w:num>
+  <w:num w:numId="1013">
+    <w:abstractNumId w:val="991"/>
   </w:num>
 </w:numbering>
 </file>

</xml_diff>

<commit_message>
added raw data for exp1. added new material in supps. Changed figs from pdf to png.
</commit_message>
<xml_diff>
--- a/docs/manuscript/manuscript.docx
+++ b/docs/manuscript/manuscript.docx
@@ -39,7 +39,7 @@
         <w:pStyle w:val="Date"/>
       </w:pPr>
       <w:r>
-        <w:t xml:space="preserve">2026-03-25</w:t>
+        <w:t xml:space="preserve">2026-03-26</w:t>
       </w:r>
     </w:p>
     <w:p>
@@ -403,7 +403,7 @@
               <w:jc w:val="center"/>
             </w:pPr>
             <w:pPr>
-              <w:jc w:val="left"/>
+              <w:jc w:val="start"/>
               <w:spacing w:before="200"/>
               <w:pStyle w:val="ImageCaption"/>
             </w:pPr>
@@ -446,7 +446,7 @@
               <w:jc w:val="center"/>
             </w:pPr>
             <w:pPr>
-              <w:jc w:val="left"/>
+              <w:jc w:val="start"/>
               <w:spacing w:before="200"/>
               <w:pStyle w:val="ImageCaption"/>
             </w:pPr>
@@ -763,7 +763,7 @@
               <w:jc w:val="center"/>
             </w:pPr>
             <w:pPr>
-              <w:jc w:val="left"/>
+              <w:jc w:val="start"/>
               <w:spacing w:before="200"/>
               <w:pStyle w:val="ImageCaption"/>
             </w:pPr>
@@ -1358,7 +1358,7 @@
               <w:jc w:val="center"/>
             </w:pPr>
             <w:pPr>
-              <w:jc w:val="left"/>
+              <w:jc w:val="start"/>
               <w:spacing w:before="200"/>
               <w:pStyle w:val="ImageCaption"/>
             </w:pPr>
@@ -2377,7 +2377,7 @@
               <w:jc w:val="center"/>
             </w:pPr>
             <w:pPr>
-              <w:jc w:val="left"/>
+              <w:jc w:val="start"/>
               <w:spacing w:before="200"/>
               <w:pStyle w:val="ImageCaption"/>
             </w:pPr>
@@ -2935,7 +2935,7 @@
               <w:jc w:val="center"/>
             </w:pPr>
             <w:pPr>
-              <w:jc w:val="left"/>
+              <w:jc w:val="start"/>
               <w:spacing w:before="200"/>
               <w:pStyle w:val="ImageCaption"/>
             </w:pPr>
@@ -3157,7 +3157,7 @@
               <w:jc w:val="center"/>
             </w:pPr>
             <w:pPr>
-              <w:jc w:val="left"/>
+              <w:jc w:val="start"/>
               <w:spacing w:before="200"/>
               <w:pStyle w:val="ImageCaption"/>
             </w:pPr>
@@ -3731,7 +3731,7 @@
               <w:jc w:val="center"/>
             </w:pPr>
             <w:pPr>
-              <w:jc w:val="left"/>
+              <w:jc w:val="start"/>
               <w:spacing w:before="200"/>
               <w:pStyle w:val="ImageCaption"/>
             </w:pPr>
@@ -4445,7 +4445,7 @@
                     <w:jc w:val="left"/>
                   </w:pPr>
                   <w:pPr>
-                    <w:jc w:val="left"/>
+                    <w:jc w:val="start"/>
                     <w:spacing w:before="200"/>
                     <w:pStyle w:val="ImageCaption"/>
                   </w:pPr>
@@ -4548,7 +4548,7 @@
                     <w:jc w:val="left"/>
                   </w:pPr>
                   <w:pPr>
-                    <w:jc w:val="left"/>
+                    <w:jc w:val="start"/>
                     <w:spacing w:before="200"/>
                     <w:pStyle w:val="ImageCaption"/>
                   </w:pPr>
@@ -4644,7 +4644,7 @@
               <w:jc w:val="center"/>
             </w:pPr>
             <w:pPr>
-              <w:jc w:val="left"/>
+              <w:jc w:val="start"/>
               <w:spacing w:before="200"/>
               <w:pStyle w:val="ImageCaption"/>
             </w:pPr>
@@ -4833,7 +4833,7 @@
                     <w:jc w:val="left"/>
                   </w:pPr>
                   <w:pPr>
-                    <w:jc w:val="left"/>
+                    <w:jc w:val="start"/>
                     <w:spacing w:before="200"/>
                     <w:pStyle w:val="ImageCaption"/>
                   </w:pPr>
@@ -4918,7 +4918,7 @@
                     <w:jc w:val="left"/>
                   </w:pPr>
                   <w:pPr>
-                    <w:jc w:val="left"/>
+                    <w:jc w:val="start"/>
                     <w:spacing w:before="200"/>
                     <w:pStyle w:val="ImageCaption"/>
                   </w:pPr>
@@ -5049,7 +5049,7 @@
                     <w:jc w:val="left"/>
                   </w:pPr>
                   <w:pPr>
-                    <w:jc w:val="left"/>
+                    <w:jc w:val="start"/>
                     <w:spacing w:before="200"/>
                     <w:pStyle w:val="ImageCaption"/>
                   </w:pPr>
@@ -5134,7 +5134,7 @@
                     <w:jc w:val="left"/>
                   </w:pPr>
                   <w:pPr>
-                    <w:jc w:val="left"/>
+                    <w:jc w:val="start"/>
                     <w:spacing w:before="200"/>
                     <w:pStyle w:val="ImageCaption"/>
                   </w:pPr>
@@ -5190,7 +5190,7 @@
               <w:jc w:val="center"/>
             </w:pPr>
             <w:pPr>
-              <w:jc w:val="left"/>
+              <w:jc w:val="start"/>
               <w:spacing w:before="200"/>
               <w:pStyle w:val="ImageCaption"/>
             </w:pPr>

</xml_diff>

<commit_message>
updated models, effects and manuscript to reflect map=TRUE and consistent iters=N.
</commit_message>
<xml_diff>
--- a/docs/manuscript/manuscript.docx
+++ b/docs/manuscript/manuscript.docx
@@ -39,7 +39,7 @@
         <w:pStyle w:val="Date"/>
       </w:pPr>
       <w:r>
-        <w:t xml:space="preserve">2026-03-26</w:t>
+        <w:t xml:space="preserve">2026-04-08</w:t>
       </w:r>
     </w:p>
     <w:p>
@@ -4762,7 +4762,7 @@
         <w:pStyle w:val="FirstParagraph"/>
       </w:pPr>
       <w:r>
-        <w:t xml:space="preserve">For all experiments, posterior distributions for drift rate and threshold parameters are visulaised in</w:t>
+        <w:t xml:space="preserve">For all experiments, posterior distributions for drift rate and threshold parameters are visualised in</w:t>
       </w:r>
       <w:r>
         <w:t xml:space="preserve"> </w:t>
@@ -5404,19 +5404,19 @@
                     <w:jc w:val="center"/>
                   </w:pPr>
                   <w:r>
-                    <w:t xml:space="preserve">0.2</w:t>
-                  </w:r>
-                </w:p>
-              </w:tc>
-              <w:tc>
-                <w:tcPr/>
-                <w:p>
-                  <w:pPr>
-                    <w:pStyle w:val="Compact"/>
-                    <w:jc w:val="center"/>
-                  </w:pPr>
-                  <w:r>
-                    <w:t xml:space="preserve">[0.061, 0.333]</w:t>
+                    <w:t xml:space="preserve">1.45</w:t>
+                  </w:r>
+                </w:p>
+              </w:tc>
+              <w:tc>
+                <w:tcPr/>
+                <w:p>
+                  <w:pPr>
+                    <w:pStyle w:val="Compact"/>
+                    <w:jc w:val="center"/>
+                  </w:pPr>
+                  <w:r>
+                    <w:t xml:space="preserve">[1.278, 1.628]</w:t>
                   </w:r>
                 </w:p>
               </w:tc>
@@ -5454,19 +5454,19 @@
                     <w:jc w:val="center"/>
                   </w:pPr>
                   <w:r>
-                    <w:t xml:space="preserve">0.12</w:t>
-                  </w:r>
-                </w:p>
-              </w:tc>
-              <w:tc>
-                <w:tcPr/>
-                <w:p>
-                  <w:pPr>
-                    <w:pStyle w:val="Compact"/>
-                    <w:jc w:val="center"/>
-                  </w:pPr>
-                  <w:r>
-                    <w:t xml:space="preserve">[-0.027, 0.256]</w:t>
+                    <w:t xml:space="preserve">1.33</w:t>
+                  </w:r>
+                </w:p>
+              </w:tc>
+              <w:tc>
+                <w:tcPr/>
+                <w:p>
+                  <w:pPr>
+                    <w:pStyle w:val="Compact"/>
+                    <w:jc w:val="center"/>
+                  </w:pPr>
+                  <w:r>
+                    <w:t xml:space="preserve">[1.163, 1.5]</w:t>
                   </w:r>
                 </w:p>
               </w:tc>
@@ -5504,19 +5504,19 @@
                     <w:jc w:val="center"/>
                   </w:pPr>
                   <w:r>
-                    <w:t xml:space="preserve">0.08</w:t>
-                  </w:r>
-                </w:p>
-              </w:tc>
-              <w:tc>
-                <w:tcPr/>
-                <w:p>
-                  <w:pPr>
-                    <w:pStyle w:val="Compact"/>
-                    <w:jc w:val="center"/>
-                  </w:pPr>
-                  <w:r>
-                    <w:t xml:space="preserve">[0.017, 0.148]</w:t>
+                    <w:t xml:space="preserve">0.12</w:t>
+                  </w:r>
+                </w:p>
+              </w:tc>
+              <w:tc>
+                <w:tcPr/>
+                <w:p>
+                  <w:pPr>
+                    <w:pStyle w:val="Compact"/>
+                    <w:jc w:val="center"/>
+                  </w:pPr>
+                  <w:r>
+                    <w:t xml:space="preserve">[0.022, 0.219]</w:t>
                   </w:r>
                 </w:p>
               </w:tc>
@@ -5720,19 +5720,19 @@
                     <w:jc w:val="center"/>
                   </w:pPr>
                   <w:r>
-                    <w:t xml:space="preserve">0.51</w:t>
-                  </w:r>
-                </w:p>
-              </w:tc>
-              <w:tc>
-                <w:tcPr/>
-                <w:p>
-                  <w:pPr>
-                    <w:pStyle w:val="Compact"/>
-                    <w:jc w:val="center"/>
-                  </w:pPr>
-                  <w:r>
-                    <w:t xml:space="preserve">[0.402, 0.613]</w:t>
+                    <w:t xml:space="preserve">1.82</w:t>
+                  </w:r>
+                </w:p>
+              </w:tc>
+              <w:tc>
+                <w:tcPr/>
+                <w:p>
+                  <w:pPr>
+                    <w:pStyle w:val="Compact"/>
+                    <w:jc w:val="center"/>
+                  </w:pPr>
+                  <w:r>
+                    <w:t xml:space="preserve">[1.639, 2.013]</w:t>
                   </w:r>
                 </w:p>
               </w:tc>
@@ -5770,19 +5770,19 @@
                     <w:jc w:val="center"/>
                   </w:pPr>
                   <w:r>
-                    <w:t xml:space="preserve">0.35</w:t>
-                  </w:r>
-                </w:p>
-              </w:tc>
-              <w:tc>
-                <w:tcPr/>
-                <w:p>
-                  <w:pPr>
-                    <w:pStyle w:val="Compact"/>
-                    <w:jc w:val="center"/>
-                  </w:pPr>
-                  <w:r>
-                    <w:t xml:space="preserve">[0.242, 0.461]</w:t>
+                    <w:t xml:space="preserve">1.49</w:t>
+                  </w:r>
+                </w:p>
+              </w:tc>
+              <w:tc>
+                <w:tcPr/>
+                <w:p>
+                  <w:pPr>
+                    <w:pStyle w:val="Compact"/>
+                    <w:jc w:val="center"/>
+                  </w:pPr>
+                  <w:r>
+                    <w:t xml:space="preserve">[1.331, 1.664]</w:t>
                   </w:r>
                 </w:p>
               </w:tc>
@@ -5820,19 +5820,19 @@
                     <w:jc w:val="center"/>
                   </w:pPr>
                   <w:r>
-                    <w:t xml:space="preserve">0.16</w:t>
-                  </w:r>
-                </w:p>
-              </w:tc>
-              <w:tc>
-                <w:tcPr/>
-                <w:p>
-                  <w:pPr>
-                    <w:pStyle w:val="Compact"/>
-                    <w:jc w:val="center"/>
-                  </w:pPr>
-                  <w:r>
-                    <w:t xml:space="preserve">[0.097, 0.215]</w:t>
+                    <w:t xml:space="preserve">0.33</w:t>
+                  </w:r>
+                </w:p>
+              </w:tc>
+              <w:tc>
+                <w:tcPr/>
+                <w:p>
+                  <w:pPr>
+                    <w:pStyle w:val="Compact"/>
+                    <w:jc w:val="center"/>
+                  </w:pPr>
+                  <w:r>
+                    <w:t xml:space="preserve">[0.233, 0.433]</w:t>
                   </w:r>
                 </w:p>
               </w:tc>
@@ -6036,19 +6036,19 @@
                     <w:jc w:val="center"/>
                   </w:pPr>
                   <w:r>
-                    <w:t xml:space="preserve">0.8</w:t>
-                  </w:r>
-                </w:p>
-              </w:tc>
-              <w:tc>
-                <w:tcPr/>
-                <w:p>
-                  <w:pPr>
-                    <w:pStyle w:val="Compact"/>
-                    <w:jc w:val="center"/>
-                  </w:pPr>
-                  <w:r>
-                    <w:t xml:space="preserve">[0.713, 0.872]</w:t>
+                    <w:t xml:space="preserve">2.36</w:t>
+                  </w:r>
+                </w:p>
+              </w:tc>
+              <w:tc>
+                <w:tcPr/>
+                <w:p>
+                  <w:pPr>
+                    <w:pStyle w:val="Compact"/>
+                    <w:jc w:val="center"/>
+                  </w:pPr>
+                  <w:r>
+                    <w:t xml:space="preserve">[2.144, 2.565]</w:t>
                   </w:r>
                 </w:p>
               </w:tc>
@@ -6086,19 +6086,19 @@
                     <w:jc w:val="center"/>
                   </w:pPr>
                   <w:r>
-                    <w:t xml:space="preserve">0.5</w:t>
-                  </w:r>
-                </w:p>
-              </w:tc>
-              <w:tc>
-                <w:tcPr/>
-                <w:p>
-                  <w:pPr>
-                    <w:pStyle w:val="Compact"/>
-                    <w:jc w:val="center"/>
-                  </w:pPr>
-                  <w:r>
-                    <w:t xml:space="preserve">[0.412, 0.573]</w:t>
+                    <w:t xml:space="preserve">1.67</w:t>
+                  </w:r>
+                </w:p>
+              </w:tc>
+              <w:tc>
+                <w:tcPr/>
+                <w:p>
+                  <w:pPr>
+                    <w:pStyle w:val="Compact"/>
+                    <w:jc w:val="center"/>
+                  </w:pPr>
+                  <w:r>
+                    <w:t xml:space="preserve">[1.518, 1.82]</w:t>
                   </w:r>
                 </w:p>
               </w:tc>
@@ -6136,19 +6136,19 @@
                     <w:jc w:val="center"/>
                   </w:pPr>
                   <w:r>
-                    <w:t xml:space="preserve">0.3</w:t>
-                  </w:r>
-                </w:p>
-              </w:tc>
-              <w:tc>
-                <w:tcPr/>
-                <w:p>
-                  <w:pPr>
-                    <w:pStyle w:val="Compact"/>
-                    <w:jc w:val="center"/>
-                  </w:pPr>
-                  <w:r>
-                    <w:t xml:space="preserve">[0.248, 0.349]</w:t>
+                    <w:t xml:space="preserve">0.69</w:t>
+                  </w:r>
+                </w:p>
+              </w:tc>
+              <w:tc>
+                <w:tcPr/>
+                <w:p>
+                  <w:pPr>
+                    <w:pStyle w:val="Compact"/>
+                    <w:jc w:val="center"/>
+                  </w:pPr>
+                  <w:r>
+                    <w:t xml:space="preserve">[0.561, 0.816]</w:t>
                   </w:r>
                 </w:p>
               </w:tc>
@@ -6198,7 +6198,7 @@
                     <w:jc w:val="center"/>
                   </w:pPr>
                   <w:r>
-                    <w:t xml:space="preserve">[2.532, 2.977]</w:t>
+                    <w:t xml:space="preserve">[2.541, 2.986]</w:t>
                   </w:r>
                 </w:p>
               </w:tc>
@@ -6236,19 +6236,19 @@
                     <w:jc w:val="center"/>
                   </w:pPr>
                   <w:r>
-                    <w:t xml:space="preserve">-0.17</w:t>
-                  </w:r>
-                </w:p>
-              </w:tc>
-              <w:tc>
-                <w:tcPr/>
-                <w:p>
-                  <w:pPr>
-                    <w:pStyle w:val="Compact"/>
-                    <w:jc w:val="center"/>
-                  </w:pPr>
-                  <w:r>
-                    <w:t xml:space="preserve">[-0.371, 0.033]</w:t>
+                    <w:t xml:space="preserve">-0.16</w:t>
+                  </w:r>
+                </w:p>
+              </w:tc>
+              <w:tc>
+                <w:tcPr/>
+                <w:p>
+                  <w:pPr>
+                    <w:pStyle w:val="Compact"/>
+                    <w:jc w:val="center"/>
+                  </w:pPr>
+                  <w:r>
+                    <w:t xml:space="preserve">[-0.361, 0.044]</w:t>
                   </w:r>
                 </w:p>
               </w:tc>
@@ -6298,7 +6298,7 @@
                     <w:jc w:val="center"/>
                   </w:pPr>
                   <w:r>
-                    <w:t xml:space="preserve">[2.528, 3.328]</w:t>
+                    <w:t xml:space="preserve">[2.53, 3.32]</w:t>
                   </w:r>
                 </w:p>
               </w:tc>

</xml_diff>

<commit_message>
slight changes to pt summary table and figures, re-render
</commit_message>
<xml_diff>
--- a/docs/manuscript/manuscript.docx
+++ b/docs/manuscript/manuscript.docx
@@ -39,7 +39,7 @@
         <w:pStyle w:val="Date"/>
       </w:pPr>
       <w:r>
-        <w:t xml:space="preserve">2026-04-08</w:t>
+        <w:t xml:space="preserve">2026-04-10</w:t>
       </w:r>
     </w:p>
     <w:p>
@@ -1269,7 +1269,7 @@
         <w:pStyle w:val="BodyText"/>
       </w:pPr>
       <w:r>
-        <w:t xml:space="preserve">31 healthy participants took part in Experiment 1 (</w:t>
+        <w:t xml:space="preserve">31 healthy participants completed Experiment 1 (</w:t>
       </w:r>
       <w:hyperlink w:anchor="tbl-participants">
         <w:r>
@@ -1392,23 +1392,21 @@
           <w:tbl>
             <w:tblPr>
               <w:tblStyle w:val="Table"/>
-              <w:tblW w:type="pct" w:w="4711"/>
+              <w:tblW w:type="pct" w:w="4733"/>
               <w:tblLayout w:type="fixed"/>
               <w:tblLook w:firstRow="1" w:lastRow="1" w:firstColumn="0" w:lastColumn="0" w:noHBand="0" w:noVBand="0" w:val="0020"/>
             </w:tblPr>
             <w:tblGrid>
-              <w:gridCol w:w="686"/>
-              <w:gridCol w:w="457"/>
-              <w:gridCol w:w="457"/>
-              <w:gridCol w:w="503"/>
-              <w:gridCol w:w="549"/>
-              <w:gridCol w:w="732"/>
-              <w:gridCol w:w="1007"/>
-              <w:gridCol w:w="1144"/>
-              <w:gridCol w:w="457"/>
-              <w:gridCol w:w="412"/>
-              <w:gridCol w:w="320"/>
-              <w:gridCol w:w="732"/>
+              <w:gridCol w:w="792"/>
+              <w:gridCol w:w="528"/>
+              <w:gridCol w:w="633"/>
+              <w:gridCol w:w="844"/>
+              <w:gridCol w:w="1161"/>
+              <w:gridCol w:w="1320"/>
+              <w:gridCol w:w="528"/>
+              <w:gridCol w:w="475"/>
+              <w:gridCol w:w="369"/>
+              <w:gridCol w:w="844"/>
             </w:tblGrid>
             <w:tr>
               <w:trPr>
@@ -1446,30 +1444,6 @@
                     <w:jc w:val="center"/>
                   </w:pPr>
                   <w:r>
-                    <w:t xml:space="preserve">Started</w:t>
-                  </w:r>
-                </w:p>
-              </w:tc>
-              <w:tc>
-                <w:tcPr/>
-                <w:p>
-                  <w:pPr>
-                    <w:pStyle w:val="Compact"/>
-                    <w:jc w:val="center"/>
-                  </w:pPr>
-                  <w:r>
-                    <w:t xml:space="preserve">Withdrew</w:t>
-                  </w:r>
-                </w:p>
-              </w:tc>
-              <w:tc>
-                <w:tcPr/>
-                <w:p>
-                  <w:pPr>
-                    <w:pStyle w:val="Compact"/>
-                    <w:jc w:val="center"/>
-                  </w:pPr>
-                  <w:r>
                     <w:t xml:space="preserve">Completed</w:t>
                   </w:r>
                 </w:p>
@@ -1604,30 +1578,6 @@
                     <w:jc w:val="center"/>
                   </w:pPr>
                   <w:r>
-                    <w:t xml:space="preserve">0</w:t>
-                  </w:r>
-                </w:p>
-              </w:tc>
-              <w:tc>
-                <w:tcPr/>
-                <w:p>
-                  <w:pPr>
-                    <w:pStyle w:val="Compact"/>
-                    <w:jc w:val="center"/>
-                  </w:pPr>
-                  <w:r>
-                    <w:t xml:space="preserve">31</w:t>
-                  </w:r>
-                </w:p>
-              </w:tc>
-              <w:tc>
-                <w:tcPr/>
-                <w:p>
-                  <w:pPr>
-                    <w:pStyle w:val="Compact"/>
-                    <w:jc w:val="center"/>
-                  </w:pPr>
-                  <w:r>
                     <w:t xml:space="preserve">1</w:t>
                   </w:r>
                 </w:p>
@@ -1738,30 +1688,6 @@
                     <w:jc w:val="center"/>
                   </w:pPr>
                   <w:r>
-                    <w:t xml:space="preserve">38</w:t>
-                  </w:r>
-                </w:p>
-              </w:tc>
-              <w:tc>
-                <w:tcPr/>
-                <w:p>
-                  <w:pPr>
-                    <w:pStyle w:val="Compact"/>
-                    <w:jc w:val="center"/>
-                  </w:pPr>
-                  <w:r>
-                    <w:t xml:space="preserve">0</w:t>
-                  </w:r>
-                </w:p>
-              </w:tc>
-              <w:tc>
-                <w:tcPr/>
-                <w:p>
-                  <w:pPr>
-                    <w:pStyle w:val="Compact"/>
-                    <w:jc w:val="center"/>
-                  </w:pPr>
-                  <w:r>
                     <w:t xml:space="preserve">35</w:t>
                   </w:r>
                 </w:p>
@@ -1908,30 +1834,6 @@
                     <w:jc w:val="center"/>
                   </w:pPr>
                   <w:r>
-                    <w:t xml:space="preserve">40</w:t>
-                  </w:r>
-                </w:p>
-              </w:tc>
-              <w:tc>
-                <w:tcPr/>
-                <w:p>
-                  <w:pPr>
-                    <w:pStyle w:val="Compact"/>
-                    <w:jc w:val="center"/>
-                  </w:pPr>
-                  <w:r>
-                    <w:t xml:space="preserve">0</w:t>
-                  </w:r>
-                </w:p>
-              </w:tc>
-              <w:tc>
-                <w:tcPr/>
-                <w:p>
-                  <w:pPr>
-                    <w:pStyle w:val="Compact"/>
-                    <w:jc w:val="center"/>
-                  </w:pPr>
-                  <w:r>
                     <w:t xml:space="preserve">1</w:t>
                   </w:r>
                 </w:p>
@@ -2030,30 +1932,6 @@
                     <w:jc w:val="center"/>
                   </w:pPr>
                   <w:r>
-                    <w:t xml:space="preserve">58</w:t>
-                  </w:r>
-                </w:p>
-              </w:tc>
-              <w:tc>
-                <w:tcPr/>
-                <w:p>
-                  <w:pPr>
-                    <w:pStyle w:val="Compact"/>
-                    <w:jc w:val="center"/>
-                  </w:pPr>
-                  <w:r>
-                    <w:t xml:space="preserve">12</w:t>
-                  </w:r>
-                </w:p>
-              </w:tc>
-              <w:tc>
-                <w:tcPr/>
-                <w:p>
-                  <w:pPr>
-                    <w:pStyle w:val="Compact"/>
-                    <w:jc w:val="center"/>
-                  </w:pPr>
-                  <w:r>
                     <w:t xml:space="preserve">46</w:t>
                   </w:r>
                 </w:p>
@@ -2146,7 +2024,7 @@
             <w:tr>
               <w:tc>
                 <w:tcPr>
-                  <w:gridSpan w:val="12"/>
+                  <w:gridSpan w:val="10"/>
                 </w:tcPr>
                 <w:p>
                   <w:pPr>
@@ -2532,7 +2410,7 @@
         </w:r>
       </w:hyperlink>
       <w:r>
-        <w:t xml:space="preserve">). Participants had to be located in the United Kingdom or in the United States, be aged between 18-65 years old, with normal or corrected-to-normal vision and speak fluent English. Furthermore, Prolific offers the option to chose the approval rate of the participants willing to take part in the study. The approval rate is the percentage for which participants has been approved in previous experiment. An approval rating between 95% and 100% was chosen in our study to try to ensure high data quality. 38 participants started the experiment and nobody withdrew. Following our preregistered exclusion criterion, 4 participants were excluded because their percentage of missed trials was higher than 25% and 1 was removed because the overall accuracy was lower than 55%. In the end, data from 30 participants (20 men and 10 women) were retained for the analysis and the LBA modeling. Ages ranged from 25 to 61 (</w:t>
+        <w:t xml:space="preserve">). Participants had to be located in the United Kingdom or in the United States, be aged between 18-65 years old, with normal or corrected-to-normal vision and speak fluent English. Furthermore, Prolific offers the option to chose the approval rate of the participants willing to take part in the study. The approval rate is the percentage for which participants has been approved in previous experiment. An approval rating between 95% and 100% was chosen in our study to try to ensure high data quality. 35 participants completed Experiment 2. Following our preregistered exclusion criterion, 4 participants were excluded because their percentage of missed trials was higher than 25% and 1 was removed because the overall accuracy was lower than 55%. In the end, data from 30 participants (20 men and 10 women) were retained for the analysis and the LBA modeling. Ages ranged from 25 to 61 (</w:t>
       </w:r>
       <m:oMath>
         <m:sSub>
@@ -2703,7 +2581,7 @@
         </w:r>
       </w:hyperlink>
       <w:r>
-        <w:t xml:space="preserve">) or via a mailing list dedicated to students from the Department of Psychology of the University of Zurich. 40 healthy participants took part in Experiment 3. We deviated from our preregistration in one way. Since this experiment was conducted to investigate how highly familiar faces affect the computational processes of face recognition, we had to remove 9 more participants who did not show a level of familiarity high enough with the presented faces in the first part of the experiment. This scenario did not occur during the pilot experiments we conducted and thus was not part of our preregistration.</w:t>
+        <w:t xml:space="preserve">) or via a mailing list dedicated to students from the Department of Psychology of the University of Zurich. 40 healthy participants completed Experiment 3. We deviated from our preregistration in one way. Since this experiment was conducted to investigate how highly familiar faces affect the computational processes of face recognition, we had to remove 9 more participants who did not show a level of familiarity high enough with the presented faces in the first part of the experiment. This scenario did not occur during the pilot experiments we conducted and thus was not part of our preregistration.</w:t>
       </w:r>
     </w:p>
     <w:p>
@@ -3368,7 +3246,7 @@
         </w:r>
       </w:hyperlink>
       <w:r>
-        <w:t xml:space="preserve">) using the same criteria as Experiment 2. 58 participants started the experiment and after reading the information and consent form 12 participants withdrew from the experiment. Thus 46 participants completed the experiment. Following our preregistered exclusion criterion, 12 did not show a sufficiently high level of familiarity with the famous faces. In addition, 1 participant was excluded because the percentage of missed trials was higher than 25% and 3 were removed because the overall accuracy was lower than 55% or higher than 95%. In the end, the data of 30 participants (17 men and 13 women) were retained for further analysis and LBA modeling. Ages ranged from 25 to 61 (</w:t>
+        <w:t xml:space="preserve">) using the same criteria as Experiment 2. 46 participants completed Experiment 4. Following our preregistered exclusion criterion, 12 did not show a sufficiently high level of familiarity with the famous faces. In addition, 1 participant was excluded because the percentage of missed trials was higher than 25% and 3 were removed because the overall accuracy was lower than 55% or higher than 95%. In the end, the data of 30 participants (17 men and 13 women) were retained for further analysis and LBA modeling. Ages ranged from 25 to 61 (</w:t>
       </w:r>
       <m:oMath>
         <m:sSub>

</xml_diff>